<commit_message>
Updated timetable and modified Lab 01.docx , Lab 02.docx
</commit_message>
<xml_diff>
--- a/Object Oriented Programming/Object Oriented Programming Lab (CSL-210)/Lab No 01/Object Oriented Programming Lab 01.docx
+++ b/Object Oriented Programming/Object Oriented Programming Lab (CSL-210)/Lab No 01/Object Oriented Programming Lab 01.docx
@@ -35,7 +35,15 @@
           <w:sz w:val="28"/>
           <w:szCs w:val="28"/>
         </w:rPr>
-        <w:t>Input:</w:t>
+        <w:t>Code</w:t>
+      </w:r>
+      <w:r>
+        <w:rPr>
+          <w:rFonts w:ascii="Britannic Bold" w:hAnsi="Britannic Bold"/>
+          <w:sz w:val="28"/>
+          <w:szCs w:val="28"/>
+        </w:rPr>
+        <w:t>:</w:t>
       </w:r>
     </w:p>
     <w:p>

</xml_diff>

<commit_message>
Did some work in Object Oriented Programming Lab
</commit_message>
<xml_diff>
--- a/Object Oriented Programming/Object Oriented Programming Lab (CSL-210)/Lab No 01/Object Oriented Programming Lab 01.docx
+++ b/Object Oriented Programming/Object Oriented Programming Lab (CSL-210)/Lab No 01/Object Oriented Programming Lab 01.docx
@@ -4,21 +4,333 @@
   <w:body>
     <w:p>
       <w:pPr>
-        <w:spacing w:line="240" w:lineRule="auto"/>
+        <w:pStyle w:val="TableParagraph"/>
+        <w:spacing w:before="59" w:after="240"/>
+        <w:jc w:val="both"/>
+        <w:rPr>
+          <w:rFonts w:ascii="Times New Roman" w:hAnsi="Times New Roman" w:cs="Times New Roman"/>
+          <w:color w:val="000000" w:themeColor="text1"/>
+          <w:sz w:val="28"/>
+          <w:szCs w:val="28"/>
+        </w:rPr>
+      </w:pPr>
+      <w:r>
         <w:rPr>
           <w:rFonts w:ascii="Britannic Bold" w:hAnsi="Britannic Bold"/>
           <w:sz w:val="32"/>
           <w:szCs w:val="32"/>
         </w:rPr>
-      </w:pPr>
-      <w:r>
-        <w:rPr>
-          <w:rFonts w:ascii="Britannic Bold" w:hAnsi="Britannic Bold"/>
-          <w:sz w:val="32"/>
-          <w:szCs w:val="32"/>
-        </w:rPr>
         <w:t>Task No 01:</w:t>
       </w:r>
+      <w:r>
+        <w:rPr>
+          <w:sz w:val="24"/>
+        </w:rPr>
+        <w:t xml:space="preserve"> </w:t>
+      </w:r>
+      <w:r>
+        <w:rPr>
+          <w:rFonts w:ascii="Times New Roman" w:hAnsi="Times New Roman" w:cs="Times New Roman"/>
+          <w:color w:val="000000" w:themeColor="text1"/>
+          <w:sz w:val="28"/>
+          <w:szCs w:val="28"/>
+        </w:rPr>
+        <w:t>Write a JAVA program which will implement the following</w:t>
+      </w:r>
+      <w:r>
+        <w:rPr>
+          <w:rFonts w:ascii="Times New Roman" w:hAnsi="Times New Roman" w:cs="Times New Roman"/>
+          <w:color w:val="000000" w:themeColor="text1"/>
+          <w:sz w:val="28"/>
+          <w:szCs w:val="28"/>
+        </w:rPr>
+        <w:t xml:space="preserve"> </w:t>
+      </w:r>
+      <w:r>
+        <w:rPr>
+          <w:rFonts w:ascii="Times New Roman" w:hAnsi="Times New Roman" w:cs="Times New Roman"/>
+          <w:color w:val="000000" w:themeColor="text1"/>
+          <w:sz w:val="28"/>
+          <w:szCs w:val="28"/>
+        </w:rPr>
+        <w:t xml:space="preserve">formulae using </w:t>
+      </w:r>
+      <w:r>
+        <w:rPr>
+          <w:rFonts w:ascii="Times New Roman" w:hAnsi="Times New Roman" w:cs="Times New Roman"/>
+          <w:color w:val="000000" w:themeColor="text1"/>
+          <w:sz w:val="28"/>
+          <w:szCs w:val="28"/>
+        </w:rPr>
+        <w:t>methods</w:t>
+      </w:r>
+      <w:r>
+        <w:rPr>
+          <w:rFonts w:ascii="Times New Roman" w:hAnsi="Times New Roman" w:cs="Times New Roman"/>
+          <w:color w:val="000000" w:themeColor="text1"/>
+          <w:sz w:val="28"/>
+          <w:szCs w:val="28"/>
+        </w:rPr>
+        <w:t>.</w:t>
+      </w:r>
+    </w:p>
+    <w:p>
+      <w:pPr>
+        <w:pStyle w:val="TableParagraph"/>
+        <w:numPr>
+          <w:ilvl w:val="0"/>
+          <w:numId w:val="2"/>
+        </w:numPr>
+        <w:spacing w:before="59"/>
+        <w:jc w:val="both"/>
+        <w:rPr>
+          <w:rFonts w:ascii="Times New Roman" w:hAnsi="Times New Roman" w:cs="Times New Roman"/>
+          <w:b/>
+          <w:bCs/>
+          <w:color w:val="000000" w:themeColor="text1"/>
+          <w:sz w:val="28"/>
+          <w:szCs w:val="28"/>
+        </w:rPr>
+      </w:pPr>
+      <w:r>
+        <w:rPr>
+          <w:rFonts w:ascii="Times New Roman" w:hAnsi="Times New Roman" w:cs="Times New Roman"/>
+          <w:b/>
+          <w:bCs/>
+          <w:color w:val="000000" w:themeColor="text1"/>
+          <w:sz w:val="28"/>
+          <w:szCs w:val="28"/>
+        </w:rPr>
+        <w:t>Automobile Tire Pressure</w:t>
+      </w:r>
+      <w:r>
+        <w:rPr>
+          <w:rFonts w:ascii="Times New Roman" w:hAnsi="Times New Roman" w:cs="Times New Roman"/>
+          <w:b/>
+          <w:bCs/>
+          <w:color w:val="000000" w:themeColor="text1"/>
+          <w:sz w:val="28"/>
+          <w:szCs w:val="28"/>
+        </w:rPr>
+        <w:t xml:space="preserve">. </w:t>
+      </w:r>
+      <w:r>
+        <w:rPr>
+          <w:rFonts w:ascii="Times New Roman" w:hAnsi="Times New Roman" w:cs="Times New Roman"/>
+          <w:b/>
+          <w:bCs/>
+          <w:color w:val="000000" w:themeColor="text1"/>
+          <w:sz w:val="28"/>
+          <w:szCs w:val="28"/>
+        </w:rPr>
+        <w:t>P = 0.37m(T + 460)/V</w:t>
+      </w:r>
+      <w:r>
+        <w:rPr>
+          <w:rFonts w:ascii="Times New Roman" w:hAnsi="Times New Roman" w:cs="Times New Roman"/>
+          <w:b/>
+          <w:bCs/>
+          <w:color w:val="000000" w:themeColor="text1"/>
+          <w:sz w:val="28"/>
+          <w:szCs w:val="28"/>
+        </w:rPr>
+        <w:t>*</w:t>
+      </w:r>
+      <w:r>
+        <w:rPr>
+          <w:rFonts w:ascii="Times New Roman" w:hAnsi="Times New Roman" w:cs="Times New Roman"/>
+          <w:b/>
+          <w:bCs/>
+          <w:color w:val="000000" w:themeColor="text1"/>
+          <w:sz w:val="28"/>
+          <w:szCs w:val="28"/>
+        </w:rPr>
+        <w:t>P</w:t>
+      </w:r>
+    </w:p>
+    <w:p>
+      <w:pPr>
+        <w:pStyle w:val="TableParagraph"/>
+        <w:spacing w:before="59"/>
+        <w:ind w:left="465"/>
+        <w:jc w:val="both"/>
+        <w:rPr>
+          <w:rFonts w:ascii="Times New Roman" w:hAnsi="Times New Roman" w:cs="Times New Roman"/>
+          <w:color w:val="000000" w:themeColor="text1"/>
+          <w:sz w:val="28"/>
+          <w:szCs w:val="28"/>
+        </w:rPr>
+      </w:pPr>
+      <w:r>
+        <w:rPr>
+          <w:rFonts w:ascii="Times New Roman" w:hAnsi="Times New Roman" w:cs="Times New Roman"/>
+          <w:color w:val="000000" w:themeColor="text1"/>
+          <w:sz w:val="28"/>
+          <w:szCs w:val="28"/>
+        </w:rPr>
+        <w:t>Where:</w:t>
+      </w:r>
+    </w:p>
+    <w:p>
+      <w:pPr>
+        <w:pStyle w:val="TableParagraph"/>
+        <w:spacing w:before="59"/>
+        <w:ind w:left="465"/>
+        <w:jc w:val="both"/>
+        <w:rPr>
+          <w:rFonts w:ascii="Times New Roman" w:hAnsi="Times New Roman" w:cs="Times New Roman"/>
+          <w:color w:val="000000" w:themeColor="text1"/>
+          <w:sz w:val="28"/>
+          <w:szCs w:val="28"/>
+        </w:rPr>
+      </w:pPr>
+      <w:r>
+        <w:rPr>
+          <w:rFonts w:ascii="Times New Roman" w:hAnsi="Times New Roman" w:cs="Times New Roman"/>
+          <w:color w:val="000000" w:themeColor="text1"/>
+          <w:sz w:val="28"/>
+          <w:szCs w:val="28"/>
+        </w:rPr>
+        <w:t xml:space="preserve">P = </w:t>
+      </w:r>
+      <w:r>
+        <w:rPr>
+          <w:rFonts w:ascii="Times New Roman" w:hAnsi="Times New Roman" w:cs="Times New Roman"/>
+          <w:color w:val="000000" w:themeColor="text1"/>
+          <w:sz w:val="28"/>
+          <w:szCs w:val="28"/>
+        </w:rPr>
+        <w:t>P</w:t>
+      </w:r>
+      <w:r>
+        <w:rPr>
+          <w:rFonts w:ascii="Times New Roman" w:hAnsi="Times New Roman" w:cs="Times New Roman"/>
+          <w:color w:val="000000" w:themeColor="text1"/>
+          <w:sz w:val="28"/>
+          <w:szCs w:val="28"/>
+        </w:rPr>
+        <w:t>ressure in psi.</w:t>
+      </w:r>
+    </w:p>
+    <w:p>
+      <w:pPr>
+        <w:pStyle w:val="TableParagraph"/>
+        <w:spacing w:before="59"/>
+        <w:ind w:left="465"/>
+        <w:rPr>
+          <w:rFonts w:ascii="Times New Roman" w:hAnsi="Times New Roman" w:cs="Times New Roman"/>
+          <w:color w:val="000000" w:themeColor="text1"/>
+          <w:sz w:val="28"/>
+          <w:szCs w:val="28"/>
+        </w:rPr>
+      </w:pPr>
+      <w:r>
+        <w:rPr>
+          <w:rFonts w:ascii="Times New Roman" w:hAnsi="Times New Roman" w:cs="Times New Roman"/>
+          <w:color w:val="000000" w:themeColor="text1"/>
+          <w:sz w:val="28"/>
+          <w:szCs w:val="28"/>
+        </w:rPr>
+        <w:t xml:space="preserve">V = </w:t>
+      </w:r>
+      <w:r>
+        <w:rPr>
+          <w:rFonts w:ascii="Times New Roman" w:hAnsi="Times New Roman" w:cs="Times New Roman"/>
+          <w:color w:val="000000" w:themeColor="text1"/>
+          <w:sz w:val="28"/>
+          <w:szCs w:val="28"/>
+        </w:rPr>
+        <w:t>V</w:t>
+      </w:r>
+      <w:r>
+        <w:rPr>
+          <w:rFonts w:ascii="Times New Roman" w:hAnsi="Times New Roman" w:cs="Times New Roman"/>
+          <w:color w:val="000000" w:themeColor="text1"/>
+          <w:sz w:val="28"/>
+          <w:szCs w:val="28"/>
+        </w:rPr>
+        <w:t xml:space="preserve">olume in cubic feet </w:t>
+      </w:r>
+    </w:p>
+    <w:p>
+      <w:pPr>
+        <w:pStyle w:val="TableParagraph"/>
+        <w:spacing w:before="59"/>
+        <w:ind w:left="465"/>
+        <w:rPr>
+          <w:rFonts w:ascii="Times New Roman" w:hAnsi="Times New Roman" w:cs="Times New Roman"/>
+          <w:color w:val="000000" w:themeColor="text1"/>
+          <w:sz w:val="28"/>
+          <w:szCs w:val="28"/>
+        </w:rPr>
+      </w:pPr>
+      <w:r>
+        <w:rPr>
+          <w:rFonts w:ascii="Times New Roman" w:hAnsi="Times New Roman" w:cs="Times New Roman"/>
+          <w:color w:val="000000" w:themeColor="text1"/>
+          <w:sz w:val="28"/>
+          <w:szCs w:val="28"/>
+        </w:rPr>
+        <w:t xml:space="preserve">m = </w:t>
+      </w:r>
+      <w:r>
+        <w:rPr>
+          <w:rFonts w:ascii="Times New Roman" w:hAnsi="Times New Roman" w:cs="Times New Roman"/>
+          <w:color w:val="000000" w:themeColor="text1"/>
+          <w:sz w:val="28"/>
+          <w:szCs w:val="28"/>
+        </w:rPr>
+        <w:t>M</w:t>
+      </w:r>
+      <w:r>
+        <w:rPr>
+          <w:rFonts w:ascii="Times New Roman" w:hAnsi="Times New Roman" w:cs="Times New Roman"/>
+          <w:color w:val="000000" w:themeColor="text1"/>
+          <w:sz w:val="28"/>
+          <w:szCs w:val="28"/>
+        </w:rPr>
+        <w:t>ass of air in pounds</w:t>
+      </w:r>
+    </w:p>
+    <w:p>
+      <w:pPr>
+        <w:pStyle w:val="TableParagraph"/>
+        <w:spacing w:before="59" w:after="240"/>
+        <w:ind w:left="465"/>
+        <w:rPr>
+          <w:rFonts w:ascii="Times New Roman" w:hAnsi="Times New Roman" w:cs="Times New Roman"/>
+          <w:color w:val="000000" w:themeColor="text1"/>
+          <w:sz w:val="28"/>
+          <w:szCs w:val="28"/>
+        </w:rPr>
+      </w:pPr>
+      <w:r>
+        <w:rPr>
+          <w:rFonts w:ascii="Times New Roman" w:hAnsi="Times New Roman" w:cs="Times New Roman"/>
+          <w:color w:val="000000" w:themeColor="text1"/>
+          <w:sz w:val="28"/>
+          <w:szCs w:val="28"/>
+        </w:rPr>
+        <w:t xml:space="preserve">T = </w:t>
+      </w:r>
+      <w:r>
+        <w:rPr>
+          <w:rFonts w:ascii="Times New Roman" w:hAnsi="Times New Roman" w:cs="Times New Roman"/>
+          <w:color w:val="000000" w:themeColor="text1"/>
+          <w:sz w:val="28"/>
+          <w:szCs w:val="28"/>
+        </w:rPr>
+        <w:t>T</w:t>
+      </w:r>
+      <w:r>
+        <w:rPr>
+          <w:rFonts w:ascii="Times New Roman" w:hAnsi="Times New Roman" w:cs="Times New Roman"/>
+          <w:color w:val="000000" w:themeColor="text1"/>
+          <w:sz w:val="28"/>
+          <w:szCs w:val="28"/>
+        </w:rPr>
+        <w:t>emperature in Fahrenheit</w:t>
+      </w:r>
     </w:p>
     <w:p>
       <w:pPr>
@@ -48,6 +360,16 @@
     </w:p>
     <w:p>
       <w:pPr>
+        <w:spacing w:after="0"/>
+        <w:rPr>
+          <w:rFonts w:ascii="Britannic Bold" w:hAnsi="Britannic Bold"/>
+          <w:sz w:val="28"/>
+          <w:szCs w:val="28"/>
+        </w:rPr>
+      </w:pPr>
+    </w:p>
+    <w:p>
+      <w:pPr>
         <w:rPr>
           <w:rFonts w:ascii="Britannic Bold" w:hAnsi="Britannic Bold"/>
           <w:sz w:val="28"/>
@@ -63,13 +385,989 @@
         <w:t>Output:</w:t>
       </w:r>
     </w:p>
+    <w:p>
+      <w:pPr>
+        <w:spacing w:line="240" w:lineRule="auto"/>
+        <w:rPr>
+          <w:rFonts w:ascii="Britannic Bold" w:hAnsi="Britannic Bold"/>
+          <w:sz w:val="28"/>
+          <w:szCs w:val="28"/>
+        </w:rPr>
+      </w:pPr>
+    </w:p>
+    <w:p>
+      <w:pPr>
+        <w:pStyle w:val="TableParagraph"/>
+        <w:numPr>
+          <w:ilvl w:val="0"/>
+          <w:numId w:val="2"/>
+        </w:numPr>
+        <w:tabs>
+          <w:tab w:val="left" w:pos="893"/>
+        </w:tabs>
+        <w:jc w:val="both"/>
+        <w:rPr>
+          <w:rFonts w:ascii="Times New Roman" w:hAnsi="Times New Roman" w:cs="Times New Roman"/>
+          <w:b/>
+          <w:bCs/>
+          <w:sz w:val="28"/>
+          <w:szCs w:val="28"/>
+        </w:rPr>
+      </w:pPr>
+      <w:r>
+        <w:rPr>
+          <w:rFonts w:ascii="Times New Roman" w:hAnsi="Times New Roman" w:cs="Times New Roman"/>
+          <w:b/>
+          <w:bCs/>
+          <w:sz w:val="28"/>
+          <w:szCs w:val="28"/>
+        </w:rPr>
+        <w:t>Pulley</w:t>
+      </w:r>
+      <w:r>
+        <w:rPr>
+          <w:rFonts w:ascii="Times New Roman" w:hAnsi="Times New Roman" w:cs="Times New Roman"/>
+          <w:b/>
+          <w:bCs/>
+          <w:spacing w:val="-1"/>
+          <w:sz w:val="28"/>
+          <w:szCs w:val="28"/>
+        </w:rPr>
+        <w:t xml:space="preserve"> </w:t>
+      </w:r>
+      <w:r>
+        <w:rPr>
+          <w:rFonts w:ascii="Times New Roman" w:hAnsi="Times New Roman" w:cs="Times New Roman"/>
+          <w:b/>
+          <w:bCs/>
+          <w:sz w:val="28"/>
+          <w:szCs w:val="28"/>
+        </w:rPr>
+        <w:t>formulas</w:t>
+      </w:r>
+      <w:r>
+        <w:rPr>
+          <w:rFonts w:ascii="Times New Roman" w:hAnsi="Times New Roman" w:cs="Times New Roman"/>
+          <w:b/>
+          <w:bCs/>
+          <w:sz w:val="28"/>
+          <w:szCs w:val="28"/>
+        </w:rPr>
+        <w:t>:</w:t>
+      </w:r>
+    </w:p>
+    <w:p>
+      <w:pPr>
+        <w:pStyle w:val="TableParagraph"/>
+        <w:numPr>
+          <w:ilvl w:val="0"/>
+          <w:numId w:val="3"/>
+        </w:numPr>
+        <w:tabs>
+          <w:tab w:val="left" w:pos="893"/>
+        </w:tabs>
+        <w:spacing w:after="240"/>
+        <w:jc w:val="both"/>
+        <w:rPr>
+          <w:rFonts w:ascii="Times New Roman" w:hAnsi="Times New Roman" w:cs="Times New Roman"/>
+          <w:sz w:val="28"/>
+          <w:szCs w:val="28"/>
+        </w:rPr>
+      </w:pPr>
+      <w:r>
+        <w:rPr>
+          <w:rFonts w:ascii="Times New Roman" w:hAnsi="Times New Roman" w:cs="Times New Roman"/>
+          <w:sz w:val="28"/>
+          <w:szCs w:val="28"/>
+        </w:rPr>
+        <w:t>C</w:t>
+      </w:r>
+      <w:r>
+        <w:rPr>
+          <w:rFonts w:ascii="Times New Roman" w:hAnsi="Times New Roman" w:cs="Times New Roman"/>
+          <w:sz w:val="28"/>
+          <w:szCs w:val="28"/>
+        </w:rPr>
+        <w:t>alculate the speed of one pulley if there are 2 pulleys connected with a</w:t>
+      </w:r>
+      <w:r>
+        <w:rPr>
+          <w:rFonts w:ascii="Times New Roman" w:hAnsi="Times New Roman" w:cs="Times New Roman"/>
+          <w:spacing w:val="-19"/>
+          <w:sz w:val="28"/>
+          <w:szCs w:val="28"/>
+        </w:rPr>
+        <w:t xml:space="preserve"> </w:t>
+      </w:r>
+      <w:r>
+        <w:rPr>
+          <w:rFonts w:ascii="Times New Roman" w:hAnsi="Times New Roman" w:cs="Times New Roman"/>
+          <w:sz w:val="28"/>
+          <w:szCs w:val="28"/>
+        </w:rPr>
+        <w:t>belt:</w:t>
+      </w:r>
+    </w:p>
+    <w:p>
+      <w:pPr>
+        <w:pStyle w:val="TableParagraph"/>
+        <w:tabs>
+          <w:tab w:val="left" w:pos="893"/>
+        </w:tabs>
+        <w:jc w:val="center"/>
+        <w:rPr>
+          <w:rFonts w:ascii="Times New Roman" w:hAnsi="Times New Roman" w:cs="Times New Roman"/>
+          <w:sz w:val="28"/>
+          <w:szCs w:val="28"/>
+        </w:rPr>
+      </w:pPr>
+      <w:r>
+        <w:rPr>
+          <w:rFonts w:ascii="Times New Roman" w:hAnsi="Times New Roman" w:cs="Times New Roman"/>
+          <w:sz w:val="28"/>
+          <w:szCs w:val="28"/>
+        </w:rPr>
+        <w:t xml:space="preserve">RPM2 = </w:t>
+      </w:r>
+      <w:r>
+        <w:rPr>
+          <w:rFonts w:ascii="Times New Roman" w:hAnsi="Times New Roman" w:cs="Times New Roman"/>
+          <w:sz w:val="28"/>
+          <w:szCs w:val="28"/>
+        </w:rPr>
+        <w:t>D</w:t>
+      </w:r>
+      <w:r>
+        <w:rPr>
+          <w:rFonts w:ascii="Times New Roman" w:hAnsi="Times New Roman" w:cs="Times New Roman"/>
+          <w:sz w:val="28"/>
+          <w:szCs w:val="28"/>
+        </w:rPr>
+        <w:t>iameter1/</w:t>
+      </w:r>
+      <w:r>
+        <w:rPr>
+          <w:rFonts w:ascii="Times New Roman" w:hAnsi="Times New Roman" w:cs="Times New Roman"/>
+          <w:sz w:val="28"/>
+          <w:szCs w:val="28"/>
+        </w:rPr>
+        <w:t>D</w:t>
+      </w:r>
+      <w:r>
+        <w:rPr>
+          <w:rFonts w:ascii="Times New Roman" w:hAnsi="Times New Roman" w:cs="Times New Roman"/>
+          <w:sz w:val="28"/>
+          <w:szCs w:val="28"/>
+        </w:rPr>
+        <w:t>iameter2 * RPM1</w:t>
+      </w:r>
+    </w:p>
+    <w:p>
+      <w:pPr>
+        <w:spacing w:after="0"/>
+        <w:rPr>
+          <w:rFonts w:ascii="Britannic Bold" w:hAnsi="Britannic Bold"/>
+          <w:sz w:val="28"/>
+          <w:szCs w:val="28"/>
+        </w:rPr>
+      </w:pPr>
+      <w:r>
+        <w:rPr>
+          <w:rFonts w:ascii="Britannic Bold" w:hAnsi="Britannic Bold"/>
+          <w:sz w:val="28"/>
+          <w:szCs w:val="28"/>
+        </w:rPr>
+        <w:t>Code</w:t>
+      </w:r>
+      <w:r>
+        <w:rPr>
+          <w:rFonts w:ascii="Britannic Bold" w:hAnsi="Britannic Bold"/>
+          <w:sz w:val="28"/>
+          <w:szCs w:val="28"/>
+        </w:rPr>
+        <w:t>:</w:t>
+      </w:r>
+    </w:p>
+    <w:p>
+      <w:pPr>
+        <w:spacing w:after="0"/>
+        <w:rPr>
+          <w:rFonts w:ascii="Britannic Bold" w:hAnsi="Britannic Bold"/>
+          <w:sz w:val="28"/>
+          <w:szCs w:val="28"/>
+        </w:rPr>
+      </w:pPr>
+    </w:p>
+    <w:p>
+      <w:pPr>
+        <w:rPr>
+          <w:rFonts w:ascii="Britannic Bold" w:hAnsi="Britannic Bold"/>
+          <w:sz w:val="28"/>
+          <w:szCs w:val="28"/>
+        </w:rPr>
+      </w:pPr>
+      <w:r>
+        <w:rPr>
+          <w:rFonts w:ascii="Britannic Bold" w:hAnsi="Britannic Bold"/>
+          <w:sz w:val="28"/>
+          <w:szCs w:val="28"/>
+        </w:rPr>
+        <w:t>Output:</w:t>
+      </w:r>
+    </w:p>
+    <w:p>
+      <w:pPr>
+        <w:rPr>
+          <w:rFonts w:ascii="Britannic Bold" w:hAnsi="Britannic Bold"/>
+          <w:sz w:val="28"/>
+          <w:szCs w:val="28"/>
+        </w:rPr>
+      </w:pPr>
+    </w:p>
+    <w:p>
+      <w:pPr>
+        <w:jc w:val="both"/>
+        <w:rPr>
+          <w:rFonts w:ascii="Times New Roman" w:hAnsi="Times New Roman" w:cs="Times New Roman"/>
+          <w:sz w:val="28"/>
+          <w:szCs w:val="28"/>
+        </w:rPr>
+      </w:pPr>
+      <w:r>
+        <w:rPr>
+          <w:rFonts w:ascii="Britannic Bold" w:hAnsi="Britannic Bold"/>
+          <w:sz w:val="28"/>
+          <w:szCs w:val="28"/>
+        </w:rPr>
+        <w:t xml:space="preserve"> </w:t>
+      </w:r>
+      <w:r>
+        <w:rPr>
+          <w:rFonts w:ascii="Times New Roman" w:hAnsi="Times New Roman" w:cs="Times New Roman"/>
+          <w:sz w:val="28"/>
+          <w:szCs w:val="28"/>
+        </w:rPr>
+        <w:t xml:space="preserve">ii) </w:t>
+      </w:r>
+      <w:r>
+        <w:rPr>
+          <w:rFonts w:ascii="Times New Roman" w:hAnsi="Times New Roman" w:cs="Times New Roman"/>
+          <w:sz w:val="28"/>
+          <w:szCs w:val="28"/>
+        </w:rPr>
+        <w:t xml:space="preserve">  </w:t>
+      </w:r>
+      <w:r>
+        <w:rPr>
+          <w:rFonts w:ascii="Times New Roman" w:hAnsi="Times New Roman" w:cs="Times New Roman"/>
+          <w:sz w:val="28"/>
+          <w:szCs w:val="28"/>
+        </w:rPr>
+        <w:t>C</w:t>
+      </w:r>
+      <w:r>
+        <w:rPr>
+          <w:rFonts w:ascii="Times New Roman" w:hAnsi="Times New Roman" w:cs="Times New Roman"/>
+          <w:sz w:val="28"/>
+          <w:szCs w:val="28"/>
+        </w:rPr>
+        <w:t>alculate the amount of weight that can be lifted with a multiple pulley system:</w:t>
+      </w:r>
+    </w:p>
+    <w:p>
+      <w:pPr>
+        <w:jc w:val="center"/>
+        <w:rPr>
+          <w:rFonts w:ascii="Britannic Bold" w:hAnsi="Britannic Bold"/>
+          <w:sz w:val="28"/>
+          <w:szCs w:val="28"/>
+        </w:rPr>
+      </w:pPr>
+      <w:r>
+        <w:rPr>
+          <w:rFonts w:ascii="Times New Roman" w:hAnsi="Times New Roman" w:cs="Times New Roman"/>
+          <w:sz w:val="28"/>
+          <w:szCs w:val="28"/>
+        </w:rPr>
+        <w:t>W</w:t>
+      </w:r>
+      <w:r>
+        <w:rPr>
+          <w:rFonts w:ascii="Times New Roman" w:hAnsi="Times New Roman" w:cs="Times New Roman"/>
+          <w:sz w:val="28"/>
+          <w:szCs w:val="28"/>
+        </w:rPr>
+        <w:t xml:space="preserve">eight </w:t>
+      </w:r>
+      <w:r>
+        <w:rPr>
+          <w:rFonts w:ascii="Times New Roman" w:hAnsi="Times New Roman" w:cs="Times New Roman"/>
+          <w:sz w:val="28"/>
+          <w:szCs w:val="28"/>
+        </w:rPr>
+        <w:t>L</w:t>
+      </w:r>
+      <w:r>
+        <w:rPr>
+          <w:rFonts w:ascii="Times New Roman" w:hAnsi="Times New Roman" w:cs="Times New Roman"/>
+          <w:sz w:val="28"/>
+          <w:szCs w:val="28"/>
+        </w:rPr>
+        <w:t xml:space="preserve">ifted = </w:t>
+      </w:r>
+      <w:r>
+        <w:rPr>
+          <w:rFonts w:ascii="Times New Roman" w:hAnsi="Times New Roman" w:cs="Times New Roman"/>
+          <w:sz w:val="28"/>
+          <w:szCs w:val="28"/>
+        </w:rPr>
+        <w:t>F</w:t>
+      </w:r>
+      <w:r>
+        <w:rPr>
+          <w:rFonts w:ascii="Times New Roman" w:hAnsi="Times New Roman" w:cs="Times New Roman"/>
+          <w:sz w:val="28"/>
+          <w:szCs w:val="28"/>
+        </w:rPr>
+        <w:t xml:space="preserve">orce </w:t>
+      </w:r>
+      <w:r>
+        <w:rPr>
+          <w:rFonts w:ascii="Times New Roman" w:hAnsi="Times New Roman" w:cs="Times New Roman"/>
+          <w:sz w:val="28"/>
+          <w:szCs w:val="28"/>
+        </w:rPr>
+        <w:t>E</w:t>
+      </w:r>
+      <w:r>
+        <w:rPr>
+          <w:rFonts w:ascii="Times New Roman" w:hAnsi="Times New Roman" w:cs="Times New Roman"/>
+          <w:sz w:val="28"/>
+          <w:szCs w:val="28"/>
+        </w:rPr>
+        <w:t xml:space="preserve">xerted * </w:t>
+      </w:r>
+      <w:r>
+        <w:rPr>
+          <w:rFonts w:ascii="Times New Roman" w:hAnsi="Times New Roman" w:cs="Times New Roman"/>
+          <w:sz w:val="28"/>
+          <w:szCs w:val="28"/>
+        </w:rPr>
+        <w:t>N</w:t>
+      </w:r>
+      <w:r>
+        <w:rPr>
+          <w:rFonts w:ascii="Times New Roman" w:hAnsi="Times New Roman" w:cs="Times New Roman"/>
+          <w:sz w:val="28"/>
+          <w:szCs w:val="28"/>
+        </w:rPr>
+        <w:t xml:space="preserve">umber of up </w:t>
+      </w:r>
+      <w:r>
+        <w:rPr>
+          <w:rFonts w:ascii="Times New Roman" w:hAnsi="Times New Roman" w:cs="Times New Roman"/>
+          <w:sz w:val="28"/>
+          <w:szCs w:val="28"/>
+        </w:rPr>
+        <w:t>R</w:t>
+      </w:r>
+      <w:r>
+        <w:rPr>
+          <w:rFonts w:ascii="Times New Roman" w:hAnsi="Times New Roman" w:cs="Times New Roman"/>
+          <w:sz w:val="28"/>
+          <w:szCs w:val="28"/>
+        </w:rPr>
+        <w:t>opes</w:t>
+      </w:r>
+    </w:p>
+    <w:p>
+      <w:pPr>
+        <w:spacing w:after="0"/>
+        <w:rPr>
+          <w:rFonts w:ascii="Britannic Bold" w:hAnsi="Britannic Bold"/>
+          <w:sz w:val="28"/>
+          <w:szCs w:val="28"/>
+        </w:rPr>
+      </w:pPr>
+      <w:r>
+        <w:rPr>
+          <w:rFonts w:ascii="Britannic Bold" w:hAnsi="Britannic Bold"/>
+          <w:sz w:val="28"/>
+          <w:szCs w:val="28"/>
+        </w:rPr>
+        <w:t>Code</w:t>
+      </w:r>
+      <w:r>
+        <w:rPr>
+          <w:rFonts w:ascii="Britannic Bold" w:hAnsi="Britannic Bold"/>
+          <w:sz w:val="28"/>
+          <w:szCs w:val="28"/>
+        </w:rPr>
+        <w:t>:</w:t>
+      </w:r>
+    </w:p>
+    <w:p>
+      <w:pPr>
+        <w:spacing w:after="0"/>
+        <w:rPr>
+          <w:rFonts w:ascii="Britannic Bold" w:hAnsi="Britannic Bold"/>
+          <w:sz w:val="28"/>
+          <w:szCs w:val="28"/>
+        </w:rPr>
+      </w:pPr>
+    </w:p>
+    <w:p>
+      <w:pPr>
+        <w:rPr>
+          <w:rFonts w:ascii="Britannic Bold" w:hAnsi="Britannic Bold"/>
+          <w:sz w:val="28"/>
+          <w:szCs w:val="28"/>
+        </w:rPr>
+      </w:pPr>
+      <w:r>
+        <w:rPr>
+          <w:rFonts w:ascii="Britannic Bold" w:hAnsi="Britannic Bold"/>
+          <w:sz w:val="28"/>
+          <w:szCs w:val="28"/>
+        </w:rPr>
+        <w:t>Output:</w:t>
+      </w:r>
+    </w:p>
+    <w:p>
+      <w:pPr>
+        <w:rPr>
+          <w:rFonts w:ascii="Britannic Bold" w:hAnsi="Britannic Bold"/>
+          <w:sz w:val="28"/>
+          <w:szCs w:val="28"/>
+        </w:rPr>
+      </w:pPr>
+    </w:p>
+    <w:p>
+      <w:pPr>
+        <w:pStyle w:val="TableParagraph"/>
+        <w:numPr>
+          <w:ilvl w:val="0"/>
+          <w:numId w:val="2"/>
+        </w:numPr>
+        <w:tabs>
+          <w:tab w:val="left" w:pos="893"/>
+        </w:tabs>
+        <w:spacing w:before="203" w:line="264" w:lineRule="auto"/>
+        <w:ind w:right="89"/>
+        <w:jc w:val="both"/>
+        <w:rPr>
+          <w:rFonts w:ascii="Times New Roman" w:hAnsi="Times New Roman" w:cs="Times New Roman"/>
+          <w:b/>
+          <w:bCs/>
+          <w:sz w:val="28"/>
+          <w:szCs w:val="28"/>
+        </w:rPr>
+      </w:pPr>
+      <w:r>
+        <w:rPr>
+          <w:rFonts w:ascii="Times New Roman" w:hAnsi="Times New Roman" w:cs="Times New Roman"/>
+          <w:b/>
+          <w:bCs/>
+          <w:sz w:val="28"/>
+          <w:szCs w:val="28"/>
+        </w:rPr>
+        <w:t>The body mass index (BMI)</w:t>
+      </w:r>
+      <w:r>
+        <w:rPr>
+          <w:rFonts w:ascii="Times New Roman" w:hAnsi="Times New Roman" w:cs="Times New Roman"/>
+          <w:b/>
+          <w:bCs/>
+          <w:sz w:val="28"/>
+          <w:szCs w:val="28"/>
+        </w:rPr>
+        <w:t>:</w:t>
+      </w:r>
+    </w:p>
+    <w:p>
+      <w:pPr>
+        <w:pStyle w:val="TableParagraph"/>
+        <w:tabs>
+          <w:tab w:val="left" w:pos="893"/>
+        </w:tabs>
+        <w:spacing w:before="203" w:after="240" w:line="264" w:lineRule="auto"/>
+        <w:ind w:left="105" w:right="89"/>
+        <w:jc w:val="center"/>
+        <w:rPr>
+          <w:rFonts w:ascii="Times New Roman" w:hAnsi="Times New Roman" w:cs="Times New Roman"/>
+          <w:b/>
+          <w:bCs/>
+          <w:sz w:val="28"/>
+          <w:szCs w:val="28"/>
+        </w:rPr>
+      </w:pPr>
+      <w:r>
+        <w:rPr>
+          <w:rFonts w:ascii="Times New Roman" w:hAnsi="Times New Roman" w:cs="Times New Roman"/>
+          <w:noProof/>
+          <w:sz w:val="28"/>
+          <w:szCs w:val="28"/>
+          <w:lang w:bidi="ar-SA"/>
+        </w:rPr>
+        <w:drawing>
+          <wp:inline distT="0" distB="0" distL="0" distR="0" wp14:anchorId="39B2A16E" wp14:editId="434A31B0">
+            <wp:extent cx="1822450" cy="387350"/>
+            <wp:effectExtent l="0" t="0" r="6350" b="0"/>
+            <wp:docPr id="2" name="Picture 2" descr="A picture containing text&#10;&#10;Description automatically generated"/>
+            <wp:cNvGraphicFramePr>
+              <a:graphicFrameLocks xmlns:a="http://schemas.openxmlformats.org/drawingml/2006/main" noChangeAspect="1"/>
+            </wp:cNvGraphicFramePr>
+            <a:graphic xmlns:a="http://schemas.openxmlformats.org/drawingml/2006/main">
+              <a:graphicData uri="http://schemas.openxmlformats.org/drawingml/2006/picture">
+                <pic:pic xmlns:pic="http://schemas.openxmlformats.org/drawingml/2006/picture">
+                  <pic:nvPicPr>
+                    <pic:cNvPr id="2" name="Picture 2" descr="A picture containing text&#10;&#10;Description automatically generated"/>
+                    <pic:cNvPicPr>
+                      <a:picLocks noChangeAspect="1" noChangeArrowheads="1"/>
+                    </pic:cNvPicPr>
+                  </pic:nvPicPr>
+                  <pic:blipFill>
+                    <a:blip r:embed="rId7">
+                      <a:extLst>
+                        <a:ext uri="{28A0092B-C50C-407E-A947-70E740481C1C}">
+                          <a14:useLocalDpi xmlns:a14="http://schemas.microsoft.com/office/drawing/2010/main" val="0"/>
+                        </a:ext>
+                      </a:extLst>
+                    </a:blip>
+                    <a:srcRect/>
+                    <a:stretch>
+                      <a:fillRect/>
+                    </a:stretch>
+                  </pic:blipFill>
+                  <pic:spPr bwMode="auto">
+                    <a:xfrm>
+                      <a:off x="0" y="0"/>
+                      <a:ext cx="1822450" cy="387350"/>
+                    </a:xfrm>
+                    <a:prstGeom prst="rect">
+                      <a:avLst/>
+                    </a:prstGeom>
+                    <a:noFill/>
+                    <a:ln>
+                      <a:noFill/>
+                    </a:ln>
+                  </pic:spPr>
+                </pic:pic>
+              </a:graphicData>
+            </a:graphic>
+          </wp:inline>
+        </w:drawing>
+      </w:r>
+    </w:p>
+    <w:p>
+      <w:pPr>
+        <w:ind w:left="105"/>
+        <w:jc w:val="both"/>
+        <w:rPr>
+          <w:rFonts w:ascii="Times New Roman" w:hAnsi="Times New Roman" w:cs="Times New Roman"/>
+          <w:sz w:val="28"/>
+          <w:szCs w:val="28"/>
+        </w:rPr>
+      </w:pPr>
+      <w:r>
+        <w:rPr>
+          <w:rFonts w:ascii="Times New Roman" w:hAnsi="Times New Roman" w:cs="Times New Roman"/>
+          <w:sz w:val="28"/>
+          <w:szCs w:val="28"/>
+        </w:rPr>
+        <w:lastRenderedPageBreak/>
+        <w:t>Where</w:t>
+      </w:r>
+      <w:r>
+        <w:rPr>
+          <w:rFonts w:ascii="Times New Roman" w:hAnsi="Times New Roman" w:cs="Times New Roman"/>
+          <w:spacing w:val="-4"/>
+          <w:sz w:val="28"/>
+          <w:szCs w:val="28"/>
+        </w:rPr>
+        <w:t xml:space="preserve"> </w:t>
+      </w:r>
+      <w:r>
+        <w:rPr>
+          <w:rFonts w:ascii="Times New Roman" w:hAnsi="Times New Roman" w:cs="Times New Roman"/>
+          <w:sz w:val="28"/>
+          <w:szCs w:val="28"/>
+        </w:rPr>
+        <w:t>mass</w:t>
+      </w:r>
+      <w:r>
+        <w:rPr>
+          <w:rFonts w:ascii="Times New Roman" w:hAnsi="Times New Roman" w:cs="Times New Roman"/>
+          <w:spacing w:val="-2"/>
+          <w:sz w:val="28"/>
+          <w:szCs w:val="28"/>
+        </w:rPr>
+        <w:t xml:space="preserve"> </w:t>
+      </w:r>
+      <w:r>
+        <w:rPr>
+          <w:rFonts w:ascii="Times New Roman" w:hAnsi="Times New Roman" w:cs="Times New Roman"/>
+          <w:sz w:val="28"/>
+          <w:szCs w:val="28"/>
+        </w:rPr>
+        <w:t>is</w:t>
+      </w:r>
+      <w:r>
+        <w:rPr>
+          <w:rFonts w:ascii="Times New Roman" w:hAnsi="Times New Roman" w:cs="Times New Roman"/>
+          <w:spacing w:val="-2"/>
+          <w:sz w:val="28"/>
+          <w:szCs w:val="28"/>
+        </w:rPr>
+        <w:t xml:space="preserve"> </w:t>
+      </w:r>
+      <w:r>
+        <w:rPr>
+          <w:rFonts w:ascii="Times New Roman" w:hAnsi="Times New Roman" w:cs="Times New Roman"/>
+          <w:sz w:val="28"/>
+          <w:szCs w:val="28"/>
+        </w:rPr>
+        <w:t>the</w:t>
+      </w:r>
+      <w:r>
+        <w:rPr>
+          <w:rFonts w:ascii="Times New Roman" w:hAnsi="Times New Roman" w:cs="Times New Roman"/>
+          <w:spacing w:val="-3"/>
+          <w:sz w:val="28"/>
+          <w:szCs w:val="28"/>
+        </w:rPr>
+        <w:t xml:space="preserve"> </w:t>
+      </w:r>
+      <w:r>
+        <w:rPr>
+          <w:rFonts w:ascii="Times New Roman" w:hAnsi="Times New Roman" w:cs="Times New Roman"/>
+          <w:sz w:val="28"/>
+          <w:szCs w:val="28"/>
+        </w:rPr>
+        <w:t>subject's</w:t>
+      </w:r>
+      <w:r>
+        <w:rPr>
+          <w:rFonts w:ascii="Times New Roman" w:hAnsi="Times New Roman" w:cs="Times New Roman"/>
+          <w:spacing w:val="-2"/>
+          <w:sz w:val="28"/>
+          <w:szCs w:val="28"/>
+        </w:rPr>
+        <w:t xml:space="preserve"> </w:t>
+      </w:r>
+      <w:r>
+        <w:rPr>
+          <w:rFonts w:ascii="Times New Roman" w:hAnsi="Times New Roman" w:cs="Times New Roman"/>
+          <w:sz w:val="28"/>
+          <w:szCs w:val="28"/>
+        </w:rPr>
+        <w:t>weight</w:t>
+      </w:r>
+      <w:r>
+        <w:rPr>
+          <w:rFonts w:ascii="Times New Roman" w:hAnsi="Times New Roman" w:cs="Times New Roman"/>
+          <w:spacing w:val="-3"/>
+          <w:sz w:val="28"/>
+          <w:szCs w:val="28"/>
+        </w:rPr>
+        <w:t xml:space="preserve"> </w:t>
+      </w:r>
+      <w:r>
+        <w:rPr>
+          <w:rFonts w:ascii="Times New Roman" w:hAnsi="Times New Roman" w:cs="Times New Roman"/>
+          <w:sz w:val="28"/>
+          <w:szCs w:val="28"/>
+        </w:rPr>
+        <w:t>in</w:t>
+      </w:r>
+      <w:r>
+        <w:rPr>
+          <w:rFonts w:ascii="Times New Roman" w:hAnsi="Times New Roman" w:cs="Times New Roman"/>
+          <w:spacing w:val="-3"/>
+          <w:sz w:val="28"/>
+          <w:szCs w:val="28"/>
+        </w:rPr>
+        <w:t xml:space="preserve"> </w:t>
+      </w:r>
+      <w:r>
+        <w:rPr>
+          <w:rFonts w:ascii="Times New Roman" w:hAnsi="Times New Roman" w:cs="Times New Roman"/>
+          <w:sz w:val="28"/>
+          <w:szCs w:val="28"/>
+        </w:rPr>
+        <w:t>pounds</w:t>
+      </w:r>
+      <w:r>
+        <w:rPr>
+          <w:rFonts w:ascii="Times New Roman" w:hAnsi="Times New Roman" w:cs="Times New Roman"/>
+          <w:spacing w:val="-2"/>
+          <w:sz w:val="28"/>
+          <w:szCs w:val="28"/>
+        </w:rPr>
+        <w:t xml:space="preserve"> </w:t>
+      </w:r>
+      <w:r>
+        <w:rPr>
+          <w:rFonts w:ascii="Times New Roman" w:hAnsi="Times New Roman" w:cs="Times New Roman"/>
+          <w:sz w:val="28"/>
+          <w:szCs w:val="28"/>
+        </w:rPr>
+        <w:t>(</w:t>
+      </w:r>
+      <w:r>
+        <w:rPr>
+          <w:rFonts w:ascii="Times New Roman" w:hAnsi="Times New Roman" w:cs="Times New Roman"/>
+          <w:sz w:val="28"/>
+          <w:szCs w:val="28"/>
+        </w:rPr>
+        <w:t>lb.</w:t>
+      </w:r>
+      <w:r>
+        <w:rPr>
+          <w:rFonts w:ascii="Times New Roman" w:hAnsi="Times New Roman" w:cs="Times New Roman"/>
+          <w:sz w:val="28"/>
+          <w:szCs w:val="28"/>
+        </w:rPr>
+        <w:t>)</w:t>
+      </w:r>
+      <w:r>
+        <w:rPr>
+          <w:rFonts w:ascii="Times New Roman" w:hAnsi="Times New Roman" w:cs="Times New Roman"/>
+          <w:spacing w:val="-4"/>
+          <w:sz w:val="28"/>
+          <w:szCs w:val="28"/>
+        </w:rPr>
+        <w:t xml:space="preserve"> </w:t>
+      </w:r>
+      <w:r>
+        <w:rPr>
+          <w:rFonts w:ascii="Times New Roman" w:hAnsi="Times New Roman" w:cs="Times New Roman"/>
+          <w:sz w:val="28"/>
+          <w:szCs w:val="28"/>
+        </w:rPr>
+        <w:t>and</w:t>
+      </w:r>
+      <w:r>
+        <w:rPr>
+          <w:rFonts w:ascii="Times New Roman" w:hAnsi="Times New Roman" w:cs="Times New Roman"/>
+          <w:spacing w:val="-3"/>
+          <w:sz w:val="28"/>
+          <w:szCs w:val="28"/>
+        </w:rPr>
+        <w:t xml:space="preserve"> </w:t>
+      </w:r>
+      <w:r>
+        <w:rPr>
+          <w:rFonts w:ascii="Times New Roman" w:hAnsi="Times New Roman" w:cs="Times New Roman"/>
+          <w:sz w:val="28"/>
+          <w:szCs w:val="28"/>
+        </w:rPr>
+        <w:t>height</w:t>
+      </w:r>
+      <w:r>
+        <w:rPr>
+          <w:rFonts w:ascii="Times New Roman" w:hAnsi="Times New Roman" w:cs="Times New Roman"/>
+          <w:spacing w:val="-3"/>
+          <w:sz w:val="28"/>
+          <w:szCs w:val="28"/>
+        </w:rPr>
+        <w:t xml:space="preserve"> </w:t>
+      </w:r>
+      <w:r>
+        <w:rPr>
+          <w:rFonts w:ascii="Times New Roman" w:hAnsi="Times New Roman" w:cs="Times New Roman"/>
+          <w:sz w:val="28"/>
+          <w:szCs w:val="28"/>
+        </w:rPr>
+        <w:t>is</w:t>
+      </w:r>
+      <w:r>
+        <w:rPr>
+          <w:rFonts w:ascii="Times New Roman" w:hAnsi="Times New Roman" w:cs="Times New Roman"/>
+          <w:spacing w:val="-2"/>
+          <w:sz w:val="28"/>
+          <w:szCs w:val="28"/>
+        </w:rPr>
+        <w:t xml:space="preserve"> </w:t>
+      </w:r>
+      <w:r>
+        <w:rPr>
+          <w:rFonts w:ascii="Times New Roman" w:hAnsi="Times New Roman" w:cs="Times New Roman"/>
+          <w:sz w:val="28"/>
+          <w:szCs w:val="28"/>
+        </w:rPr>
+        <w:t>the</w:t>
+      </w:r>
+      <w:r>
+        <w:rPr>
+          <w:rFonts w:ascii="Times New Roman" w:hAnsi="Times New Roman" w:cs="Times New Roman"/>
+          <w:spacing w:val="-3"/>
+          <w:sz w:val="28"/>
+          <w:szCs w:val="28"/>
+        </w:rPr>
+        <w:t xml:space="preserve"> </w:t>
+      </w:r>
+      <w:r>
+        <w:rPr>
+          <w:rFonts w:ascii="Times New Roman" w:hAnsi="Times New Roman" w:cs="Times New Roman"/>
+          <w:sz w:val="28"/>
+          <w:szCs w:val="28"/>
+        </w:rPr>
+        <w:t>height</w:t>
+      </w:r>
+      <w:r>
+        <w:rPr>
+          <w:rFonts w:ascii="Times New Roman" w:hAnsi="Times New Roman" w:cs="Times New Roman"/>
+          <w:spacing w:val="-2"/>
+          <w:sz w:val="28"/>
+          <w:szCs w:val="28"/>
+        </w:rPr>
+        <w:t xml:space="preserve"> </w:t>
+      </w:r>
+      <w:r>
+        <w:rPr>
+          <w:rFonts w:ascii="Times New Roman" w:hAnsi="Times New Roman" w:cs="Times New Roman"/>
+          <w:sz w:val="28"/>
+          <w:szCs w:val="28"/>
+        </w:rPr>
+        <w:t>in</w:t>
+      </w:r>
+      <w:r>
+        <w:rPr>
+          <w:rFonts w:ascii="Times New Roman" w:hAnsi="Times New Roman" w:cs="Times New Roman"/>
+          <w:spacing w:val="-3"/>
+          <w:sz w:val="28"/>
+          <w:szCs w:val="28"/>
+        </w:rPr>
+        <w:t xml:space="preserve"> </w:t>
+      </w:r>
+      <w:r>
+        <w:rPr>
+          <w:rFonts w:ascii="Times New Roman" w:hAnsi="Times New Roman" w:cs="Times New Roman"/>
+          <w:sz w:val="28"/>
+          <w:szCs w:val="28"/>
+        </w:rPr>
+        <w:t>inches (in). The value 703 is a factor to convert BMI to a value that matches the original BMI calculations done in metric units (</w:t>
+      </w:r>
+      <w:r>
+        <w:rPr>
+          <w:rFonts w:ascii="Times New Roman" w:hAnsi="Times New Roman" w:cs="Times New Roman"/>
+          <w:sz w:val="28"/>
+          <w:szCs w:val="28"/>
+        </w:rPr>
+        <w:t>i.e.,</w:t>
+      </w:r>
+      <w:r>
+        <w:rPr>
+          <w:rFonts w:ascii="Times New Roman" w:hAnsi="Times New Roman" w:cs="Times New Roman"/>
+          <w:spacing w:val="-7"/>
+          <w:sz w:val="28"/>
+          <w:szCs w:val="28"/>
+        </w:rPr>
+        <w:t xml:space="preserve"> </w:t>
+      </w:r>
+      <w:r>
+        <w:rPr>
+          <w:rFonts w:ascii="Times New Roman" w:hAnsi="Times New Roman" w:cs="Times New Roman"/>
+          <w:sz w:val="28"/>
+          <w:szCs w:val="28"/>
+        </w:rPr>
+        <w:t>K</w:t>
+      </w:r>
+      <w:r>
+        <w:rPr>
+          <w:rFonts w:ascii="Times New Roman" w:hAnsi="Times New Roman" w:cs="Times New Roman"/>
+          <w:sz w:val="28"/>
+          <w:szCs w:val="28"/>
+        </w:rPr>
+        <w:t>ilograms-</w:t>
+      </w:r>
+      <w:r>
+        <w:rPr>
+          <w:rFonts w:ascii="Times New Roman" w:hAnsi="Times New Roman" w:cs="Times New Roman"/>
+          <w:sz w:val="28"/>
+          <w:szCs w:val="28"/>
+        </w:rPr>
+        <w:t>M</w:t>
+      </w:r>
+      <w:r>
+        <w:rPr>
+          <w:rFonts w:ascii="Times New Roman" w:hAnsi="Times New Roman" w:cs="Times New Roman"/>
+          <w:sz w:val="28"/>
+          <w:szCs w:val="28"/>
+        </w:rPr>
+        <w:t>eters).</w:t>
+      </w:r>
+    </w:p>
+    <w:p>
+      <w:pPr>
+        <w:spacing w:after="0"/>
+        <w:rPr>
+          <w:rFonts w:ascii="Britannic Bold" w:hAnsi="Britannic Bold"/>
+          <w:sz w:val="28"/>
+          <w:szCs w:val="28"/>
+        </w:rPr>
+      </w:pPr>
+      <w:r>
+        <w:rPr>
+          <w:rFonts w:ascii="Britannic Bold" w:hAnsi="Britannic Bold"/>
+          <w:sz w:val="28"/>
+          <w:szCs w:val="28"/>
+        </w:rPr>
+        <w:t>Code</w:t>
+      </w:r>
+      <w:r>
+        <w:rPr>
+          <w:rFonts w:ascii="Britannic Bold" w:hAnsi="Britannic Bold"/>
+          <w:sz w:val="28"/>
+          <w:szCs w:val="28"/>
+        </w:rPr>
+        <w:t>:</w:t>
+      </w:r>
+    </w:p>
+    <w:p>
+      <w:pPr>
+        <w:spacing w:after="0"/>
+        <w:rPr>
+          <w:rFonts w:ascii="Britannic Bold" w:hAnsi="Britannic Bold"/>
+          <w:sz w:val="28"/>
+          <w:szCs w:val="28"/>
+        </w:rPr>
+      </w:pPr>
+    </w:p>
+    <w:p>
+      <w:pPr>
+        <w:rPr>
+          <w:rFonts w:ascii="Britannic Bold" w:hAnsi="Britannic Bold"/>
+          <w:sz w:val="28"/>
+          <w:szCs w:val="28"/>
+        </w:rPr>
+      </w:pPr>
+      <w:r>
+        <w:rPr>
+          <w:rFonts w:ascii="Britannic Bold" w:hAnsi="Britannic Bold"/>
+          <w:sz w:val="28"/>
+          <w:szCs w:val="28"/>
+        </w:rPr>
+        <w:t>Output:</w:t>
+      </w:r>
+    </w:p>
+    <w:p>
+      <w:pPr>
+        <w:rPr>
+          <w:rFonts w:ascii="Britannic Bold" w:hAnsi="Britannic Bold"/>
+          <w:sz w:val="28"/>
+          <w:szCs w:val="28"/>
+        </w:rPr>
+      </w:pPr>
+    </w:p>
     <w:sectPr>
-      <w:headerReference w:type="even" r:id="rId6"/>
-      <w:headerReference w:type="default" r:id="rId7"/>
-      <w:footerReference w:type="even" r:id="rId8"/>
-      <w:footerReference w:type="default" r:id="rId9"/>
-      <w:headerReference w:type="first" r:id="rId10"/>
-      <w:footerReference w:type="first" r:id="rId11"/>
+      <w:headerReference w:type="even" r:id="rId8"/>
+      <w:headerReference w:type="default" r:id="rId9"/>
+      <w:footerReference w:type="even" r:id="rId10"/>
+      <w:footerReference w:type="default" r:id="rId11"/>
+      <w:headerReference w:type="first" r:id="rId12"/>
+      <w:footerReference w:type="first" r:id="rId13"/>
       <w:pgSz w:w="12240" w:h="15840"/>
       <w:pgMar w:top="1440" w:right="1440" w:bottom="1440" w:left="1440" w:header="720" w:footer="720" w:gutter="0"/>
       <w:pgBorders w:offsetFrom="page">
@@ -257,6 +1555,419 @@
     </w:pPr>
   </w:p>
 </w:hdr>
+</file>
+
+<file path=word/numbering.xml><?xml version="1.0" encoding="utf-8"?>
+<w:numbering xmlns:wpc="http://schemas.microsoft.com/office/word/2010/wordprocessingCanvas" xmlns:cx="http://schemas.microsoft.com/office/drawing/2014/chartex" xmlns:cx1="http://schemas.microsoft.com/office/drawing/2015/9/8/chartex" xmlns:cx2="http://schemas.microsoft.com/office/drawing/2015/10/21/chartex" xmlns:cx3="http://schemas.microsoft.com/office/drawing/2016/5/9/chartex" xmlns:cx4="http://schemas.microsoft.com/office/drawing/2016/5/10/chartex" xmlns:cx5="http://schemas.microsoft.com/office/drawing/2016/5/11/chartex" xmlns:cx6="http://schemas.microsoft.com/office/drawing/2016/5/12/chartex" xmlns:cx7="http://schemas.microsoft.com/office/drawing/2016/5/13/chartex" xmlns:cx8="http://schemas.microsoft.com/office/drawing/2016/5/14/chartex" xmlns:mc="http://schemas.openxmlformats.org/markup-compatibility/2006" xmlns:aink="http://schemas.microsoft.com/office/drawing/2016/ink" xmlns:am3d="http://schemas.microsoft.com/office/drawing/2017/model3d" xmlns:o="urn:schemas-microsoft-com:office:office" xmlns:oel="http://schemas.microsoft.com/office/2019/extlst" xmlns:r="http://schemas.openxmlformats.org/officeDocument/2006/relationships" xmlns:m="http://schemas.openxmlformats.org/officeDocument/2006/math" xmlns:v="urn:schemas-microsoft-com:vml" xmlns:wp14="http://schemas.microsoft.com/office/word/2010/wordprocessingDrawing" xmlns:wp="http://schemas.openxmlformats.org/drawingml/2006/wordprocessingDrawing" xmlns:w10="urn:schemas-microsoft-com:office:word" xmlns:w="http://schemas.openxmlformats.org/wordprocessingml/2006/main" xmlns:w14="http://schemas.microsoft.com/office/word/2010/wordml" xmlns:w15="http://schemas.microsoft.com/office/word/2012/wordml" xmlns:w16cex="http://schemas.microsoft.com/office/word/2018/wordml/cex" xmlns:w16cid="http://schemas.microsoft.com/office/word/2016/wordml/cid" xmlns:w16="http://schemas.microsoft.com/office/word/2018/wordml" xmlns:w16sdtdh="http://schemas.microsoft.com/office/word/2020/wordml/sdtdatahash" xmlns:w16se="http://schemas.microsoft.com/office/word/2015/wordml/symex" xmlns:wpg="http://schemas.microsoft.com/office/word/2010/wordprocessingGroup" xmlns:wpi="http://schemas.microsoft.com/office/word/2010/wordprocessingInk" xmlns:wne="http://schemas.microsoft.com/office/word/2006/wordml" xmlns:wps="http://schemas.microsoft.com/office/word/2010/wordprocessingShape" mc:Ignorable="w14 w15 w16se w16cid w16 w16cex w16sdtdh wp14">
+  <w:abstractNum w:abstractNumId="0" w15:restartNumberingAfterBreak="0">
+    <w:nsid w:val="06910806"/>
+    <w:multiLevelType w:val="hybridMultilevel"/>
+    <w:tmpl w:val="E7B6CCF4"/>
+    <w:lvl w:ilvl="0" w:tplc="D23C00E0">
+      <w:start w:val="9"/>
+      <w:numFmt w:val="lowerLetter"/>
+      <w:lvlText w:val="%1)"/>
+      <w:lvlJc w:val="left"/>
+      <w:pPr>
+        <w:ind w:left="465" w:hanging="360"/>
+      </w:pPr>
+      <w:rPr>
+        <w:rFonts w:hint="default"/>
+      </w:rPr>
+    </w:lvl>
+    <w:lvl w:ilvl="1" w:tplc="04090019">
+      <w:start w:val="1"/>
+      <w:numFmt w:val="lowerLetter"/>
+      <w:lvlText w:val="%2."/>
+      <w:lvlJc w:val="left"/>
+      <w:pPr>
+        <w:ind w:left="1185" w:hanging="360"/>
+      </w:pPr>
+    </w:lvl>
+    <w:lvl w:ilvl="2" w:tplc="0409001B" w:tentative="1">
+      <w:start w:val="1"/>
+      <w:numFmt w:val="lowerRoman"/>
+      <w:lvlText w:val="%3."/>
+      <w:lvlJc w:val="right"/>
+      <w:pPr>
+        <w:ind w:left="1905" w:hanging="180"/>
+      </w:pPr>
+    </w:lvl>
+    <w:lvl w:ilvl="3" w:tplc="0409000F" w:tentative="1">
+      <w:start w:val="1"/>
+      <w:numFmt w:val="decimal"/>
+      <w:lvlText w:val="%4."/>
+      <w:lvlJc w:val="left"/>
+      <w:pPr>
+        <w:ind w:left="2625" w:hanging="360"/>
+      </w:pPr>
+    </w:lvl>
+    <w:lvl w:ilvl="4" w:tplc="04090019" w:tentative="1">
+      <w:start w:val="1"/>
+      <w:numFmt w:val="lowerLetter"/>
+      <w:lvlText w:val="%5."/>
+      <w:lvlJc w:val="left"/>
+      <w:pPr>
+        <w:ind w:left="3345" w:hanging="360"/>
+      </w:pPr>
+    </w:lvl>
+    <w:lvl w:ilvl="5" w:tplc="0409001B" w:tentative="1">
+      <w:start w:val="1"/>
+      <w:numFmt w:val="lowerRoman"/>
+      <w:lvlText w:val="%6."/>
+      <w:lvlJc w:val="right"/>
+      <w:pPr>
+        <w:ind w:left="4065" w:hanging="180"/>
+      </w:pPr>
+    </w:lvl>
+    <w:lvl w:ilvl="6" w:tplc="0409000F" w:tentative="1">
+      <w:start w:val="1"/>
+      <w:numFmt w:val="decimal"/>
+      <w:lvlText w:val="%7."/>
+      <w:lvlJc w:val="left"/>
+      <w:pPr>
+        <w:ind w:left="4785" w:hanging="360"/>
+      </w:pPr>
+    </w:lvl>
+    <w:lvl w:ilvl="7" w:tplc="04090019" w:tentative="1">
+      <w:start w:val="1"/>
+      <w:numFmt w:val="lowerLetter"/>
+      <w:lvlText w:val="%8."/>
+      <w:lvlJc w:val="left"/>
+      <w:pPr>
+        <w:ind w:left="5505" w:hanging="360"/>
+      </w:pPr>
+    </w:lvl>
+    <w:lvl w:ilvl="8" w:tplc="0409001B" w:tentative="1">
+      <w:start w:val="1"/>
+      <w:numFmt w:val="lowerRoman"/>
+      <w:lvlText w:val="%9."/>
+      <w:lvlJc w:val="right"/>
+      <w:pPr>
+        <w:ind w:left="6225" w:hanging="180"/>
+      </w:pPr>
+    </w:lvl>
+  </w:abstractNum>
+  <w:abstractNum w:abstractNumId="1" w15:restartNumberingAfterBreak="0">
+    <w:nsid w:val="081B31E1"/>
+    <w:multiLevelType w:val="hybridMultilevel"/>
+    <w:tmpl w:val="E15AF8AE"/>
+    <w:lvl w:ilvl="0" w:tplc="C6D6B6D0">
+      <w:start w:val="1"/>
+      <w:numFmt w:val="lowerLetter"/>
+      <w:lvlText w:val="%1."/>
+      <w:lvlJc w:val="left"/>
+      <w:pPr>
+        <w:ind w:left="892" w:hanging="360"/>
+      </w:pPr>
+      <w:rPr>
+        <w:rFonts w:ascii="Calibri Light" w:eastAsia="Calibri Light" w:hAnsi="Calibri Light" w:cs="Calibri Light" w:hint="default"/>
+        <w:spacing w:val="-2"/>
+        <w:w w:val="100"/>
+        <w:sz w:val="24"/>
+        <w:szCs w:val="24"/>
+        <w:lang w:val="en-US" w:eastAsia="en-US" w:bidi="en-US"/>
+      </w:rPr>
+    </w:lvl>
+    <w:lvl w:ilvl="1" w:tplc="CD22320A">
+      <w:start w:val="1"/>
+      <w:numFmt w:val="lowerRoman"/>
+      <w:lvlText w:val="%2)"/>
+      <w:lvlJc w:val="left"/>
+      <w:pPr>
+        <w:ind w:left="1252" w:hanging="360"/>
+      </w:pPr>
+      <w:rPr>
+        <w:rFonts w:ascii="Calibri Light" w:eastAsia="Calibri Light" w:hAnsi="Calibri Light" w:cs="Calibri Light" w:hint="default"/>
+        <w:spacing w:val="-3"/>
+        <w:w w:val="100"/>
+        <w:sz w:val="24"/>
+        <w:szCs w:val="24"/>
+        <w:lang w:val="en-US" w:eastAsia="en-US" w:bidi="en-US"/>
+      </w:rPr>
+    </w:lvl>
+    <w:lvl w:ilvl="2" w:tplc="35B26ABA">
+      <w:numFmt w:val="bullet"/>
+      <w:lvlText w:val="•"/>
+      <w:lvlJc w:val="left"/>
+      <w:pPr>
+        <w:ind w:left="2106" w:hanging="360"/>
+      </w:pPr>
+      <w:rPr>
+        <w:lang w:val="en-US" w:eastAsia="en-US" w:bidi="en-US"/>
+      </w:rPr>
+    </w:lvl>
+    <w:lvl w:ilvl="3" w:tplc="BF2EDE5C">
+      <w:numFmt w:val="bullet"/>
+      <w:lvlText w:val="•"/>
+      <w:lvlJc w:val="left"/>
+      <w:pPr>
+        <w:ind w:left="2952" w:hanging="360"/>
+      </w:pPr>
+      <w:rPr>
+        <w:lang w:val="en-US" w:eastAsia="en-US" w:bidi="en-US"/>
+      </w:rPr>
+    </w:lvl>
+    <w:lvl w:ilvl="4" w:tplc="15584066">
+      <w:numFmt w:val="bullet"/>
+      <w:lvlText w:val="•"/>
+      <w:lvlJc w:val="left"/>
+      <w:pPr>
+        <w:ind w:left="3798" w:hanging="360"/>
+      </w:pPr>
+      <w:rPr>
+        <w:lang w:val="en-US" w:eastAsia="en-US" w:bidi="en-US"/>
+      </w:rPr>
+    </w:lvl>
+    <w:lvl w:ilvl="5" w:tplc="D4767182">
+      <w:numFmt w:val="bullet"/>
+      <w:lvlText w:val="•"/>
+      <w:lvlJc w:val="left"/>
+      <w:pPr>
+        <w:ind w:left="4644" w:hanging="360"/>
+      </w:pPr>
+      <w:rPr>
+        <w:lang w:val="en-US" w:eastAsia="en-US" w:bidi="en-US"/>
+      </w:rPr>
+    </w:lvl>
+    <w:lvl w:ilvl="6" w:tplc="27F8C5F8">
+      <w:numFmt w:val="bullet"/>
+      <w:lvlText w:val="•"/>
+      <w:lvlJc w:val="left"/>
+      <w:pPr>
+        <w:ind w:left="5491" w:hanging="360"/>
+      </w:pPr>
+      <w:rPr>
+        <w:lang w:val="en-US" w:eastAsia="en-US" w:bidi="en-US"/>
+      </w:rPr>
+    </w:lvl>
+    <w:lvl w:ilvl="7" w:tplc="77FA54B6">
+      <w:numFmt w:val="bullet"/>
+      <w:lvlText w:val="•"/>
+      <w:lvlJc w:val="left"/>
+      <w:pPr>
+        <w:ind w:left="6337" w:hanging="360"/>
+      </w:pPr>
+      <w:rPr>
+        <w:lang w:val="en-US" w:eastAsia="en-US" w:bidi="en-US"/>
+      </w:rPr>
+    </w:lvl>
+    <w:lvl w:ilvl="8" w:tplc="206404A0">
+      <w:numFmt w:val="bullet"/>
+      <w:lvlText w:val="•"/>
+      <w:lvlJc w:val="left"/>
+      <w:pPr>
+        <w:ind w:left="7183" w:hanging="360"/>
+      </w:pPr>
+      <w:rPr>
+        <w:lang w:val="en-US" w:eastAsia="en-US" w:bidi="en-US"/>
+      </w:rPr>
+    </w:lvl>
+  </w:abstractNum>
+  <w:abstractNum w:abstractNumId="2" w15:restartNumberingAfterBreak="0">
+    <w:nsid w:val="0B5E5967"/>
+    <w:multiLevelType w:val="hybridMultilevel"/>
+    <w:tmpl w:val="30A21256"/>
+    <w:lvl w:ilvl="0" w:tplc="8F58C034">
+      <w:start w:val="1"/>
+      <w:numFmt w:val="lowerLetter"/>
+      <w:lvlText w:val="%1)"/>
+      <w:lvlJc w:val="left"/>
+      <w:pPr>
+        <w:ind w:left="465" w:hanging="360"/>
+      </w:pPr>
+      <w:rPr>
+        <w:rFonts w:hint="default"/>
+      </w:rPr>
+    </w:lvl>
+    <w:lvl w:ilvl="1" w:tplc="04090019">
+      <w:start w:val="1"/>
+      <w:numFmt w:val="lowerLetter"/>
+      <w:lvlText w:val="%2."/>
+      <w:lvlJc w:val="left"/>
+      <w:pPr>
+        <w:ind w:left="1185" w:hanging="360"/>
+      </w:pPr>
+    </w:lvl>
+    <w:lvl w:ilvl="2" w:tplc="0409001B" w:tentative="1">
+      <w:start w:val="1"/>
+      <w:numFmt w:val="lowerRoman"/>
+      <w:lvlText w:val="%3."/>
+      <w:lvlJc w:val="right"/>
+      <w:pPr>
+        <w:ind w:left="1905" w:hanging="180"/>
+      </w:pPr>
+    </w:lvl>
+    <w:lvl w:ilvl="3" w:tplc="0409000F" w:tentative="1">
+      <w:start w:val="1"/>
+      <w:numFmt w:val="decimal"/>
+      <w:lvlText w:val="%4."/>
+      <w:lvlJc w:val="left"/>
+      <w:pPr>
+        <w:ind w:left="2625" w:hanging="360"/>
+      </w:pPr>
+    </w:lvl>
+    <w:lvl w:ilvl="4" w:tplc="04090019" w:tentative="1">
+      <w:start w:val="1"/>
+      <w:numFmt w:val="lowerLetter"/>
+      <w:lvlText w:val="%5."/>
+      <w:lvlJc w:val="left"/>
+      <w:pPr>
+        <w:ind w:left="3345" w:hanging="360"/>
+      </w:pPr>
+    </w:lvl>
+    <w:lvl w:ilvl="5" w:tplc="0409001B" w:tentative="1">
+      <w:start w:val="1"/>
+      <w:numFmt w:val="lowerRoman"/>
+      <w:lvlText w:val="%6."/>
+      <w:lvlJc w:val="right"/>
+      <w:pPr>
+        <w:ind w:left="4065" w:hanging="180"/>
+      </w:pPr>
+    </w:lvl>
+    <w:lvl w:ilvl="6" w:tplc="0409000F" w:tentative="1">
+      <w:start w:val="1"/>
+      <w:numFmt w:val="decimal"/>
+      <w:lvlText w:val="%7."/>
+      <w:lvlJc w:val="left"/>
+      <w:pPr>
+        <w:ind w:left="4785" w:hanging="360"/>
+      </w:pPr>
+    </w:lvl>
+    <w:lvl w:ilvl="7" w:tplc="04090019" w:tentative="1">
+      <w:start w:val="1"/>
+      <w:numFmt w:val="lowerLetter"/>
+      <w:lvlText w:val="%8."/>
+      <w:lvlJc w:val="left"/>
+      <w:pPr>
+        <w:ind w:left="5505" w:hanging="360"/>
+      </w:pPr>
+    </w:lvl>
+    <w:lvl w:ilvl="8" w:tplc="0409001B" w:tentative="1">
+      <w:start w:val="1"/>
+      <w:numFmt w:val="lowerRoman"/>
+      <w:lvlText w:val="%9."/>
+      <w:lvlJc w:val="right"/>
+      <w:pPr>
+        <w:ind w:left="6225" w:hanging="180"/>
+      </w:pPr>
+    </w:lvl>
+  </w:abstractNum>
+  <w:abstractNum w:abstractNumId="3" w15:restartNumberingAfterBreak="0">
+    <w:nsid w:val="7A1E3235"/>
+    <w:multiLevelType w:val="hybridMultilevel"/>
+    <w:tmpl w:val="7DD02628"/>
+    <w:lvl w:ilvl="0" w:tplc="04090017">
+      <w:start w:val="9"/>
+      <w:numFmt w:val="lowerLetter"/>
+      <w:lvlText w:val="%1)"/>
+      <w:lvlJc w:val="left"/>
+      <w:pPr>
+        <w:ind w:left="720" w:hanging="360"/>
+      </w:pPr>
+      <w:rPr>
+        <w:rFonts w:hint="default"/>
+      </w:rPr>
+    </w:lvl>
+    <w:lvl w:ilvl="1" w:tplc="04090019" w:tentative="1">
+      <w:start w:val="1"/>
+      <w:numFmt w:val="lowerLetter"/>
+      <w:lvlText w:val="%2."/>
+      <w:lvlJc w:val="left"/>
+      <w:pPr>
+        <w:ind w:left="1440" w:hanging="360"/>
+      </w:pPr>
+    </w:lvl>
+    <w:lvl w:ilvl="2" w:tplc="0409001B" w:tentative="1">
+      <w:start w:val="1"/>
+      <w:numFmt w:val="lowerRoman"/>
+      <w:lvlText w:val="%3."/>
+      <w:lvlJc w:val="right"/>
+      <w:pPr>
+        <w:ind w:left="2160" w:hanging="180"/>
+      </w:pPr>
+    </w:lvl>
+    <w:lvl w:ilvl="3" w:tplc="0409000F" w:tentative="1">
+      <w:start w:val="1"/>
+      <w:numFmt w:val="decimal"/>
+      <w:lvlText w:val="%4."/>
+      <w:lvlJc w:val="left"/>
+      <w:pPr>
+        <w:ind w:left="2880" w:hanging="360"/>
+      </w:pPr>
+    </w:lvl>
+    <w:lvl w:ilvl="4" w:tplc="04090019" w:tentative="1">
+      <w:start w:val="1"/>
+      <w:numFmt w:val="lowerLetter"/>
+      <w:lvlText w:val="%5."/>
+      <w:lvlJc w:val="left"/>
+      <w:pPr>
+        <w:ind w:left="3600" w:hanging="360"/>
+      </w:pPr>
+    </w:lvl>
+    <w:lvl w:ilvl="5" w:tplc="0409001B" w:tentative="1">
+      <w:start w:val="1"/>
+      <w:numFmt w:val="lowerRoman"/>
+      <w:lvlText w:val="%6."/>
+      <w:lvlJc w:val="right"/>
+      <w:pPr>
+        <w:ind w:left="4320" w:hanging="180"/>
+      </w:pPr>
+    </w:lvl>
+    <w:lvl w:ilvl="6" w:tplc="0409000F" w:tentative="1">
+      <w:start w:val="1"/>
+      <w:numFmt w:val="decimal"/>
+      <w:lvlText w:val="%7."/>
+      <w:lvlJc w:val="left"/>
+      <w:pPr>
+        <w:ind w:left="5040" w:hanging="360"/>
+      </w:pPr>
+    </w:lvl>
+    <w:lvl w:ilvl="7" w:tplc="04090019" w:tentative="1">
+      <w:start w:val="1"/>
+      <w:numFmt w:val="lowerLetter"/>
+      <w:lvlText w:val="%8."/>
+      <w:lvlJc w:val="left"/>
+      <w:pPr>
+        <w:ind w:left="5760" w:hanging="360"/>
+      </w:pPr>
+    </w:lvl>
+    <w:lvl w:ilvl="8" w:tplc="0409001B" w:tentative="1">
+      <w:start w:val="1"/>
+      <w:numFmt w:val="lowerRoman"/>
+      <w:lvlText w:val="%9."/>
+      <w:lvlJc w:val="right"/>
+      <w:pPr>
+        <w:ind w:left="6480" w:hanging="180"/>
+      </w:pPr>
+    </w:lvl>
+  </w:abstractNum>
+  <w:num w:numId="1" w16cid:durableId="206138982">
+    <w:abstractNumId w:val="1"/>
+    <w:lvlOverride w:ilvl="0">
+      <w:startOverride w:val="1"/>
+    </w:lvlOverride>
+    <w:lvlOverride w:ilvl="1">
+      <w:startOverride w:val="1"/>
+    </w:lvlOverride>
+    <w:lvlOverride w:ilvl="2"/>
+    <w:lvlOverride w:ilvl="3"/>
+    <w:lvlOverride w:ilvl="4"/>
+    <w:lvlOverride w:ilvl="5"/>
+    <w:lvlOverride w:ilvl="6"/>
+    <w:lvlOverride w:ilvl="7"/>
+    <w:lvlOverride w:ilvl="8"/>
+  </w:num>
+  <w:num w:numId="2" w16cid:durableId="659388842">
+    <w:abstractNumId w:val="2"/>
+  </w:num>
+  <w:num w:numId="3" w16cid:durableId="1187212647">
+    <w:abstractNumId w:val="0"/>
+  </w:num>
+  <w:num w:numId="4" w16cid:durableId="2116633498">
+    <w:abstractNumId w:val="3"/>
+  </w:num>
+</w:numbering>
 </file>
 
 <file path=word/styles.xml><?xml version="1.0" encoding="utf-8"?>
@@ -738,6 +2449,23 @@
     <w:uiPriority w:val="99"/>
     <w:rsid w:val="00CF66A4"/>
   </w:style>
+  <w:style w:type="paragraph" w:customStyle="1" w:styleId="TableParagraph">
+    <w:name w:val="Table Paragraph"/>
+    <w:basedOn w:val="Normal"/>
+    <w:uiPriority w:val="1"/>
+    <w:qFormat/>
+    <w:rsid w:val="00943C83"/>
+    <w:pPr>
+      <w:widowControl w:val="0"/>
+      <w:autoSpaceDE w:val="0"/>
+      <w:autoSpaceDN w:val="0"/>
+      <w:spacing w:after="0" w:line="240" w:lineRule="auto"/>
+    </w:pPr>
+    <w:rPr>
+      <w:rFonts w:ascii="Calibri Light" w:eastAsia="Calibri Light" w:hAnsi="Calibri Light" w:cs="Calibri Light"/>
+      <w:lang w:bidi="en-US"/>
+    </w:rPr>
+  </w:style>
 </w:styles>
 </file>
 

</xml_diff>

<commit_message>
Updated Timetable and did some tasks in Object Oriented Programming Lab 01
</commit_message>
<xml_diff>
--- a/Object Oriented Programming/Object Oriented Programming Lab (CSL-210)/Lab No 01/Object Oriented Programming Lab 01.docx
+++ b/Object Oriented Programming/Object Oriented Programming Lab (CSL-210)/Lab No 01/Object Oriented Programming Lab 01.docx
@@ -24,6 +24,503 @@
       </w:r>
       <w:r>
         <w:rPr>
+          <w:rFonts w:ascii="Britannic Bold" w:hAnsi="Britannic Bold"/>
+          <w:sz w:val="32"/>
+          <w:szCs w:val="32"/>
+        </w:rPr>
+        <w:t xml:space="preserve"> </w:t>
+      </w:r>
+      <w:r>
+        <w:rPr>
+          <w:rFonts w:ascii="Times New Roman" w:hAnsi="Times New Roman" w:cs="Times New Roman"/>
+          <w:color w:val="000000" w:themeColor="text1"/>
+          <w:sz w:val="28"/>
+          <w:szCs w:val="28"/>
+        </w:rPr>
+        <w:t>Write a program that prints a mosque,</w:t>
+      </w:r>
+      <w:r>
+        <w:rPr>
+          <w:rFonts w:ascii="Times New Roman" w:hAnsi="Times New Roman" w:cs="Times New Roman"/>
+          <w:color w:val="000000" w:themeColor="text1"/>
+          <w:sz w:val="28"/>
+          <w:szCs w:val="28"/>
+        </w:rPr>
+        <w:t xml:space="preserve"> by using JAVA</w:t>
+      </w:r>
+      <w:r>
+        <w:rPr>
+          <w:rFonts w:ascii="Times New Roman" w:hAnsi="Times New Roman" w:cs="Times New Roman"/>
+          <w:color w:val="000000" w:themeColor="text1"/>
+          <w:sz w:val="28"/>
+          <w:szCs w:val="28"/>
+        </w:rPr>
+        <w:t>.</w:t>
+      </w:r>
+    </w:p>
+    <w:p>
+      <w:pPr>
+        <w:pStyle w:val="TableParagraph"/>
+        <w:spacing w:before="59" w:after="240"/>
+        <w:jc w:val="both"/>
+        <w:rPr>
+          <w:rFonts w:ascii="Britannic Bold" w:hAnsi="Britannic Bold"/>
+          <w:sz w:val="32"/>
+          <w:szCs w:val="32"/>
+        </w:rPr>
+      </w:pPr>
+      <w:r>
+        <w:rPr>
+          <w:rFonts w:ascii="Britannic Bold" w:hAnsi="Britannic Bold"/>
+          <w:sz w:val="32"/>
+          <w:szCs w:val="32"/>
+        </w:rPr>
+        <w:t>Code:</w:t>
+      </w:r>
+    </w:p>
+    <w:p>
+      <w:pPr>
+        <w:pStyle w:val="TableParagraph"/>
+        <w:spacing w:before="59" w:after="240"/>
+        <w:jc w:val="both"/>
+        <w:rPr>
+          <w:rFonts w:ascii="Britannic Bold" w:hAnsi="Britannic Bold"/>
+          <w:sz w:val="32"/>
+          <w:szCs w:val="32"/>
+        </w:rPr>
+      </w:pPr>
+    </w:p>
+    <w:p>
+      <w:pPr>
+        <w:pStyle w:val="TableParagraph"/>
+        <w:spacing w:before="59" w:after="240"/>
+        <w:jc w:val="both"/>
+        <w:rPr>
+          <w:rFonts w:ascii="Britannic Bold" w:hAnsi="Britannic Bold"/>
+          <w:sz w:val="32"/>
+          <w:szCs w:val="32"/>
+        </w:rPr>
+      </w:pPr>
+      <w:r>
+        <w:rPr>
+          <w:rFonts w:ascii="Britannic Bold" w:hAnsi="Britannic Bold"/>
+          <w:sz w:val="32"/>
+          <w:szCs w:val="32"/>
+        </w:rPr>
+        <w:t>Output:</w:t>
+      </w:r>
+    </w:p>
+    <w:p>
+      <w:pPr>
+        <w:pStyle w:val="TableParagraph"/>
+        <w:spacing w:before="59" w:after="240"/>
+        <w:jc w:val="both"/>
+        <w:rPr>
+          <w:rFonts w:ascii="Britannic Bold" w:hAnsi="Britannic Bold"/>
+          <w:sz w:val="32"/>
+          <w:szCs w:val="32"/>
+        </w:rPr>
+      </w:pPr>
+    </w:p>
+    <w:p>
+      <w:pPr>
+        <w:pStyle w:val="TableParagraph"/>
+        <w:spacing w:before="61"/>
+        <w:jc w:val="both"/>
+        <w:rPr>
+          <w:rFonts w:ascii="Times New Roman" w:hAnsi="Times New Roman" w:cs="Times New Roman"/>
+          <w:color w:val="000000" w:themeColor="text1"/>
+          <w:sz w:val="28"/>
+          <w:szCs w:val="28"/>
+        </w:rPr>
+      </w:pPr>
+      <w:r>
+        <w:rPr>
+          <w:rFonts w:ascii="Britannic Bold" w:hAnsi="Britannic Bold"/>
+          <w:sz w:val="32"/>
+          <w:szCs w:val="32"/>
+        </w:rPr>
+        <w:t>Task No 02:</w:t>
+      </w:r>
+      <w:r>
+        <w:rPr>
+          <w:rFonts w:ascii="Britannic Bold" w:hAnsi="Britannic Bold"/>
+          <w:sz w:val="32"/>
+          <w:szCs w:val="32"/>
+        </w:rPr>
+        <w:t xml:space="preserve"> </w:t>
+      </w:r>
+      <w:r>
+        <w:rPr>
+          <w:rFonts w:ascii="Times New Roman" w:hAnsi="Times New Roman" w:cs="Times New Roman"/>
+          <w:color w:val="000000" w:themeColor="text1"/>
+          <w:sz w:val="28"/>
+          <w:szCs w:val="28"/>
+        </w:rPr>
+        <w:t xml:space="preserve">Write a JAVA program, which receives the input of two integer numbers, operation (+, -, *, /, %, power, square-root, and factorial) and compute </w:t>
+      </w:r>
+      <w:r>
+        <w:rPr>
+          <w:rFonts w:ascii="Times New Roman" w:hAnsi="Times New Roman" w:cs="Times New Roman"/>
+          <w:color w:val="000000" w:themeColor="text1"/>
+          <w:sz w:val="28"/>
+          <w:szCs w:val="28"/>
+        </w:rPr>
+        <w:t>athematic</w:t>
+      </w:r>
+      <w:r>
+        <w:rPr>
+          <w:rFonts w:ascii="Times New Roman" w:hAnsi="Times New Roman" w:cs="Times New Roman"/>
+          <w:color w:val="000000" w:themeColor="text1"/>
+          <w:sz w:val="28"/>
+          <w:szCs w:val="28"/>
+        </w:rPr>
+        <w:t xml:space="preserve"> operations. Generate a menu for operations and ask user after every operation if they want to do another. (Hint use switch case)</w:t>
+      </w:r>
+    </w:p>
+    <w:p>
+      <w:pPr>
+        <w:pStyle w:val="TableParagraph"/>
+        <w:spacing w:before="59" w:after="240"/>
+        <w:jc w:val="both"/>
+        <w:rPr>
+          <w:rFonts w:ascii="Britannic Bold" w:hAnsi="Britannic Bold"/>
+          <w:sz w:val="32"/>
+          <w:szCs w:val="32"/>
+        </w:rPr>
+      </w:pPr>
+      <w:r>
+        <w:rPr>
+          <w:rFonts w:ascii="Britannic Bold" w:hAnsi="Britannic Bold"/>
+          <w:sz w:val="32"/>
+          <w:szCs w:val="32"/>
+        </w:rPr>
+        <w:t>Code:</w:t>
+      </w:r>
+    </w:p>
+    <w:p>
+      <w:pPr>
+        <w:pStyle w:val="TableParagraph"/>
+        <w:spacing w:before="59" w:after="240"/>
+        <w:jc w:val="both"/>
+        <w:rPr>
+          <w:rFonts w:ascii="Britannic Bold" w:hAnsi="Britannic Bold"/>
+          <w:sz w:val="32"/>
+          <w:szCs w:val="32"/>
+        </w:rPr>
+      </w:pPr>
+    </w:p>
+    <w:p>
+      <w:pPr>
+        <w:pStyle w:val="TableParagraph"/>
+        <w:spacing w:before="59" w:after="240"/>
+        <w:jc w:val="both"/>
+        <w:rPr>
+          <w:rFonts w:ascii="Britannic Bold" w:hAnsi="Britannic Bold"/>
+          <w:sz w:val="32"/>
+          <w:szCs w:val="32"/>
+        </w:rPr>
+      </w:pPr>
+      <w:r>
+        <w:rPr>
+          <w:rFonts w:ascii="Britannic Bold" w:hAnsi="Britannic Bold"/>
+          <w:sz w:val="32"/>
+          <w:szCs w:val="32"/>
+        </w:rPr>
+        <w:t>Output:</w:t>
+      </w:r>
+    </w:p>
+    <w:p>
+      <w:pPr>
+        <w:pStyle w:val="TableParagraph"/>
+        <w:spacing w:before="59" w:after="240"/>
+        <w:jc w:val="both"/>
+        <w:rPr>
+          <w:rFonts w:ascii="Britannic Bold" w:hAnsi="Britannic Bold"/>
+          <w:sz w:val="32"/>
+          <w:szCs w:val="32"/>
+        </w:rPr>
+      </w:pPr>
+    </w:p>
+    <w:p>
+      <w:pPr>
+        <w:pStyle w:val="TableParagraph"/>
+        <w:rPr>
+          <w:rFonts w:ascii="Times New Roman" w:hAnsi="Times New Roman" w:cs="Times New Roman"/>
+          <w:color w:val="000000" w:themeColor="text1"/>
+          <w:sz w:val="28"/>
+          <w:szCs w:val="28"/>
+        </w:rPr>
+      </w:pPr>
+      <w:r>
+        <w:rPr>
+          <w:rFonts w:ascii="Britannic Bold" w:hAnsi="Britannic Bold"/>
+          <w:sz w:val="32"/>
+          <w:szCs w:val="32"/>
+        </w:rPr>
+        <w:t>Task No 03:</w:t>
+      </w:r>
+      <w:r>
+        <w:rPr>
+          <w:rFonts w:ascii="Britannic Bold" w:hAnsi="Britannic Bold"/>
+          <w:sz w:val="32"/>
+          <w:szCs w:val="32"/>
+        </w:rPr>
+        <w:t xml:space="preserve"> </w:t>
+      </w:r>
+      <w:r>
+        <w:rPr>
+          <w:rFonts w:ascii="Times New Roman" w:hAnsi="Times New Roman" w:cs="Times New Roman"/>
+          <w:color w:val="000000" w:themeColor="text1"/>
+          <w:sz w:val="28"/>
+          <w:szCs w:val="28"/>
+        </w:rPr>
+        <w:t>Make a program in JAVA in which take no. of items, price of items and name of items as input from the user and give the discount according to the following conditions:</w:t>
+      </w:r>
+    </w:p>
+    <w:p>
+      <w:pPr>
+        <w:pStyle w:val="TableParagraph"/>
+        <w:numPr>
+          <w:ilvl w:val="0"/>
+          <w:numId w:val="5"/>
+        </w:numPr>
+        <w:tabs>
+          <w:tab w:val="left" w:pos="1253"/>
+        </w:tabs>
+        <w:spacing w:line="293" w:lineRule="exact"/>
+        <w:rPr>
+          <w:rFonts w:ascii="Times New Roman" w:hAnsi="Times New Roman" w:cs="Times New Roman"/>
+          <w:color w:val="000000" w:themeColor="text1"/>
+          <w:sz w:val="28"/>
+          <w:szCs w:val="28"/>
+        </w:rPr>
+      </w:pPr>
+      <w:r>
+        <w:rPr>
+          <w:rFonts w:ascii="Times New Roman" w:hAnsi="Times New Roman" w:cs="Times New Roman"/>
+          <w:color w:val="000000" w:themeColor="text1"/>
+          <w:sz w:val="28"/>
+          <w:szCs w:val="28"/>
+        </w:rPr>
+        <w:t>If from Bahria University give discount of</w:t>
+      </w:r>
+      <w:r>
+        <w:rPr>
+          <w:rFonts w:ascii="Times New Roman" w:hAnsi="Times New Roman" w:cs="Times New Roman"/>
+          <w:color w:val="000000" w:themeColor="text1"/>
+          <w:spacing w:val="-4"/>
+          <w:sz w:val="28"/>
+          <w:szCs w:val="28"/>
+        </w:rPr>
+        <w:t xml:space="preserve"> </w:t>
+      </w:r>
+      <w:r>
+        <w:rPr>
+          <w:rFonts w:ascii="Times New Roman" w:hAnsi="Times New Roman" w:cs="Times New Roman"/>
+          <w:color w:val="000000" w:themeColor="text1"/>
+          <w:sz w:val="28"/>
+          <w:szCs w:val="28"/>
+        </w:rPr>
+        <w:t>30%.</w:t>
+      </w:r>
+    </w:p>
+    <w:p>
+      <w:pPr>
+        <w:pStyle w:val="TableParagraph"/>
+        <w:numPr>
+          <w:ilvl w:val="0"/>
+          <w:numId w:val="5"/>
+        </w:numPr>
+        <w:tabs>
+          <w:tab w:val="left" w:pos="1253"/>
+        </w:tabs>
+        <w:ind w:right="90"/>
+        <w:rPr>
+          <w:rFonts w:ascii="Times New Roman" w:hAnsi="Times New Roman" w:cs="Times New Roman"/>
+          <w:color w:val="000000" w:themeColor="text1"/>
+          <w:sz w:val="28"/>
+          <w:szCs w:val="28"/>
+        </w:rPr>
+      </w:pPr>
+      <w:r>
+        <w:rPr>
+          <w:rFonts w:ascii="Times New Roman" w:hAnsi="Times New Roman" w:cs="Times New Roman"/>
+          <w:color w:val="000000" w:themeColor="text1"/>
+          <w:sz w:val="28"/>
+          <w:szCs w:val="28"/>
+        </w:rPr>
+        <w:t>Else if the total amount is greater than 50,000 and less than 100,000 give discounts of</w:t>
+      </w:r>
+      <w:r>
+        <w:rPr>
+          <w:rFonts w:ascii="Times New Roman" w:hAnsi="Times New Roman" w:cs="Times New Roman"/>
+          <w:color w:val="000000" w:themeColor="text1"/>
+          <w:spacing w:val="-3"/>
+          <w:sz w:val="28"/>
+          <w:szCs w:val="28"/>
+        </w:rPr>
+        <w:t xml:space="preserve"> </w:t>
+      </w:r>
+      <w:r>
+        <w:rPr>
+          <w:rFonts w:ascii="Times New Roman" w:hAnsi="Times New Roman" w:cs="Times New Roman"/>
+          <w:color w:val="000000" w:themeColor="text1"/>
+          <w:sz w:val="28"/>
+          <w:szCs w:val="28"/>
+        </w:rPr>
+        <w:t>20%.</w:t>
+      </w:r>
+    </w:p>
+    <w:p>
+      <w:pPr>
+        <w:pStyle w:val="TableParagraph"/>
+        <w:numPr>
+          <w:ilvl w:val="0"/>
+          <w:numId w:val="5"/>
+        </w:numPr>
+        <w:tabs>
+          <w:tab w:val="left" w:pos="1253"/>
+        </w:tabs>
+        <w:ind w:right="90"/>
+        <w:rPr>
+          <w:rFonts w:ascii="Times New Roman" w:hAnsi="Times New Roman" w:cs="Times New Roman"/>
+          <w:color w:val="000000" w:themeColor="text1"/>
+          <w:sz w:val="28"/>
+          <w:szCs w:val="28"/>
+        </w:rPr>
+      </w:pPr>
+      <w:r>
+        <w:rPr>
+          <w:rFonts w:ascii="Times New Roman" w:hAnsi="Times New Roman" w:cs="Times New Roman"/>
+          <w:color w:val="000000" w:themeColor="text1"/>
+          <w:sz w:val="28"/>
+          <w:szCs w:val="28"/>
+        </w:rPr>
+        <w:t>Else if the total amount is greater than 100,000 give discounts of</w:t>
+      </w:r>
+      <w:r>
+        <w:rPr>
+          <w:rFonts w:ascii="Times New Roman" w:hAnsi="Times New Roman" w:cs="Times New Roman"/>
+          <w:color w:val="000000" w:themeColor="text1"/>
+          <w:spacing w:val="-11"/>
+          <w:sz w:val="28"/>
+          <w:szCs w:val="28"/>
+        </w:rPr>
+        <w:t xml:space="preserve"> </w:t>
+      </w:r>
+      <w:r>
+        <w:rPr>
+          <w:rFonts w:ascii="Times New Roman" w:hAnsi="Times New Roman" w:cs="Times New Roman"/>
+          <w:color w:val="000000" w:themeColor="text1"/>
+          <w:sz w:val="28"/>
+          <w:szCs w:val="28"/>
+        </w:rPr>
+        <w:t>30%.</w:t>
+      </w:r>
+    </w:p>
+    <w:p>
+      <w:pPr>
+        <w:pStyle w:val="TableParagraph"/>
+        <w:spacing w:before="59" w:after="240"/>
+        <w:jc w:val="both"/>
+        <w:rPr>
+          <w:rFonts w:ascii="Britannic Bold" w:hAnsi="Britannic Bold"/>
+          <w:sz w:val="32"/>
+          <w:szCs w:val="32"/>
+        </w:rPr>
+      </w:pPr>
+      <w:r>
+        <w:rPr>
+          <w:rFonts w:ascii="Britannic Bold" w:hAnsi="Britannic Bold"/>
+          <w:sz w:val="32"/>
+          <w:szCs w:val="32"/>
+        </w:rPr>
+        <w:t>Code:</w:t>
+      </w:r>
+    </w:p>
+    <w:p>
+      <w:pPr>
+        <w:pStyle w:val="TableParagraph"/>
+        <w:spacing w:before="59" w:after="240"/>
+        <w:jc w:val="both"/>
+        <w:rPr>
+          <w:rFonts w:ascii="Britannic Bold" w:hAnsi="Britannic Bold"/>
+          <w:sz w:val="32"/>
+          <w:szCs w:val="32"/>
+        </w:rPr>
+      </w:pPr>
+    </w:p>
+    <w:p>
+      <w:pPr>
+        <w:pStyle w:val="TableParagraph"/>
+        <w:spacing w:before="59" w:after="240"/>
+        <w:jc w:val="both"/>
+        <w:rPr>
+          <w:rFonts w:ascii="Britannic Bold" w:hAnsi="Britannic Bold"/>
+          <w:sz w:val="32"/>
+          <w:szCs w:val="32"/>
+        </w:rPr>
+      </w:pPr>
+      <w:r>
+        <w:rPr>
+          <w:rFonts w:ascii="Britannic Bold" w:hAnsi="Britannic Bold"/>
+          <w:sz w:val="32"/>
+          <w:szCs w:val="32"/>
+        </w:rPr>
+        <w:t>Output:</w:t>
+      </w:r>
+    </w:p>
+    <w:p>
+      <w:pPr>
+        <w:pStyle w:val="TableParagraph"/>
+        <w:spacing w:before="59" w:after="240"/>
+        <w:jc w:val="both"/>
+        <w:rPr>
+          <w:rFonts w:ascii="Britannic Bold" w:hAnsi="Britannic Bold"/>
+          <w:sz w:val="32"/>
+          <w:szCs w:val="32"/>
+        </w:rPr>
+      </w:pPr>
+    </w:p>
+    <w:p>
+      <w:pPr>
+        <w:pStyle w:val="TableParagraph"/>
+        <w:spacing w:before="59" w:after="240"/>
+        <w:jc w:val="both"/>
+        <w:rPr>
+          <w:rFonts w:ascii="Times New Roman" w:hAnsi="Times New Roman" w:cs="Times New Roman"/>
+          <w:color w:val="000000" w:themeColor="text1"/>
+          <w:sz w:val="28"/>
+          <w:szCs w:val="28"/>
+        </w:rPr>
+      </w:pPr>
+      <w:r>
+        <w:rPr>
+          <w:rFonts w:ascii="Britannic Bold" w:hAnsi="Britannic Bold"/>
+          <w:sz w:val="32"/>
+          <w:szCs w:val="32"/>
+        </w:rPr>
+        <w:t>Task No 0</w:t>
+      </w:r>
+      <w:r>
+        <w:rPr>
+          <w:rFonts w:ascii="Britannic Bold" w:hAnsi="Britannic Bold"/>
+          <w:sz w:val="32"/>
+          <w:szCs w:val="32"/>
+        </w:rPr>
+        <w:t>4</w:t>
+      </w:r>
+      <w:r>
+        <w:rPr>
+          <w:rFonts w:ascii="Britannic Bold" w:hAnsi="Britannic Bold"/>
+          <w:sz w:val="32"/>
+          <w:szCs w:val="32"/>
+        </w:rPr>
+        <w:t>:</w:t>
+      </w:r>
+      <w:r>
+        <w:rPr>
           <w:sz w:val="24"/>
         </w:rPr>
         <w:t xml:space="preserve"> </w:t>
@@ -53,25 +550,7 @@
           <w:sz w:val="28"/>
           <w:szCs w:val="28"/>
         </w:rPr>
-        <w:t xml:space="preserve">formulae using </w:t>
-      </w:r>
-      <w:r>
-        <w:rPr>
-          <w:rFonts w:ascii="Times New Roman" w:hAnsi="Times New Roman" w:cs="Times New Roman"/>
-          <w:color w:val="000000" w:themeColor="text1"/>
-          <w:sz w:val="28"/>
-          <w:szCs w:val="28"/>
-        </w:rPr>
-        <w:t>methods</w:t>
-      </w:r>
-      <w:r>
-        <w:rPr>
-          <w:rFonts w:ascii="Times New Roman" w:hAnsi="Times New Roman" w:cs="Times New Roman"/>
-          <w:color w:val="000000" w:themeColor="text1"/>
-          <w:sz w:val="28"/>
-          <w:szCs w:val="28"/>
-        </w:rPr>
-        <w:t>.</w:t>
+        <w:t>formulae using methods.</w:t>
       </w:r>
     </w:p>
     <w:p>
@@ -125,28 +604,6 @@
         </w:rPr>
         <w:t>P = 0.37m(T + 460)/V</w:t>
       </w:r>
-      <w:r>
-        <w:rPr>
-          <w:rFonts w:ascii="Times New Roman" w:hAnsi="Times New Roman" w:cs="Times New Roman"/>
-          <w:b/>
-          <w:bCs/>
-          <w:color w:val="000000" w:themeColor="text1"/>
-          <w:sz w:val="28"/>
-          <w:szCs w:val="28"/>
-        </w:rPr>
-        <w:t>*</w:t>
-      </w:r>
-      <w:r>
-        <w:rPr>
-          <w:rFonts w:ascii="Times New Roman" w:hAnsi="Times New Roman" w:cs="Times New Roman"/>
-          <w:b/>
-          <w:bCs/>
-          <w:color w:val="000000" w:themeColor="text1"/>
-          <w:sz w:val="28"/>
-          <w:szCs w:val="28"/>
-        </w:rPr>
-        <w:t>P</w:t>
-      </w:r>
     </w:p>
     <w:p>
       <w:pPr>
@@ -168,6 +625,7 @@
           <w:sz w:val="28"/>
           <w:szCs w:val="28"/>
         </w:rPr>
+        <w:lastRenderedPageBreak/>
         <w:t>Where:</w:t>
       </w:r>
     </w:p>
@@ -334,7 +792,7 @@
     </w:p>
     <w:p>
       <w:pPr>
-        <w:spacing w:after="0"/>
+        <w:spacing w:line="240" w:lineRule="auto"/>
         <w:rPr>
           <w:rFonts w:ascii="Britannic Bold" w:hAnsi="Britannic Bold"/>
           <w:sz w:val="28"/>
@@ -360,40 +818,2389 @@
     </w:p>
     <w:p>
       <w:pPr>
-        <w:spacing w:after="0"/>
+        <w:shd w:val="clear" w:color="auto" w:fill="FFFFFF"/>
+        <w:spacing w:after="0" w:line="240" w:lineRule="auto"/>
+        <w:rPr>
+          <w:rFonts w:ascii="Consolas" w:eastAsia="Times New Roman" w:hAnsi="Consolas" w:cs="Times New Roman"/>
+          <w:color w:val="000000"/>
+          <w:sz w:val="21"/>
+          <w:szCs w:val="21"/>
+        </w:rPr>
+      </w:pPr>
+      <w:r>
+        <w:rPr>
+          <w:rFonts w:ascii="Consolas" w:eastAsia="Times New Roman" w:hAnsi="Consolas" w:cs="Times New Roman"/>
+          <w:color w:val="0000FF"/>
+          <w:sz w:val="21"/>
+          <w:szCs w:val="21"/>
+        </w:rPr>
+        <w:t>package</w:t>
+      </w:r>
+      <w:r>
+        <w:rPr>
+          <w:rFonts w:ascii="Consolas" w:eastAsia="Times New Roman" w:hAnsi="Consolas" w:cs="Times New Roman"/>
+          <w:color w:val="000000"/>
+          <w:sz w:val="21"/>
+          <w:szCs w:val="21"/>
+        </w:rPr>
+        <w:t xml:space="preserve"> </w:t>
+      </w:r>
+      <w:proofErr w:type="gramStart"/>
+      <w:r>
+        <w:rPr>
+          <w:rFonts w:ascii="Consolas" w:eastAsia="Times New Roman" w:hAnsi="Consolas" w:cs="Times New Roman"/>
+          <w:color w:val="267F99"/>
+          <w:sz w:val="21"/>
+          <w:szCs w:val="21"/>
+        </w:rPr>
+        <w:t>com</w:t>
+      </w:r>
+      <w:r>
+        <w:rPr>
+          <w:rFonts w:ascii="Consolas" w:eastAsia="Times New Roman" w:hAnsi="Consolas" w:cs="Times New Roman"/>
+          <w:color w:val="000000"/>
+          <w:sz w:val="21"/>
+          <w:szCs w:val="21"/>
+        </w:rPr>
+        <w:t>.</w:t>
+      </w:r>
+      <w:r>
+        <w:rPr>
+          <w:rFonts w:ascii="Consolas" w:eastAsia="Times New Roman" w:hAnsi="Consolas" w:cs="Times New Roman"/>
+          <w:color w:val="267F99"/>
+          <w:sz w:val="21"/>
+          <w:szCs w:val="21"/>
+        </w:rPr>
+        <w:t>mycompany</w:t>
+      </w:r>
+      <w:proofErr w:type="gramEnd"/>
+      <w:r>
+        <w:rPr>
+          <w:rFonts w:ascii="Consolas" w:eastAsia="Times New Roman" w:hAnsi="Consolas" w:cs="Times New Roman"/>
+          <w:color w:val="000000"/>
+          <w:sz w:val="21"/>
+          <w:szCs w:val="21"/>
+        </w:rPr>
+        <w:t>.</w:t>
+      </w:r>
+      <w:r>
+        <w:rPr>
+          <w:rFonts w:ascii="Consolas" w:eastAsia="Times New Roman" w:hAnsi="Consolas" w:cs="Times New Roman"/>
+          <w:color w:val="267F99"/>
+          <w:sz w:val="21"/>
+          <w:szCs w:val="21"/>
+        </w:rPr>
+        <w:t>lab01basicsyntax</w:t>
+      </w:r>
+      <w:r>
+        <w:rPr>
+          <w:rFonts w:ascii="Consolas" w:eastAsia="Times New Roman" w:hAnsi="Consolas" w:cs="Times New Roman"/>
+          <w:color w:val="000000"/>
+          <w:sz w:val="21"/>
+          <w:szCs w:val="21"/>
+        </w:rPr>
+        <w:t>;</w:t>
+      </w:r>
+    </w:p>
+    <w:p>
+      <w:pPr>
+        <w:shd w:val="clear" w:color="auto" w:fill="FFFFFF"/>
+        <w:spacing w:after="0" w:line="240" w:lineRule="auto"/>
+        <w:rPr>
+          <w:rFonts w:ascii="Consolas" w:eastAsia="Times New Roman" w:hAnsi="Consolas" w:cs="Times New Roman"/>
+          <w:color w:val="000000"/>
+          <w:sz w:val="21"/>
+          <w:szCs w:val="21"/>
+        </w:rPr>
+      </w:pPr>
+    </w:p>
+    <w:p>
+      <w:pPr>
+        <w:shd w:val="clear" w:color="auto" w:fill="FFFFFF"/>
+        <w:spacing w:after="0" w:line="240" w:lineRule="auto"/>
+        <w:rPr>
+          <w:rFonts w:ascii="Consolas" w:eastAsia="Times New Roman" w:hAnsi="Consolas" w:cs="Times New Roman"/>
+          <w:color w:val="000000"/>
+          <w:sz w:val="21"/>
+          <w:szCs w:val="21"/>
+        </w:rPr>
+      </w:pPr>
+      <w:r>
+        <w:rPr>
+          <w:rFonts w:ascii="Consolas" w:eastAsia="Times New Roman" w:hAnsi="Consolas" w:cs="Times New Roman"/>
+          <w:color w:val="0000FF"/>
+          <w:sz w:val="21"/>
+          <w:szCs w:val="21"/>
+        </w:rPr>
+        <w:t>import</w:t>
+      </w:r>
+      <w:r>
+        <w:rPr>
+          <w:rFonts w:ascii="Consolas" w:eastAsia="Times New Roman" w:hAnsi="Consolas" w:cs="Times New Roman"/>
+          <w:color w:val="000000"/>
+          <w:sz w:val="21"/>
+          <w:szCs w:val="21"/>
+        </w:rPr>
+        <w:t xml:space="preserve"> </w:t>
+      </w:r>
+      <w:proofErr w:type="spellStart"/>
+      <w:proofErr w:type="gramStart"/>
+      <w:r>
+        <w:rPr>
+          <w:rFonts w:ascii="Consolas" w:eastAsia="Times New Roman" w:hAnsi="Consolas" w:cs="Times New Roman"/>
+          <w:color w:val="267F99"/>
+          <w:sz w:val="21"/>
+          <w:szCs w:val="21"/>
+        </w:rPr>
+        <w:t>java</w:t>
+      </w:r>
+      <w:r>
+        <w:rPr>
+          <w:rFonts w:ascii="Consolas" w:eastAsia="Times New Roman" w:hAnsi="Consolas" w:cs="Times New Roman"/>
+          <w:color w:val="000000"/>
+          <w:sz w:val="21"/>
+          <w:szCs w:val="21"/>
+        </w:rPr>
+        <w:t>.</w:t>
+      </w:r>
+      <w:r>
+        <w:rPr>
+          <w:rFonts w:ascii="Consolas" w:eastAsia="Times New Roman" w:hAnsi="Consolas" w:cs="Times New Roman"/>
+          <w:color w:val="267F99"/>
+          <w:sz w:val="21"/>
+          <w:szCs w:val="21"/>
+        </w:rPr>
+        <w:t>util</w:t>
+      </w:r>
+      <w:proofErr w:type="gramEnd"/>
+      <w:r>
+        <w:rPr>
+          <w:rFonts w:ascii="Consolas" w:eastAsia="Times New Roman" w:hAnsi="Consolas" w:cs="Times New Roman"/>
+          <w:color w:val="000000"/>
+          <w:sz w:val="21"/>
+          <w:szCs w:val="21"/>
+        </w:rPr>
+        <w:t>.</w:t>
+      </w:r>
+      <w:r>
+        <w:rPr>
+          <w:rFonts w:ascii="Consolas" w:eastAsia="Times New Roman" w:hAnsi="Consolas" w:cs="Times New Roman"/>
+          <w:color w:val="267F99"/>
+          <w:sz w:val="21"/>
+          <w:szCs w:val="21"/>
+        </w:rPr>
+        <w:t>Scanner</w:t>
+      </w:r>
+      <w:proofErr w:type="spellEnd"/>
+      <w:r>
+        <w:rPr>
+          <w:rFonts w:ascii="Consolas" w:eastAsia="Times New Roman" w:hAnsi="Consolas" w:cs="Times New Roman"/>
+          <w:color w:val="000000"/>
+          <w:sz w:val="21"/>
+          <w:szCs w:val="21"/>
+        </w:rPr>
+        <w:t>;</w:t>
+      </w:r>
+    </w:p>
+    <w:p>
+      <w:pPr>
+        <w:shd w:val="clear" w:color="auto" w:fill="FFFFFF"/>
+        <w:spacing w:after="0" w:line="240" w:lineRule="auto"/>
+        <w:rPr>
+          <w:rFonts w:ascii="Consolas" w:eastAsia="Times New Roman" w:hAnsi="Consolas" w:cs="Times New Roman"/>
+          <w:color w:val="000000"/>
+          <w:sz w:val="21"/>
+          <w:szCs w:val="21"/>
+        </w:rPr>
+      </w:pPr>
+    </w:p>
+    <w:p>
+      <w:pPr>
+        <w:shd w:val="clear" w:color="auto" w:fill="FFFFFF"/>
+        <w:spacing w:after="0" w:line="240" w:lineRule="auto"/>
+        <w:rPr>
+          <w:rFonts w:ascii="Consolas" w:eastAsia="Times New Roman" w:hAnsi="Consolas" w:cs="Times New Roman"/>
+          <w:color w:val="000000"/>
+          <w:sz w:val="21"/>
+          <w:szCs w:val="21"/>
+        </w:rPr>
+      </w:pPr>
+      <w:r>
+        <w:rPr>
+          <w:rFonts w:ascii="Consolas" w:eastAsia="Times New Roman" w:hAnsi="Consolas" w:cs="Times New Roman"/>
+          <w:color w:val="0000FF"/>
+          <w:sz w:val="21"/>
+          <w:szCs w:val="21"/>
+        </w:rPr>
+        <w:t>public</w:t>
+      </w:r>
+      <w:r>
+        <w:rPr>
+          <w:rFonts w:ascii="Consolas" w:eastAsia="Times New Roman" w:hAnsi="Consolas" w:cs="Times New Roman"/>
+          <w:color w:val="000000"/>
+          <w:sz w:val="21"/>
+          <w:szCs w:val="21"/>
+        </w:rPr>
+        <w:t xml:space="preserve"> </w:t>
+      </w:r>
+      <w:r>
+        <w:rPr>
+          <w:rFonts w:ascii="Consolas" w:eastAsia="Times New Roman" w:hAnsi="Consolas" w:cs="Times New Roman"/>
+          <w:color w:val="0000FF"/>
+          <w:sz w:val="21"/>
+          <w:szCs w:val="21"/>
+        </w:rPr>
+        <w:t>class</w:t>
+      </w:r>
+      <w:r>
+        <w:rPr>
+          <w:rFonts w:ascii="Consolas" w:eastAsia="Times New Roman" w:hAnsi="Consolas" w:cs="Times New Roman"/>
+          <w:color w:val="000000"/>
+          <w:sz w:val="21"/>
+          <w:szCs w:val="21"/>
+        </w:rPr>
+        <w:t xml:space="preserve"> </w:t>
+      </w:r>
+      <w:r>
+        <w:rPr>
+          <w:rFonts w:ascii="Consolas" w:eastAsia="Times New Roman" w:hAnsi="Consolas" w:cs="Times New Roman"/>
+          <w:color w:val="267F99"/>
+          <w:sz w:val="21"/>
+          <w:szCs w:val="21"/>
+        </w:rPr>
+        <w:t>Lab01BasicSyntax</w:t>
+      </w:r>
+      <w:r>
+        <w:rPr>
+          <w:rFonts w:ascii="Consolas" w:eastAsia="Times New Roman" w:hAnsi="Consolas" w:cs="Times New Roman"/>
+          <w:color w:val="000000"/>
+          <w:sz w:val="21"/>
+          <w:szCs w:val="21"/>
+        </w:rPr>
+        <w:t xml:space="preserve"> {</w:t>
+      </w:r>
+    </w:p>
+    <w:p>
+      <w:pPr>
+        <w:shd w:val="clear" w:color="auto" w:fill="FFFFFF"/>
+        <w:spacing w:after="0" w:line="240" w:lineRule="auto"/>
+        <w:rPr>
+          <w:rFonts w:ascii="Consolas" w:eastAsia="Times New Roman" w:hAnsi="Consolas" w:cs="Times New Roman"/>
+          <w:color w:val="000000"/>
+          <w:sz w:val="21"/>
+          <w:szCs w:val="21"/>
+        </w:rPr>
+      </w:pPr>
+    </w:p>
+    <w:p>
+      <w:pPr>
+        <w:shd w:val="clear" w:color="auto" w:fill="FFFFFF"/>
+        <w:spacing w:after="0" w:line="240" w:lineRule="auto"/>
+        <w:rPr>
+          <w:rFonts w:ascii="Consolas" w:eastAsia="Times New Roman" w:hAnsi="Consolas" w:cs="Times New Roman"/>
+          <w:color w:val="000000"/>
+          <w:sz w:val="21"/>
+          <w:szCs w:val="21"/>
+        </w:rPr>
+      </w:pPr>
+      <w:r>
+        <w:rPr>
+          <w:rFonts w:ascii="Consolas" w:eastAsia="Times New Roman" w:hAnsi="Consolas" w:cs="Times New Roman"/>
+          <w:color w:val="000000"/>
+          <w:sz w:val="21"/>
+          <w:szCs w:val="21"/>
+        </w:rPr>
+        <w:t xml:space="preserve">    </w:t>
+      </w:r>
+      <w:r>
+        <w:rPr>
+          <w:rFonts w:ascii="Consolas" w:eastAsia="Times New Roman" w:hAnsi="Consolas" w:cs="Times New Roman"/>
+          <w:color w:val="0000FF"/>
+          <w:sz w:val="21"/>
+          <w:szCs w:val="21"/>
+        </w:rPr>
+        <w:t>static</w:t>
+      </w:r>
+      <w:r>
+        <w:rPr>
+          <w:rFonts w:ascii="Consolas" w:eastAsia="Times New Roman" w:hAnsi="Consolas" w:cs="Times New Roman"/>
+          <w:color w:val="000000"/>
+          <w:sz w:val="21"/>
+          <w:szCs w:val="21"/>
+        </w:rPr>
+        <w:t xml:space="preserve"> </w:t>
+      </w:r>
+      <w:r>
+        <w:rPr>
+          <w:rFonts w:ascii="Consolas" w:eastAsia="Times New Roman" w:hAnsi="Consolas" w:cs="Times New Roman"/>
+          <w:color w:val="267F99"/>
+          <w:sz w:val="21"/>
+          <w:szCs w:val="21"/>
+        </w:rPr>
+        <w:t>double</w:t>
+      </w:r>
+      <w:r>
+        <w:rPr>
+          <w:rFonts w:ascii="Consolas" w:eastAsia="Times New Roman" w:hAnsi="Consolas" w:cs="Times New Roman"/>
+          <w:color w:val="000000"/>
+          <w:sz w:val="21"/>
+          <w:szCs w:val="21"/>
+        </w:rPr>
+        <w:t xml:space="preserve"> </w:t>
+      </w:r>
+      <w:proofErr w:type="spellStart"/>
+      <w:proofErr w:type="gramStart"/>
+      <w:r>
+        <w:rPr>
+          <w:rFonts w:ascii="Consolas" w:eastAsia="Times New Roman" w:hAnsi="Consolas" w:cs="Times New Roman"/>
+          <w:color w:val="795E26"/>
+          <w:sz w:val="21"/>
+          <w:szCs w:val="21"/>
+        </w:rPr>
+        <w:t>calculatePressure</w:t>
+      </w:r>
+      <w:proofErr w:type="spellEnd"/>
+      <w:r>
+        <w:rPr>
+          <w:rFonts w:ascii="Consolas" w:eastAsia="Times New Roman" w:hAnsi="Consolas" w:cs="Times New Roman"/>
+          <w:color w:val="000000"/>
+          <w:sz w:val="21"/>
+          <w:szCs w:val="21"/>
+        </w:rPr>
+        <w:t>(</w:t>
+      </w:r>
+      <w:proofErr w:type="gramEnd"/>
+      <w:r>
+        <w:rPr>
+          <w:rFonts w:ascii="Consolas" w:eastAsia="Times New Roman" w:hAnsi="Consolas" w:cs="Times New Roman"/>
+          <w:color w:val="267F99"/>
+          <w:sz w:val="21"/>
+          <w:szCs w:val="21"/>
+        </w:rPr>
+        <w:t>double</w:t>
+      </w:r>
+      <w:r>
+        <w:rPr>
+          <w:rFonts w:ascii="Consolas" w:eastAsia="Times New Roman" w:hAnsi="Consolas" w:cs="Times New Roman"/>
+          <w:color w:val="000000"/>
+          <w:sz w:val="21"/>
+          <w:szCs w:val="21"/>
+        </w:rPr>
+        <w:t xml:space="preserve"> </w:t>
+      </w:r>
+      <w:r>
+        <w:rPr>
+          <w:rFonts w:ascii="Consolas" w:eastAsia="Times New Roman" w:hAnsi="Consolas" w:cs="Times New Roman"/>
+          <w:color w:val="001080"/>
+          <w:sz w:val="21"/>
+          <w:szCs w:val="21"/>
+        </w:rPr>
+        <w:t>m</w:t>
+      </w:r>
+      <w:r>
+        <w:rPr>
+          <w:rFonts w:ascii="Consolas" w:eastAsia="Times New Roman" w:hAnsi="Consolas" w:cs="Times New Roman"/>
+          <w:color w:val="000000"/>
+          <w:sz w:val="21"/>
+          <w:szCs w:val="21"/>
+        </w:rPr>
+        <w:t xml:space="preserve">, </w:t>
+      </w:r>
+      <w:r>
+        <w:rPr>
+          <w:rFonts w:ascii="Consolas" w:eastAsia="Times New Roman" w:hAnsi="Consolas" w:cs="Times New Roman"/>
+          <w:color w:val="267F99"/>
+          <w:sz w:val="21"/>
+          <w:szCs w:val="21"/>
+        </w:rPr>
+        <w:t>double</w:t>
+      </w:r>
+      <w:r>
+        <w:rPr>
+          <w:rFonts w:ascii="Consolas" w:eastAsia="Times New Roman" w:hAnsi="Consolas" w:cs="Times New Roman"/>
+          <w:color w:val="000000"/>
+          <w:sz w:val="21"/>
+          <w:szCs w:val="21"/>
+        </w:rPr>
+        <w:t xml:space="preserve"> </w:t>
+      </w:r>
+      <w:r>
+        <w:rPr>
+          <w:rFonts w:ascii="Consolas" w:eastAsia="Times New Roman" w:hAnsi="Consolas" w:cs="Times New Roman"/>
+          <w:color w:val="001080"/>
+          <w:sz w:val="21"/>
+          <w:szCs w:val="21"/>
+        </w:rPr>
+        <w:t>t</w:t>
+      </w:r>
+      <w:r>
+        <w:rPr>
+          <w:rFonts w:ascii="Consolas" w:eastAsia="Times New Roman" w:hAnsi="Consolas" w:cs="Times New Roman"/>
+          <w:color w:val="000000"/>
+          <w:sz w:val="21"/>
+          <w:szCs w:val="21"/>
+        </w:rPr>
+        <w:t xml:space="preserve">, </w:t>
+      </w:r>
+      <w:r>
+        <w:rPr>
+          <w:rFonts w:ascii="Consolas" w:eastAsia="Times New Roman" w:hAnsi="Consolas" w:cs="Times New Roman"/>
+          <w:color w:val="267F99"/>
+          <w:sz w:val="21"/>
+          <w:szCs w:val="21"/>
+        </w:rPr>
+        <w:t>double</w:t>
+      </w:r>
+      <w:r>
+        <w:rPr>
+          <w:rFonts w:ascii="Consolas" w:eastAsia="Times New Roman" w:hAnsi="Consolas" w:cs="Times New Roman"/>
+          <w:color w:val="000000"/>
+          <w:sz w:val="21"/>
+          <w:szCs w:val="21"/>
+        </w:rPr>
+        <w:t xml:space="preserve"> </w:t>
+      </w:r>
+      <w:r>
+        <w:rPr>
+          <w:rFonts w:ascii="Consolas" w:eastAsia="Times New Roman" w:hAnsi="Consolas" w:cs="Times New Roman"/>
+          <w:color w:val="001080"/>
+          <w:sz w:val="21"/>
+          <w:szCs w:val="21"/>
+        </w:rPr>
+        <w:t>v</w:t>
+      </w:r>
+      <w:r>
+        <w:rPr>
+          <w:rFonts w:ascii="Consolas" w:eastAsia="Times New Roman" w:hAnsi="Consolas" w:cs="Times New Roman"/>
+          <w:color w:val="000000"/>
+          <w:sz w:val="21"/>
+          <w:szCs w:val="21"/>
+        </w:rPr>
+        <w:t>) {</w:t>
+      </w:r>
+    </w:p>
+    <w:p>
+      <w:pPr>
+        <w:shd w:val="clear" w:color="auto" w:fill="FFFFFF"/>
+        <w:spacing w:after="0" w:line="240" w:lineRule="auto"/>
+        <w:rPr>
+          <w:rFonts w:ascii="Consolas" w:eastAsia="Times New Roman" w:hAnsi="Consolas" w:cs="Times New Roman"/>
+          <w:color w:val="000000"/>
+          <w:sz w:val="21"/>
+          <w:szCs w:val="21"/>
+        </w:rPr>
+      </w:pPr>
+      <w:r>
+        <w:rPr>
+          <w:rFonts w:ascii="Consolas" w:eastAsia="Times New Roman" w:hAnsi="Consolas" w:cs="Times New Roman"/>
+          <w:color w:val="000000"/>
+          <w:sz w:val="21"/>
+          <w:szCs w:val="21"/>
+        </w:rPr>
+        <w:t xml:space="preserve">        </w:t>
+      </w:r>
+      <w:r>
+        <w:rPr>
+          <w:rFonts w:ascii="Consolas" w:eastAsia="Times New Roman" w:hAnsi="Consolas" w:cs="Times New Roman"/>
+          <w:color w:val="267F99"/>
+          <w:sz w:val="21"/>
+          <w:szCs w:val="21"/>
+        </w:rPr>
+        <w:t>double</w:t>
+      </w:r>
+      <w:r>
+        <w:rPr>
+          <w:rFonts w:ascii="Consolas" w:eastAsia="Times New Roman" w:hAnsi="Consolas" w:cs="Times New Roman"/>
+          <w:color w:val="000000"/>
+          <w:sz w:val="21"/>
+          <w:szCs w:val="21"/>
+        </w:rPr>
+        <w:t xml:space="preserve"> </w:t>
+      </w:r>
+      <w:r>
+        <w:rPr>
+          <w:rFonts w:ascii="Consolas" w:eastAsia="Times New Roman" w:hAnsi="Consolas" w:cs="Times New Roman"/>
+          <w:color w:val="001080"/>
+          <w:sz w:val="21"/>
+          <w:szCs w:val="21"/>
+        </w:rPr>
+        <w:t>a</w:t>
+      </w:r>
+      <w:r>
+        <w:rPr>
+          <w:rFonts w:ascii="Consolas" w:eastAsia="Times New Roman" w:hAnsi="Consolas" w:cs="Times New Roman"/>
+          <w:color w:val="000000"/>
+          <w:sz w:val="21"/>
+          <w:szCs w:val="21"/>
+        </w:rPr>
+        <w:t xml:space="preserve">, </w:t>
+      </w:r>
+      <w:r>
+        <w:rPr>
+          <w:rFonts w:ascii="Consolas" w:eastAsia="Times New Roman" w:hAnsi="Consolas" w:cs="Times New Roman"/>
+          <w:color w:val="001080"/>
+          <w:sz w:val="21"/>
+          <w:szCs w:val="21"/>
+        </w:rPr>
+        <w:t>b</w:t>
+      </w:r>
+      <w:r>
+        <w:rPr>
+          <w:rFonts w:ascii="Consolas" w:eastAsia="Times New Roman" w:hAnsi="Consolas" w:cs="Times New Roman"/>
+          <w:color w:val="000000"/>
+          <w:sz w:val="21"/>
+          <w:szCs w:val="21"/>
+        </w:rPr>
+        <w:t xml:space="preserve">, </w:t>
+      </w:r>
+      <w:proofErr w:type="gramStart"/>
+      <w:r>
+        <w:rPr>
+          <w:rFonts w:ascii="Consolas" w:eastAsia="Times New Roman" w:hAnsi="Consolas" w:cs="Times New Roman"/>
+          <w:color w:val="001080"/>
+          <w:sz w:val="21"/>
+          <w:szCs w:val="21"/>
+        </w:rPr>
+        <w:t>p</w:t>
+      </w:r>
+      <w:r>
+        <w:rPr>
+          <w:rFonts w:ascii="Consolas" w:eastAsia="Times New Roman" w:hAnsi="Consolas" w:cs="Times New Roman"/>
+          <w:color w:val="000000"/>
+          <w:sz w:val="21"/>
+          <w:szCs w:val="21"/>
+        </w:rPr>
+        <w:t>;</w:t>
+      </w:r>
+      <w:proofErr w:type="gramEnd"/>
+    </w:p>
+    <w:p>
+      <w:pPr>
+        <w:shd w:val="clear" w:color="auto" w:fill="FFFFFF"/>
+        <w:spacing w:after="0" w:line="240" w:lineRule="auto"/>
+        <w:rPr>
+          <w:rFonts w:ascii="Consolas" w:eastAsia="Times New Roman" w:hAnsi="Consolas" w:cs="Times New Roman"/>
+          <w:color w:val="000000"/>
+          <w:sz w:val="21"/>
+          <w:szCs w:val="21"/>
+        </w:rPr>
+      </w:pPr>
+    </w:p>
+    <w:p>
+      <w:pPr>
+        <w:shd w:val="clear" w:color="auto" w:fill="FFFFFF"/>
+        <w:spacing w:after="0" w:line="240" w:lineRule="auto"/>
+        <w:rPr>
+          <w:rFonts w:ascii="Consolas" w:eastAsia="Times New Roman" w:hAnsi="Consolas" w:cs="Times New Roman"/>
+          <w:color w:val="000000"/>
+          <w:sz w:val="21"/>
+          <w:szCs w:val="21"/>
+        </w:rPr>
+      </w:pPr>
+      <w:r>
+        <w:rPr>
+          <w:rFonts w:ascii="Consolas" w:eastAsia="Times New Roman" w:hAnsi="Consolas" w:cs="Times New Roman"/>
+          <w:color w:val="000000"/>
+          <w:sz w:val="21"/>
+          <w:szCs w:val="21"/>
+        </w:rPr>
+        <w:t xml:space="preserve">        </w:t>
+      </w:r>
+      <w:r>
+        <w:rPr>
+          <w:rFonts w:ascii="Consolas" w:eastAsia="Times New Roman" w:hAnsi="Consolas" w:cs="Times New Roman"/>
+          <w:color w:val="001080"/>
+          <w:sz w:val="21"/>
+          <w:szCs w:val="21"/>
+        </w:rPr>
+        <w:t>a</w:t>
+      </w:r>
+      <w:r>
+        <w:rPr>
+          <w:rFonts w:ascii="Consolas" w:eastAsia="Times New Roman" w:hAnsi="Consolas" w:cs="Times New Roman"/>
+          <w:color w:val="000000"/>
+          <w:sz w:val="21"/>
+          <w:szCs w:val="21"/>
+        </w:rPr>
+        <w:t xml:space="preserve"> = </w:t>
+      </w:r>
+      <w:r>
+        <w:rPr>
+          <w:rFonts w:ascii="Consolas" w:eastAsia="Times New Roman" w:hAnsi="Consolas" w:cs="Times New Roman"/>
+          <w:color w:val="001080"/>
+          <w:sz w:val="21"/>
+          <w:szCs w:val="21"/>
+        </w:rPr>
+        <w:t>m</w:t>
+      </w:r>
+      <w:r>
+        <w:rPr>
+          <w:rFonts w:ascii="Consolas" w:eastAsia="Times New Roman" w:hAnsi="Consolas" w:cs="Times New Roman"/>
+          <w:color w:val="000000"/>
+          <w:sz w:val="21"/>
+          <w:szCs w:val="21"/>
+        </w:rPr>
+        <w:t xml:space="preserve"> * (</w:t>
+      </w:r>
+      <w:r>
+        <w:rPr>
+          <w:rFonts w:ascii="Consolas" w:eastAsia="Times New Roman" w:hAnsi="Consolas" w:cs="Times New Roman"/>
+          <w:color w:val="001080"/>
+          <w:sz w:val="21"/>
+          <w:szCs w:val="21"/>
+        </w:rPr>
+        <w:t>t</w:t>
+      </w:r>
+      <w:r>
+        <w:rPr>
+          <w:rFonts w:ascii="Consolas" w:eastAsia="Times New Roman" w:hAnsi="Consolas" w:cs="Times New Roman"/>
+          <w:color w:val="000000"/>
+          <w:sz w:val="21"/>
+          <w:szCs w:val="21"/>
+        </w:rPr>
+        <w:t xml:space="preserve"> + </w:t>
+      </w:r>
+      <w:r>
+        <w:rPr>
+          <w:rFonts w:ascii="Consolas" w:eastAsia="Times New Roman" w:hAnsi="Consolas" w:cs="Times New Roman"/>
+          <w:color w:val="098658"/>
+          <w:sz w:val="21"/>
+          <w:szCs w:val="21"/>
+        </w:rPr>
+        <w:t>460</w:t>
+      </w:r>
+      <w:proofErr w:type="gramStart"/>
+      <w:r>
+        <w:rPr>
+          <w:rFonts w:ascii="Consolas" w:eastAsia="Times New Roman" w:hAnsi="Consolas" w:cs="Times New Roman"/>
+          <w:color w:val="000000"/>
+          <w:sz w:val="21"/>
+          <w:szCs w:val="21"/>
+        </w:rPr>
+        <w:t>);</w:t>
+      </w:r>
+      <w:proofErr w:type="gramEnd"/>
+    </w:p>
+    <w:p>
+      <w:pPr>
+        <w:shd w:val="clear" w:color="auto" w:fill="FFFFFF"/>
+        <w:spacing w:after="0" w:line="240" w:lineRule="auto"/>
+        <w:rPr>
+          <w:rFonts w:ascii="Consolas" w:eastAsia="Times New Roman" w:hAnsi="Consolas" w:cs="Times New Roman"/>
+          <w:color w:val="000000"/>
+          <w:sz w:val="21"/>
+          <w:szCs w:val="21"/>
+        </w:rPr>
+      </w:pPr>
+      <w:r>
+        <w:rPr>
+          <w:rFonts w:ascii="Consolas" w:eastAsia="Times New Roman" w:hAnsi="Consolas" w:cs="Times New Roman"/>
+          <w:color w:val="000000"/>
+          <w:sz w:val="21"/>
+          <w:szCs w:val="21"/>
+        </w:rPr>
+        <w:t xml:space="preserve">        </w:t>
+      </w:r>
+      <w:r>
+        <w:rPr>
+          <w:rFonts w:ascii="Consolas" w:eastAsia="Times New Roman" w:hAnsi="Consolas" w:cs="Times New Roman"/>
+          <w:color w:val="001080"/>
+          <w:sz w:val="21"/>
+          <w:szCs w:val="21"/>
+        </w:rPr>
+        <w:t>b</w:t>
+      </w:r>
+      <w:r>
+        <w:rPr>
+          <w:rFonts w:ascii="Consolas" w:eastAsia="Times New Roman" w:hAnsi="Consolas" w:cs="Times New Roman"/>
+          <w:color w:val="000000"/>
+          <w:sz w:val="21"/>
+          <w:szCs w:val="21"/>
+        </w:rPr>
+        <w:t xml:space="preserve"> = </w:t>
+      </w:r>
+      <w:r>
+        <w:rPr>
+          <w:rFonts w:ascii="Consolas" w:eastAsia="Times New Roman" w:hAnsi="Consolas" w:cs="Times New Roman"/>
+          <w:color w:val="098658"/>
+          <w:sz w:val="21"/>
+          <w:szCs w:val="21"/>
+        </w:rPr>
+        <w:t>0.37</w:t>
+      </w:r>
+      <w:r>
+        <w:rPr>
+          <w:rFonts w:ascii="Consolas" w:eastAsia="Times New Roman" w:hAnsi="Consolas" w:cs="Times New Roman"/>
+          <w:color w:val="000000"/>
+          <w:sz w:val="21"/>
+          <w:szCs w:val="21"/>
+        </w:rPr>
+        <w:t xml:space="preserve"> / </w:t>
+      </w:r>
+      <w:proofErr w:type="gramStart"/>
+      <w:r>
+        <w:rPr>
+          <w:rFonts w:ascii="Consolas" w:eastAsia="Times New Roman" w:hAnsi="Consolas" w:cs="Times New Roman"/>
+          <w:color w:val="001080"/>
+          <w:sz w:val="21"/>
+          <w:szCs w:val="21"/>
+        </w:rPr>
+        <w:t>v</w:t>
+      </w:r>
+      <w:r>
+        <w:rPr>
+          <w:rFonts w:ascii="Consolas" w:eastAsia="Times New Roman" w:hAnsi="Consolas" w:cs="Times New Roman"/>
+          <w:color w:val="000000"/>
+          <w:sz w:val="21"/>
+          <w:szCs w:val="21"/>
+        </w:rPr>
+        <w:t>;</w:t>
+      </w:r>
+      <w:proofErr w:type="gramEnd"/>
+    </w:p>
+    <w:p>
+      <w:pPr>
+        <w:shd w:val="clear" w:color="auto" w:fill="FFFFFF"/>
+        <w:spacing w:after="0" w:line="240" w:lineRule="auto"/>
+        <w:rPr>
+          <w:rFonts w:ascii="Consolas" w:eastAsia="Times New Roman" w:hAnsi="Consolas" w:cs="Times New Roman"/>
+          <w:color w:val="000000"/>
+          <w:sz w:val="21"/>
+          <w:szCs w:val="21"/>
+        </w:rPr>
+      </w:pPr>
+      <w:r>
+        <w:rPr>
+          <w:rFonts w:ascii="Consolas" w:eastAsia="Times New Roman" w:hAnsi="Consolas" w:cs="Times New Roman"/>
+          <w:color w:val="000000"/>
+          <w:sz w:val="21"/>
+          <w:szCs w:val="21"/>
+        </w:rPr>
+        <w:t xml:space="preserve">        </w:t>
+      </w:r>
+      <w:r>
+        <w:rPr>
+          <w:rFonts w:ascii="Consolas" w:eastAsia="Times New Roman" w:hAnsi="Consolas" w:cs="Times New Roman"/>
+          <w:color w:val="001080"/>
+          <w:sz w:val="21"/>
+          <w:szCs w:val="21"/>
+        </w:rPr>
+        <w:t>p</w:t>
+      </w:r>
+      <w:r>
+        <w:rPr>
+          <w:rFonts w:ascii="Consolas" w:eastAsia="Times New Roman" w:hAnsi="Consolas" w:cs="Times New Roman"/>
+          <w:color w:val="000000"/>
+          <w:sz w:val="21"/>
+          <w:szCs w:val="21"/>
+        </w:rPr>
+        <w:t xml:space="preserve"> = </w:t>
+      </w:r>
+      <w:r>
+        <w:rPr>
+          <w:rFonts w:ascii="Consolas" w:eastAsia="Times New Roman" w:hAnsi="Consolas" w:cs="Times New Roman"/>
+          <w:color w:val="001080"/>
+          <w:sz w:val="21"/>
+          <w:szCs w:val="21"/>
+        </w:rPr>
+        <w:t>a</w:t>
+      </w:r>
+      <w:r>
+        <w:rPr>
+          <w:rFonts w:ascii="Consolas" w:eastAsia="Times New Roman" w:hAnsi="Consolas" w:cs="Times New Roman"/>
+          <w:color w:val="000000"/>
+          <w:sz w:val="21"/>
+          <w:szCs w:val="21"/>
+        </w:rPr>
+        <w:t xml:space="preserve"> * </w:t>
+      </w:r>
+      <w:proofErr w:type="gramStart"/>
+      <w:r>
+        <w:rPr>
+          <w:rFonts w:ascii="Consolas" w:eastAsia="Times New Roman" w:hAnsi="Consolas" w:cs="Times New Roman"/>
+          <w:color w:val="001080"/>
+          <w:sz w:val="21"/>
+          <w:szCs w:val="21"/>
+        </w:rPr>
+        <w:t>b</w:t>
+      </w:r>
+      <w:r>
+        <w:rPr>
+          <w:rFonts w:ascii="Consolas" w:eastAsia="Times New Roman" w:hAnsi="Consolas" w:cs="Times New Roman"/>
+          <w:color w:val="000000"/>
+          <w:sz w:val="21"/>
+          <w:szCs w:val="21"/>
+        </w:rPr>
+        <w:t>;</w:t>
+      </w:r>
+      <w:proofErr w:type="gramEnd"/>
+    </w:p>
+    <w:p>
+      <w:pPr>
+        <w:shd w:val="clear" w:color="auto" w:fill="FFFFFF"/>
+        <w:spacing w:after="0" w:line="240" w:lineRule="auto"/>
+        <w:rPr>
+          <w:rFonts w:ascii="Consolas" w:eastAsia="Times New Roman" w:hAnsi="Consolas" w:cs="Times New Roman"/>
+          <w:color w:val="000000"/>
+          <w:sz w:val="21"/>
+          <w:szCs w:val="21"/>
+        </w:rPr>
+      </w:pPr>
+      <w:r>
+        <w:rPr>
+          <w:rFonts w:ascii="Consolas" w:eastAsia="Times New Roman" w:hAnsi="Consolas" w:cs="Times New Roman"/>
+          <w:color w:val="000000"/>
+          <w:sz w:val="21"/>
+          <w:szCs w:val="21"/>
+        </w:rPr>
+        <w:t xml:space="preserve">        </w:t>
+      </w:r>
+      <w:r>
+        <w:rPr>
+          <w:rFonts w:ascii="Consolas" w:eastAsia="Times New Roman" w:hAnsi="Consolas" w:cs="Times New Roman"/>
+          <w:color w:val="AF00DB"/>
+          <w:sz w:val="21"/>
+          <w:szCs w:val="21"/>
+        </w:rPr>
+        <w:t>return</w:t>
+      </w:r>
+      <w:r>
+        <w:rPr>
+          <w:rFonts w:ascii="Consolas" w:eastAsia="Times New Roman" w:hAnsi="Consolas" w:cs="Times New Roman"/>
+          <w:color w:val="000000"/>
+          <w:sz w:val="21"/>
+          <w:szCs w:val="21"/>
+        </w:rPr>
+        <w:t xml:space="preserve"> </w:t>
+      </w:r>
+      <w:proofErr w:type="gramStart"/>
+      <w:r>
+        <w:rPr>
+          <w:rFonts w:ascii="Consolas" w:eastAsia="Times New Roman" w:hAnsi="Consolas" w:cs="Times New Roman"/>
+          <w:color w:val="001080"/>
+          <w:sz w:val="21"/>
+          <w:szCs w:val="21"/>
+        </w:rPr>
+        <w:t>p</w:t>
+      </w:r>
+      <w:r>
+        <w:rPr>
+          <w:rFonts w:ascii="Consolas" w:eastAsia="Times New Roman" w:hAnsi="Consolas" w:cs="Times New Roman"/>
+          <w:color w:val="000000"/>
+          <w:sz w:val="21"/>
+          <w:szCs w:val="21"/>
+        </w:rPr>
+        <w:t>;</w:t>
+      </w:r>
+      <w:proofErr w:type="gramEnd"/>
+    </w:p>
+    <w:p>
+      <w:pPr>
+        <w:shd w:val="clear" w:color="auto" w:fill="FFFFFF"/>
+        <w:spacing w:after="0" w:line="240" w:lineRule="auto"/>
+        <w:rPr>
+          <w:rFonts w:ascii="Consolas" w:eastAsia="Times New Roman" w:hAnsi="Consolas" w:cs="Times New Roman"/>
+          <w:color w:val="000000"/>
+          <w:sz w:val="21"/>
+          <w:szCs w:val="21"/>
+        </w:rPr>
+      </w:pPr>
+      <w:r>
+        <w:rPr>
+          <w:rFonts w:ascii="Consolas" w:eastAsia="Times New Roman" w:hAnsi="Consolas" w:cs="Times New Roman"/>
+          <w:color w:val="000000"/>
+          <w:sz w:val="21"/>
+          <w:szCs w:val="21"/>
+        </w:rPr>
+        <w:t>    }</w:t>
+      </w:r>
+    </w:p>
+    <w:p>
+      <w:pPr>
+        <w:shd w:val="clear" w:color="auto" w:fill="FFFFFF"/>
+        <w:spacing w:after="0" w:line="240" w:lineRule="auto"/>
+        <w:rPr>
+          <w:rFonts w:ascii="Consolas" w:eastAsia="Times New Roman" w:hAnsi="Consolas" w:cs="Times New Roman"/>
+          <w:color w:val="000000"/>
+          <w:sz w:val="21"/>
+          <w:szCs w:val="21"/>
+        </w:rPr>
+      </w:pPr>
+    </w:p>
+    <w:p>
+      <w:pPr>
+        <w:shd w:val="clear" w:color="auto" w:fill="FFFFFF"/>
+        <w:spacing w:after="0" w:line="240" w:lineRule="auto"/>
+        <w:rPr>
+          <w:rFonts w:ascii="Consolas" w:eastAsia="Times New Roman" w:hAnsi="Consolas" w:cs="Times New Roman"/>
+          <w:color w:val="000000"/>
+          <w:sz w:val="21"/>
+          <w:szCs w:val="21"/>
+        </w:rPr>
+      </w:pPr>
+      <w:r>
+        <w:rPr>
+          <w:rFonts w:ascii="Consolas" w:eastAsia="Times New Roman" w:hAnsi="Consolas" w:cs="Times New Roman"/>
+          <w:color w:val="000000"/>
+          <w:sz w:val="21"/>
+          <w:szCs w:val="21"/>
+        </w:rPr>
+        <w:t xml:space="preserve">    </w:t>
+      </w:r>
+      <w:r>
+        <w:rPr>
+          <w:rFonts w:ascii="Consolas" w:eastAsia="Times New Roman" w:hAnsi="Consolas" w:cs="Times New Roman"/>
+          <w:color w:val="0000FF"/>
+          <w:sz w:val="21"/>
+          <w:szCs w:val="21"/>
+        </w:rPr>
+        <w:t>public</w:t>
+      </w:r>
+      <w:r>
+        <w:rPr>
+          <w:rFonts w:ascii="Consolas" w:eastAsia="Times New Roman" w:hAnsi="Consolas" w:cs="Times New Roman"/>
+          <w:color w:val="000000"/>
+          <w:sz w:val="21"/>
+          <w:szCs w:val="21"/>
+        </w:rPr>
+        <w:t xml:space="preserve"> </w:t>
+      </w:r>
+      <w:r>
+        <w:rPr>
+          <w:rFonts w:ascii="Consolas" w:eastAsia="Times New Roman" w:hAnsi="Consolas" w:cs="Times New Roman"/>
+          <w:color w:val="0000FF"/>
+          <w:sz w:val="21"/>
+          <w:szCs w:val="21"/>
+        </w:rPr>
+        <w:t>static</w:t>
+      </w:r>
+      <w:r>
+        <w:rPr>
+          <w:rFonts w:ascii="Consolas" w:eastAsia="Times New Roman" w:hAnsi="Consolas" w:cs="Times New Roman"/>
+          <w:color w:val="000000"/>
+          <w:sz w:val="21"/>
+          <w:szCs w:val="21"/>
+        </w:rPr>
+        <w:t xml:space="preserve"> </w:t>
+      </w:r>
+      <w:r>
+        <w:rPr>
+          <w:rFonts w:ascii="Consolas" w:eastAsia="Times New Roman" w:hAnsi="Consolas" w:cs="Times New Roman"/>
+          <w:color w:val="267F99"/>
+          <w:sz w:val="21"/>
+          <w:szCs w:val="21"/>
+        </w:rPr>
+        <w:t>void</w:t>
+      </w:r>
+      <w:r>
+        <w:rPr>
+          <w:rFonts w:ascii="Consolas" w:eastAsia="Times New Roman" w:hAnsi="Consolas" w:cs="Times New Roman"/>
+          <w:color w:val="000000"/>
+          <w:sz w:val="21"/>
+          <w:szCs w:val="21"/>
+        </w:rPr>
+        <w:t xml:space="preserve"> </w:t>
+      </w:r>
+      <w:proofErr w:type="gramStart"/>
+      <w:r>
+        <w:rPr>
+          <w:rFonts w:ascii="Consolas" w:eastAsia="Times New Roman" w:hAnsi="Consolas" w:cs="Times New Roman"/>
+          <w:color w:val="795E26"/>
+          <w:sz w:val="21"/>
+          <w:szCs w:val="21"/>
+        </w:rPr>
+        <w:t>main</w:t>
+      </w:r>
+      <w:r>
+        <w:rPr>
+          <w:rFonts w:ascii="Consolas" w:eastAsia="Times New Roman" w:hAnsi="Consolas" w:cs="Times New Roman"/>
+          <w:color w:val="000000"/>
+          <w:sz w:val="21"/>
+          <w:szCs w:val="21"/>
+        </w:rPr>
+        <w:t>(</w:t>
+      </w:r>
+      <w:proofErr w:type="gramEnd"/>
+      <w:r>
+        <w:rPr>
+          <w:rFonts w:ascii="Consolas" w:eastAsia="Times New Roman" w:hAnsi="Consolas" w:cs="Times New Roman"/>
+          <w:color w:val="267F99"/>
+          <w:sz w:val="21"/>
+          <w:szCs w:val="21"/>
+        </w:rPr>
+        <w:t>String</w:t>
+      </w:r>
+      <w:r>
+        <w:rPr>
+          <w:rFonts w:ascii="Consolas" w:eastAsia="Times New Roman" w:hAnsi="Consolas" w:cs="Times New Roman"/>
+          <w:color w:val="000000"/>
+          <w:sz w:val="21"/>
+          <w:szCs w:val="21"/>
+        </w:rPr>
+        <w:t xml:space="preserve">[] </w:t>
+      </w:r>
+      <w:proofErr w:type="spellStart"/>
+      <w:r>
+        <w:rPr>
+          <w:rFonts w:ascii="Consolas" w:eastAsia="Times New Roman" w:hAnsi="Consolas" w:cs="Times New Roman"/>
+          <w:color w:val="001080"/>
+          <w:sz w:val="21"/>
+          <w:szCs w:val="21"/>
+        </w:rPr>
+        <w:t>args</w:t>
+      </w:r>
+      <w:proofErr w:type="spellEnd"/>
+      <w:r>
+        <w:rPr>
+          <w:rFonts w:ascii="Consolas" w:eastAsia="Times New Roman" w:hAnsi="Consolas" w:cs="Times New Roman"/>
+          <w:color w:val="000000"/>
+          <w:sz w:val="21"/>
+          <w:szCs w:val="21"/>
+        </w:rPr>
+        <w:t>) {</w:t>
+      </w:r>
+    </w:p>
+    <w:p>
+      <w:pPr>
+        <w:shd w:val="clear" w:color="auto" w:fill="FFFFFF"/>
+        <w:spacing w:after="0" w:line="240" w:lineRule="auto"/>
+        <w:rPr>
+          <w:rFonts w:ascii="Consolas" w:eastAsia="Times New Roman" w:hAnsi="Consolas" w:cs="Times New Roman"/>
+          <w:color w:val="000000"/>
+          <w:sz w:val="21"/>
+          <w:szCs w:val="21"/>
+        </w:rPr>
+      </w:pPr>
+      <w:r>
+        <w:rPr>
+          <w:rFonts w:ascii="Consolas" w:eastAsia="Times New Roman" w:hAnsi="Consolas" w:cs="Times New Roman"/>
+          <w:color w:val="000000"/>
+          <w:sz w:val="21"/>
+          <w:szCs w:val="21"/>
+        </w:rPr>
+        <w:t xml:space="preserve">        </w:t>
+      </w:r>
+      <w:r>
+        <w:rPr>
+          <w:rFonts w:ascii="Consolas" w:eastAsia="Times New Roman" w:hAnsi="Consolas" w:cs="Times New Roman"/>
+          <w:color w:val="267F99"/>
+          <w:sz w:val="21"/>
+          <w:szCs w:val="21"/>
+        </w:rPr>
+        <w:t>Scanner</w:t>
+      </w:r>
+      <w:r>
+        <w:rPr>
+          <w:rFonts w:ascii="Consolas" w:eastAsia="Times New Roman" w:hAnsi="Consolas" w:cs="Times New Roman"/>
+          <w:color w:val="000000"/>
+          <w:sz w:val="21"/>
+          <w:szCs w:val="21"/>
+        </w:rPr>
+        <w:t xml:space="preserve"> </w:t>
+      </w:r>
+      <w:r>
+        <w:rPr>
+          <w:rFonts w:ascii="Consolas" w:eastAsia="Times New Roman" w:hAnsi="Consolas" w:cs="Times New Roman"/>
+          <w:color w:val="001080"/>
+          <w:sz w:val="21"/>
+          <w:szCs w:val="21"/>
+        </w:rPr>
+        <w:t>input</w:t>
+      </w:r>
+      <w:r>
+        <w:rPr>
+          <w:rFonts w:ascii="Consolas" w:eastAsia="Times New Roman" w:hAnsi="Consolas" w:cs="Times New Roman"/>
+          <w:color w:val="000000"/>
+          <w:sz w:val="21"/>
+          <w:szCs w:val="21"/>
+        </w:rPr>
+        <w:t xml:space="preserve"> = </w:t>
+      </w:r>
+      <w:r>
+        <w:rPr>
+          <w:rFonts w:ascii="Consolas" w:eastAsia="Times New Roman" w:hAnsi="Consolas" w:cs="Times New Roman"/>
+          <w:color w:val="AF00DB"/>
+          <w:sz w:val="21"/>
+          <w:szCs w:val="21"/>
+        </w:rPr>
+        <w:t>new</w:t>
+      </w:r>
+      <w:r>
+        <w:rPr>
+          <w:rFonts w:ascii="Consolas" w:eastAsia="Times New Roman" w:hAnsi="Consolas" w:cs="Times New Roman"/>
+          <w:color w:val="000000"/>
+          <w:sz w:val="21"/>
+          <w:szCs w:val="21"/>
+        </w:rPr>
+        <w:t xml:space="preserve"> </w:t>
+      </w:r>
+      <w:proofErr w:type="gramStart"/>
+      <w:r>
+        <w:rPr>
+          <w:rFonts w:ascii="Consolas" w:eastAsia="Times New Roman" w:hAnsi="Consolas" w:cs="Times New Roman"/>
+          <w:color w:val="795E26"/>
+          <w:sz w:val="21"/>
+          <w:szCs w:val="21"/>
+        </w:rPr>
+        <w:t>Scanner</w:t>
+      </w:r>
+      <w:r>
+        <w:rPr>
+          <w:rFonts w:ascii="Consolas" w:eastAsia="Times New Roman" w:hAnsi="Consolas" w:cs="Times New Roman"/>
+          <w:color w:val="000000"/>
+          <w:sz w:val="21"/>
+          <w:szCs w:val="21"/>
+        </w:rPr>
+        <w:t>(</w:t>
+      </w:r>
+      <w:proofErr w:type="gramEnd"/>
+      <w:r>
+        <w:rPr>
+          <w:rFonts w:ascii="Consolas" w:eastAsia="Times New Roman" w:hAnsi="Consolas" w:cs="Times New Roman"/>
+          <w:color w:val="267F99"/>
+          <w:sz w:val="21"/>
+          <w:szCs w:val="21"/>
+        </w:rPr>
+        <w:t>System</w:t>
+      </w:r>
+      <w:r>
+        <w:rPr>
+          <w:rFonts w:ascii="Consolas" w:eastAsia="Times New Roman" w:hAnsi="Consolas" w:cs="Times New Roman"/>
+          <w:color w:val="000000"/>
+          <w:sz w:val="21"/>
+          <w:szCs w:val="21"/>
+        </w:rPr>
+        <w:t>.</w:t>
+      </w:r>
+      <w:r>
+        <w:rPr>
+          <w:rFonts w:ascii="Consolas" w:eastAsia="Times New Roman" w:hAnsi="Consolas" w:cs="Times New Roman"/>
+          <w:color w:val="0070C1"/>
+          <w:sz w:val="21"/>
+          <w:szCs w:val="21"/>
+        </w:rPr>
+        <w:t>in</w:t>
+      </w:r>
+      <w:r>
+        <w:rPr>
+          <w:rFonts w:ascii="Consolas" w:eastAsia="Times New Roman" w:hAnsi="Consolas" w:cs="Times New Roman"/>
+          <w:color w:val="000000"/>
+          <w:sz w:val="21"/>
+          <w:szCs w:val="21"/>
+        </w:rPr>
+        <w:t>);</w:t>
+      </w:r>
+    </w:p>
+    <w:p>
+      <w:pPr>
+        <w:shd w:val="clear" w:color="auto" w:fill="FFFFFF"/>
+        <w:spacing w:after="0" w:line="240" w:lineRule="auto"/>
+        <w:rPr>
+          <w:rFonts w:ascii="Consolas" w:eastAsia="Times New Roman" w:hAnsi="Consolas" w:cs="Times New Roman"/>
+          <w:color w:val="000000"/>
+          <w:sz w:val="21"/>
+          <w:szCs w:val="21"/>
+        </w:rPr>
+      </w:pPr>
+    </w:p>
+    <w:p>
+      <w:pPr>
+        <w:shd w:val="clear" w:color="auto" w:fill="FFFFFF"/>
+        <w:spacing w:after="0" w:line="240" w:lineRule="auto"/>
+        <w:rPr>
+          <w:rFonts w:ascii="Consolas" w:eastAsia="Times New Roman" w:hAnsi="Consolas" w:cs="Times New Roman"/>
+          <w:color w:val="000000"/>
+          <w:sz w:val="21"/>
+          <w:szCs w:val="21"/>
+        </w:rPr>
+      </w:pPr>
+      <w:r>
+        <w:rPr>
+          <w:rFonts w:ascii="Consolas" w:eastAsia="Times New Roman" w:hAnsi="Consolas" w:cs="Times New Roman"/>
+          <w:color w:val="000000"/>
+          <w:sz w:val="21"/>
+          <w:szCs w:val="21"/>
+        </w:rPr>
+        <w:t xml:space="preserve">        </w:t>
+      </w:r>
+      <w:r>
+        <w:rPr>
+          <w:rFonts w:ascii="Consolas" w:eastAsia="Times New Roman" w:hAnsi="Consolas" w:cs="Times New Roman"/>
+          <w:color w:val="267F99"/>
+          <w:sz w:val="21"/>
+          <w:szCs w:val="21"/>
+        </w:rPr>
+        <w:t>double</w:t>
+      </w:r>
+      <w:r>
+        <w:rPr>
+          <w:rFonts w:ascii="Consolas" w:eastAsia="Times New Roman" w:hAnsi="Consolas" w:cs="Times New Roman"/>
+          <w:color w:val="000000"/>
+          <w:sz w:val="21"/>
+          <w:szCs w:val="21"/>
+        </w:rPr>
+        <w:t xml:space="preserve"> </w:t>
+      </w:r>
+      <w:r>
+        <w:rPr>
+          <w:rFonts w:ascii="Consolas" w:eastAsia="Times New Roman" w:hAnsi="Consolas" w:cs="Times New Roman"/>
+          <w:color w:val="001080"/>
+          <w:sz w:val="21"/>
+          <w:szCs w:val="21"/>
+        </w:rPr>
+        <w:t>p</w:t>
+      </w:r>
+      <w:r>
+        <w:rPr>
+          <w:rFonts w:ascii="Consolas" w:eastAsia="Times New Roman" w:hAnsi="Consolas" w:cs="Times New Roman"/>
+          <w:color w:val="000000"/>
+          <w:sz w:val="21"/>
+          <w:szCs w:val="21"/>
+        </w:rPr>
+        <w:t xml:space="preserve">, </w:t>
+      </w:r>
+      <w:r>
+        <w:rPr>
+          <w:rFonts w:ascii="Consolas" w:eastAsia="Times New Roman" w:hAnsi="Consolas" w:cs="Times New Roman"/>
+          <w:color w:val="001080"/>
+          <w:sz w:val="21"/>
+          <w:szCs w:val="21"/>
+        </w:rPr>
+        <w:t>m</w:t>
+      </w:r>
+      <w:r>
+        <w:rPr>
+          <w:rFonts w:ascii="Consolas" w:eastAsia="Times New Roman" w:hAnsi="Consolas" w:cs="Times New Roman"/>
+          <w:color w:val="000000"/>
+          <w:sz w:val="21"/>
+          <w:szCs w:val="21"/>
+        </w:rPr>
+        <w:t xml:space="preserve">, </w:t>
+      </w:r>
+      <w:r>
+        <w:rPr>
+          <w:rFonts w:ascii="Consolas" w:eastAsia="Times New Roman" w:hAnsi="Consolas" w:cs="Times New Roman"/>
+          <w:color w:val="001080"/>
+          <w:sz w:val="21"/>
+          <w:szCs w:val="21"/>
+        </w:rPr>
+        <w:t>t</w:t>
+      </w:r>
+      <w:r>
+        <w:rPr>
+          <w:rFonts w:ascii="Consolas" w:eastAsia="Times New Roman" w:hAnsi="Consolas" w:cs="Times New Roman"/>
+          <w:color w:val="000000"/>
+          <w:sz w:val="21"/>
+          <w:szCs w:val="21"/>
+        </w:rPr>
+        <w:t xml:space="preserve">, </w:t>
+      </w:r>
+      <w:proofErr w:type="gramStart"/>
+      <w:r>
+        <w:rPr>
+          <w:rFonts w:ascii="Consolas" w:eastAsia="Times New Roman" w:hAnsi="Consolas" w:cs="Times New Roman"/>
+          <w:color w:val="001080"/>
+          <w:sz w:val="21"/>
+          <w:szCs w:val="21"/>
+        </w:rPr>
+        <w:t>v</w:t>
+      </w:r>
+      <w:r>
+        <w:rPr>
+          <w:rFonts w:ascii="Consolas" w:eastAsia="Times New Roman" w:hAnsi="Consolas" w:cs="Times New Roman"/>
+          <w:color w:val="000000"/>
+          <w:sz w:val="21"/>
+          <w:szCs w:val="21"/>
+        </w:rPr>
+        <w:t>;</w:t>
+      </w:r>
+      <w:proofErr w:type="gramEnd"/>
+    </w:p>
+    <w:p>
+      <w:pPr>
+        <w:shd w:val="clear" w:color="auto" w:fill="FFFFFF"/>
+        <w:spacing w:after="0" w:line="240" w:lineRule="auto"/>
+        <w:rPr>
+          <w:rFonts w:ascii="Consolas" w:eastAsia="Times New Roman" w:hAnsi="Consolas" w:cs="Times New Roman"/>
+          <w:color w:val="000000"/>
+          <w:sz w:val="21"/>
+          <w:szCs w:val="21"/>
+        </w:rPr>
+      </w:pPr>
+    </w:p>
+    <w:p>
+      <w:pPr>
+        <w:shd w:val="clear" w:color="auto" w:fill="FFFFFF"/>
+        <w:spacing w:after="0" w:line="240" w:lineRule="auto"/>
+        <w:rPr>
+          <w:rFonts w:ascii="Consolas" w:eastAsia="Times New Roman" w:hAnsi="Consolas" w:cs="Times New Roman"/>
+          <w:color w:val="000000"/>
+          <w:sz w:val="21"/>
+          <w:szCs w:val="21"/>
+        </w:rPr>
+      </w:pPr>
+      <w:r>
+        <w:rPr>
+          <w:rFonts w:ascii="Consolas" w:eastAsia="Times New Roman" w:hAnsi="Consolas" w:cs="Times New Roman"/>
+          <w:color w:val="000000"/>
+          <w:sz w:val="21"/>
+          <w:szCs w:val="21"/>
+        </w:rPr>
+        <w:t xml:space="preserve">        </w:t>
+      </w:r>
+      <w:proofErr w:type="spellStart"/>
+      <w:r>
+        <w:rPr>
+          <w:rFonts w:ascii="Consolas" w:eastAsia="Times New Roman" w:hAnsi="Consolas" w:cs="Times New Roman"/>
+          <w:color w:val="267F99"/>
+          <w:sz w:val="21"/>
+          <w:szCs w:val="21"/>
+        </w:rPr>
+        <w:t>System</w:t>
+      </w:r>
+      <w:r>
+        <w:rPr>
+          <w:rFonts w:ascii="Consolas" w:eastAsia="Times New Roman" w:hAnsi="Consolas" w:cs="Times New Roman"/>
+          <w:color w:val="000000"/>
+          <w:sz w:val="21"/>
+          <w:szCs w:val="21"/>
+        </w:rPr>
+        <w:t>.</w:t>
+      </w:r>
+      <w:r>
+        <w:rPr>
+          <w:rFonts w:ascii="Consolas" w:eastAsia="Times New Roman" w:hAnsi="Consolas" w:cs="Times New Roman"/>
+          <w:color w:val="0070C1"/>
+          <w:sz w:val="21"/>
+          <w:szCs w:val="21"/>
+        </w:rPr>
+        <w:t>out</w:t>
+      </w:r>
+      <w:r>
+        <w:rPr>
+          <w:rFonts w:ascii="Consolas" w:eastAsia="Times New Roman" w:hAnsi="Consolas" w:cs="Times New Roman"/>
+          <w:color w:val="000000"/>
+          <w:sz w:val="21"/>
+          <w:szCs w:val="21"/>
+        </w:rPr>
+        <w:t>.</w:t>
+      </w:r>
+      <w:r>
+        <w:rPr>
+          <w:rFonts w:ascii="Consolas" w:eastAsia="Times New Roman" w:hAnsi="Consolas" w:cs="Times New Roman"/>
+          <w:color w:val="795E26"/>
+          <w:sz w:val="21"/>
+          <w:szCs w:val="21"/>
+        </w:rPr>
+        <w:t>println</w:t>
+      </w:r>
+      <w:proofErr w:type="spellEnd"/>
+      <w:r>
+        <w:rPr>
+          <w:rFonts w:ascii="Consolas" w:eastAsia="Times New Roman" w:hAnsi="Consolas" w:cs="Times New Roman"/>
+          <w:color w:val="000000"/>
+          <w:sz w:val="21"/>
+          <w:szCs w:val="21"/>
+        </w:rPr>
+        <w:t>(</w:t>
+      </w:r>
+      <w:r>
+        <w:rPr>
+          <w:rFonts w:ascii="Consolas" w:eastAsia="Times New Roman" w:hAnsi="Consolas" w:cs="Times New Roman"/>
+          <w:color w:val="A31515"/>
+          <w:sz w:val="21"/>
+          <w:szCs w:val="21"/>
+        </w:rPr>
+        <w:t>"</w:t>
+      </w:r>
+      <w:r>
+        <w:rPr>
+          <w:rFonts w:ascii="Consolas" w:eastAsia="Times New Roman" w:hAnsi="Consolas" w:cs="Times New Roman"/>
+          <w:color w:val="A31515"/>
+          <w:sz w:val="21"/>
+          <w:szCs w:val="21"/>
+        </w:rPr>
+        <w:t>\n</w:t>
+      </w:r>
+      <w:r>
+        <w:rPr>
+          <w:rFonts w:ascii="Consolas" w:eastAsia="Times New Roman" w:hAnsi="Consolas" w:cs="Times New Roman"/>
+          <w:color w:val="A31515"/>
+          <w:sz w:val="21"/>
+          <w:szCs w:val="21"/>
+        </w:rPr>
+        <w:t xml:space="preserve">---Automobile </w:t>
+      </w:r>
+      <w:proofErr w:type="spellStart"/>
+      <w:r>
+        <w:rPr>
+          <w:rFonts w:ascii="Consolas" w:eastAsia="Times New Roman" w:hAnsi="Consolas" w:cs="Times New Roman"/>
+          <w:color w:val="A31515"/>
+          <w:sz w:val="21"/>
+          <w:szCs w:val="21"/>
+        </w:rPr>
+        <w:t>Tyre</w:t>
+      </w:r>
+      <w:proofErr w:type="spellEnd"/>
+      <w:r>
+        <w:rPr>
+          <w:rFonts w:ascii="Consolas" w:eastAsia="Times New Roman" w:hAnsi="Consolas" w:cs="Times New Roman"/>
+          <w:color w:val="A31515"/>
+          <w:sz w:val="21"/>
+          <w:szCs w:val="21"/>
+        </w:rPr>
+        <w:t xml:space="preserve"> Pressure Calculator---"</w:t>
+      </w:r>
+      <w:proofErr w:type="gramStart"/>
+      <w:r>
+        <w:rPr>
+          <w:rFonts w:ascii="Consolas" w:eastAsia="Times New Roman" w:hAnsi="Consolas" w:cs="Times New Roman"/>
+          <w:color w:val="000000"/>
+          <w:sz w:val="21"/>
+          <w:szCs w:val="21"/>
+        </w:rPr>
+        <w:t>);</w:t>
+      </w:r>
+      <w:proofErr w:type="gramEnd"/>
+    </w:p>
+    <w:p>
+      <w:pPr>
+        <w:shd w:val="clear" w:color="auto" w:fill="FFFFFF"/>
+        <w:spacing w:after="0" w:line="240" w:lineRule="auto"/>
+        <w:rPr>
+          <w:rFonts w:ascii="Consolas" w:eastAsia="Times New Roman" w:hAnsi="Consolas" w:cs="Times New Roman"/>
+          <w:color w:val="000000"/>
+          <w:sz w:val="21"/>
+          <w:szCs w:val="21"/>
+        </w:rPr>
+      </w:pPr>
+      <w:r>
+        <w:rPr>
+          <w:rFonts w:ascii="Consolas" w:eastAsia="Times New Roman" w:hAnsi="Consolas" w:cs="Times New Roman"/>
+          <w:color w:val="000000"/>
+          <w:sz w:val="21"/>
+          <w:szCs w:val="21"/>
+        </w:rPr>
+        <w:t xml:space="preserve">        </w:t>
+      </w:r>
+      <w:proofErr w:type="spellStart"/>
+      <w:r>
+        <w:rPr>
+          <w:rFonts w:ascii="Consolas" w:eastAsia="Times New Roman" w:hAnsi="Consolas" w:cs="Times New Roman"/>
+          <w:color w:val="267F99"/>
+          <w:sz w:val="21"/>
+          <w:szCs w:val="21"/>
+        </w:rPr>
+        <w:t>System</w:t>
+      </w:r>
+      <w:r>
+        <w:rPr>
+          <w:rFonts w:ascii="Consolas" w:eastAsia="Times New Roman" w:hAnsi="Consolas" w:cs="Times New Roman"/>
+          <w:color w:val="000000"/>
+          <w:sz w:val="21"/>
+          <w:szCs w:val="21"/>
+        </w:rPr>
+        <w:t>.</w:t>
+      </w:r>
+      <w:r>
+        <w:rPr>
+          <w:rFonts w:ascii="Consolas" w:eastAsia="Times New Roman" w:hAnsi="Consolas" w:cs="Times New Roman"/>
+          <w:color w:val="0070C1"/>
+          <w:sz w:val="21"/>
+          <w:szCs w:val="21"/>
+        </w:rPr>
+        <w:t>out</w:t>
+      </w:r>
+      <w:r>
+        <w:rPr>
+          <w:rFonts w:ascii="Consolas" w:eastAsia="Times New Roman" w:hAnsi="Consolas" w:cs="Times New Roman"/>
+          <w:color w:val="000000"/>
+          <w:sz w:val="21"/>
+          <w:szCs w:val="21"/>
+        </w:rPr>
+        <w:t>.</w:t>
+      </w:r>
+      <w:r>
+        <w:rPr>
+          <w:rFonts w:ascii="Consolas" w:eastAsia="Times New Roman" w:hAnsi="Consolas" w:cs="Times New Roman"/>
+          <w:color w:val="795E26"/>
+          <w:sz w:val="21"/>
+          <w:szCs w:val="21"/>
+        </w:rPr>
+        <w:t>println</w:t>
+      </w:r>
+      <w:proofErr w:type="spellEnd"/>
+      <w:r>
+        <w:rPr>
+          <w:rFonts w:ascii="Consolas" w:eastAsia="Times New Roman" w:hAnsi="Consolas" w:cs="Times New Roman"/>
+          <w:color w:val="000000"/>
+          <w:sz w:val="21"/>
+          <w:szCs w:val="21"/>
+        </w:rPr>
+        <w:t>(</w:t>
+      </w:r>
+      <w:r>
+        <w:rPr>
+          <w:rFonts w:ascii="Consolas" w:eastAsia="Times New Roman" w:hAnsi="Consolas" w:cs="Times New Roman"/>
+          <w:color w:val="A31515"/>
+          <w:sz w:val="21"/>
+          <w:szCs w:val="21"/>
+        </w:rPr>
+        <w:t>"Enter the Mass of air in pounds:"</w:t>
+      </w:r>
+      <w:proofErr w:type="gramStart"/>
+      <w:r>
+        <w:rPr>
+          <w:rFonts w:ascii="Consolas" w:eastAsia="Times New Roman" w:hAnsi="Consolas" w:cs="Times New Roman"/>
+          <w:color w:val="000000"/>
+          <w:sz w:val="21"/>
+          <w:szCs w:val="21"/>
+        </w:rPr>
+        <w:t>);</w:t>
+      </w:r>
+      <w:proofErr w:type="gramEnd"/>
+    </w:p>
+    <w:p>
+      <w:pPr>
+        <w:shd w:val="clear" w:color="auto" w:fill="FFFFFF"/>
+        <w:spacing w:after="0" w:line="240" w:lineRule="auto"/>
+        <w:rPr>
+          <w:rFonts w:ascii="Consolas" w:eastAsia="Times New Roman" w:hAnsi="Consolas" w:cs="Times New Roman"/>
+          <w:color w:val="000000"/>
+          <w:sz w:val="21"/>
+          <w:szCs w:val="21"/>
+        </w:rPr>
+      </w:pPr>
+      <w:r>
+        <w:rPr>
+          <w:rFonts w:ascii="Consolas" w:eastAsia="Times New Roman" w:hAnsi="Consolas" w:cs="Times New Roman"/>
+          <w:color w:val="000000"/>
+          <w:sz w:val="21"/>
+          <w:szCs w:val="21"/>
+        </w:rPr>
+        <w:t xml:space="preserve">        </w:t>
+      </w:r>
+      <w:r>
+        <w:rPr>
+          <w:rFonts w:ascii="Consolas" w:eastAsia="Times New Roman" w:hAnsi="Consolas" w:cs="Times New Roman"/>
+          <w:color w:val="001080"/>
+          <w:sz w:val="21"/>
+          <w:szCs w:val="21"/>
+        </w:rPr>
+        <w:t>m</w:t>
+      </w:r>
+      <w:r>
+        <w:rPr>
+          <w:rFonts w:ascii="Consolas" w:eastAsia="Times New Roman" w:hAnsi="Consolas" w:cs="Times New Roman"/>
+          <w:color w:val="000000"/>
+          <w:sz w:val="21"/>
+          <w:szCs w:val="21"/>
+        </w:rPr>
+        <w:t xml:space="preserve"> = </w:t>
+      </w:r>
+      <w:proofErr w:type="spellStart"/>
+      <w:proofErr w:type="gramStart"/>
+      <w:r>
+        <w:rPr>
+          <w:rFonts w:ascii="Consolas" w:eastAsia="Times New Roman" w:hAnsi="Consolas" w:cs="Times New Roman"/>
+          <w:color w:val="001080"/>
+          <w:sz w:val="21"/>
+          <w:szCs w:val="21"/>
+        </w:rPr>
+        <w:t>input</w:t>
+      </w:r>
+      <w:r>
+        <w:rPr>
+          <w:rFonts w:ascii="Consolas" w:eastAsia="Times New Roman" w:hAnsi="Consolas" w:cs="Times New Roman"/>
+          <w:color w:val="000000"/>
+          <w:sz w:val="21"/>
+          <w:szCs w:val="21"/>
+        </w:rPr>
+        <w:t>.</w:t>
+      </w:r>
+      <w:r>
+        <w:rPr>
+          <w:rFonts w:ascii="Consolas" w:eastAsia="Times New Roman" w:hAnsi="Consolas" w:cs="Times New Roman"/>
+          <w:color w:val="795E26"/>
+          <w:sz w:val="21"/>
+          <w:szCs w:val="21"/>
+        </w:rPr>
+        <w:t>nextInt</w:t>
+      </w:r>
+      <w:proofErr w:type="spellEnd"/>
+      <w:proofErr w:type="gramEnd"/>
+      <w:r>
+        <w:rPr>
+          <w:rFonts w:ascii="Consolas" w:eastAsia="Times New Roman" w:hAnsi="Consolas" w:cs="Times New Roman"/>
+          <w:color w:val="000000"/>
+          <w:sz w:val="21"/>
+          <w:szCs w:val="21"/>
+        </w:rPr>
+        <w:t>();</w:t>
+      </w:r>
+    </w:p>
+    <w:p>
+      <w:pPr>
+        <w:shd w:val="clear" w:color="auto" w:fill="FFFFFF"/>
+        <w:spacing w:after="0" w:line="240" w:lineRule="auto"/>
+        <w:rPr>
+          <w:rFonts w:ascii="Consolas" w:eastAsia="Times New Roman" w:hAnsi="Consolas" w:cs="Times New Roman"/>
+          <w:color w:val="000000"/>
+          <w:sz w:val="21"/>
+          <w:szCs w:val="21"/>
+        </w:rPr>
+      </w:pPr>
+      <w:r>
+        <w:rPr>
+          <w:rFonts w:ascii="Consolas" w:eastAsia="Times New Roman" w:hAnsi="Consolas" w:cs="Times New Roman"/>
+          <w:color w:val="000000"/>
+          <w:sz w:val="21"/>
+          <w:szCs w:val="21"/>
+        </w:rPr>
+        <w:t xml:space="preserve">        </w:t>
+      </w:r>
+      <w:proofErr w:type="spellStart"/>
+      <w:r>
+        <w:rPr>
+          <w:rFonts w:ascii="Consolas" w:eastAsia="Times New Roman" w:hAnsi="Consolas" w:cs="Times New Roman"/>
+          <w:color w:val="267F99"/>
+          <w:sz w:val="21"/>
+          <w:szCs w:val="21"/>
+        </w:rPr>
+        <w:t>System</w:t>
+      </w:r>
+      <w:r>
+        <w:rPr>
+          <w:rFonts w:ascii="Consolas" w:eastAsia="Times New Roman" w:hAnsi="Consolas" w:cs="Times New Roman"/>
+          <w:color w:val="000000"/>
+          <w:sz w:val="21"/>
+          <w:szCs w:val="21"/>
+        </w:rPr>
+        <w:t>.</w:t>
+      </w:r>
+      <w:r>
+        <w:rPr>
+          <w:rFonts w:ascii="Consolas" w:eastAsia="Times New Roman" w:hAnsi="Consolas" w:cs="Times New Roman"/>
+          <w:color w:val="0070C1"/>
+          <w:sz w:val="21"/>
+          <w:szCs w:val="21"/>
+        </w:rPr>
+        <w:t>out</w:t>
+      </w:r>
+      <w:r>
+        <w:rPr>
+          <w:rFonts w:ascii="Consolas" w:eastAsia="Times New Roman" w:hAnsi="Consolas" w:cs="Times New Roman"/>
+          <w:color w:val="000000"/>
+          <w:sz w:val="21"/>
+          <w:szCs w:val="21"/>
+        </w:rPr>
+        <w:t>.</w:t>
+      </w:r>
+      <w:r>
+        <w:rPr>
+          <w:rFonts w:ascii="Consolas" w:eastAsia="Times New Roman" w:hAnsi="Consolas" w:cs="Times New Roman"/>
+          <w:color w:val="795E26"/>
+          <w:sz w:val="21"/>
+          <w:szCs w:val="21"/>
+        </w:rPr>
+        <w:t>println</w:t>
+      </w:r>
+      <w:proofErr w:type="spellEnd"/>
+      <w:r>
+        <w:rPr>
+          <w:rFonts w:ascii="Consolas" w:eastAsia="Times New Roman" w:hAnsi="Consolas" w:cs="Times New Roman"/>
+          <w:color w:val="000000"/>
+          <w:sz w:val="21"/>
+          <w:szCs w:val="21"/>
+        </w:rPr>
+        <w:t>(</w:t>
+      </w:r>
+      <w:r>
+        <w:rPr>
+          <w:rFonts w:ascii="Consolas" w:eastAsia="Times New Roman" w:hAnsi="Consolas" w:cs="Times New Roman"/>
+          <w:color w:val="A31515"/>
+          <w:sz w:val="21"/>
+          <w:szCs w:val="21"/>
+        </w:rPr>
+        <w:t>"Enter Temperature in Fahrenheit:"</w:t>
+      </w:r>
+      <w:proofErr w:type="gramStart"/>
+      <w:r>
+        <w:rPr>
+          <w:rFonts w:ascii="Consolas" w:eastAsia="Times New Roman" w:hAnsi="Consolas" w:cs="Times New Roman"/>
+          <w:color w:val="000000"/>
+          <w:sz w:val="21"/>
+          <w:szCs w:val="21"/>
+        </w:rPr>
+        <w:t>);</w:t>
+      </w:r>
+      <w:proofErr w:type="gramEnd"/>
+    </w:p>
+    <w:p>
+      <w:pPr>
+        <w:shd w:val="clear" w:color="auto" w:fill="FFFFFF"/>
+        <w:spacing w:after="0" w:line="240" w:lineRule="auto"/>
+        <w:rPr>
+          <w:rFonts w:ascii="Consolas" w:eastAsia="Times New Roman" w:hAnsi="Consolas" w:cs="Times New Roman"/>
+          <w:color w:val="000000"/>
+          <w:sz w:val="21"/>
+          <w:szCs w:val="21"/>
+        </w:rPr>
+      </w:pPr>
+      <w:r>
+        <w:rPr>
+          <w:rFonts w:ascii="Consolas" w:eastAsia="Times New Roman" w:hAnsi="Consolas" w:cs="Times New Roman"/>
+          <w:color w:val="000000"/>
+          <w:sz w:val="21"/>
+          <w:szCs w:val="21"/>
+        </w:rPr>
+        <w:t xml:space="preserve">        </w:t>
+      </w:r>
+      <w:r>
+        <w:rPr>
+          <w:rFonts w:ascii="Consolas" w:eastAsia="Times New Roman" w:hAnsi="Consolas" w:cs="Times New Roman"/>
+          <w:color w:val="001080"/>
+          <w:sz w:val="21"/>
+          <w:szCs w:val="21"/>
+        </w:rPr>
+        <w:t>t</w:t>
+      </w:r>
+      <w:r>
+        <w:rPr>
+          <w:rFonts w:ascii="Consolas" w:eastAsia="Times New Roman" w:hAnsi="Consolas" w:cs="Times New Roman"/>
+          <w:color w:val="000000"/>
+          <w:sz w:val="21"/>
+          <w:szCs w:val="21"/>
+        </w:rPr>
+        <w:t xml:space="preserve"> = </w:t>
+      </w:r>
+      <w:proofErr w:type="spellStart"/>
+      <w:proofErr w:type="gramStart"/>
+      <w:r>
+        <w:rPr>
+          <w:rFonts w:ascii="Consolas" w:eastAsia="Times New Roman" w:hAnsi="Consolas" w:cs="Times New Roman"/>
+          <w:color w:val="001080"/>
+          <w:sz w:val="21"/>
+          <w:szCs w:val="21"/>
+        </w:rPr>
+        <w:t>input</w:t>
+      </w:r>
+      <w:r>
+        <w:rPr>
+          <w:rFonts w:ascii="Consolas" w:eastAsia="Times New Roman" w:hAnsi="Consolas" w:cs="Times New Roman"/>
+          <w:color w:val="000000"/>
+          <w:sz w:val="21"/>
+          <w:szCs w:val="21"/>
+        </w:rPr>
+        <w:t>.</w:t>
+      </w:r>
+      <w:r>
+        <w:rPr>
+          <w:rFonts w:ascii="Consolas" w:eastAsia="Times New Roman" w:hAnsi="Consolas" w:cs="Times New Roman"/>
+          <w:color w:val="795E26"/>
+          <w:sz w:val="21"/>
+          <w:szCs w:val="21"/>
+        </w:rPr>
+        <w:t>nextInt</w:t>
+      </w:r>
+      <w:proofErr w:type="spellEnd"/>
+      <w:proofErr w:type="gramEnd"/>
+      <w:r>
+        <w:rPr>
+          <w:rFonts w:ascii="Consolas" w:eastAsia="Times New Roman" w:hAnsi="Consolas" w:cs="Times New Roman"/>
+          <w:color w:val="000000"/>
+          <w:sz w:val="21"/>
+          <w:szCs w:val="21"/>
+        </w:rPr>
+        <w:t>();</w:t>
+      </w:r>
+    </w:p>
+    <w:p>
+      <w:pPr>
+        <w:shd w:val="clear" w:color="auto" w:fill="FFFFFF"/>
+        <w:spacing w:after="0" w:line="240" w:lineRule="auto"/>
+        <w:rPr>
+          <w:rFonts w:ascii="Consolas" w:eastAsia="Times New Roman" w:hAnsi="Consolas" w:cs="Times New Roman"/>
+          <w:color w:val="000000"/>
+          <w:sz w:val="21"/>
+          <w:szCs w:val="21"/>
+        </w:rPr>
+      </w:pPr>
+      <w:r>
+        <w:rPr>
+          <w:rFonts w:ascii="Consolas" w:eastAsia="Times New Roman" w:hAnsi="Consolas" w:cs="Times New Roman"/>
+          <w:color w:val="000000"/>
+          <w:sz w:val="21"/>
+          <w:szCs w:val="21"/>
+        </w:rPr>
+        <w:t xml:space="preserve">        </w:t>
+      </w:r>
+      <w:proofErr w:type="spellStart"/>
+      <w:r>
+        <w:rPr>
+          <w:rFonts w:ascii="Consolas" w:eastAsia="Times New Roman" w:hAnsi="Consolas" w:cs="Times New Roman"/>
+          <w:color w:val="267F99"/>
+          <w:sz w:val="21"/>
+          <w:szCs w:val="21"/>
+        </w:rPr>
+        <w:t>System</w:t>
+      </w:r>
+      <w:r>
+        <w:rPr>
+          <w:rFonts w:ascii="Consolas" w:eastAsia="Times New Roman" w:hAnsi="Consolas" w:cs="Times New Roman"/>
+          <w:color w:val="000000"/>
+          <w:sz w:val="21"/>
+          <w:szCs w:val="21"/>
+        </w:rPr>
+        <w:t>.</w:t>
+      </w:r>
+      <w:r>
+        <w:rPr>
+          <w:rFonts w:ascii="Consolas" w:eastAsia="Times New Roman" w:hAnsi="Consolas" w:cs="Times New Roman"/>
+          <w:color w:val="0070C1"/>
+          <w:sz w:val="21"/>
+          <w:szCs w:val="21"/>
+        </w:rPr>
+        <w:t>out</w:t>
+      </w:r>
+      <w:r>
+        <w:rPr>
+          <w:rFonts w:ascii="Consolas" w:eastAsia="Times New Roman" w:hAnsi="Consolas" w:cs="Times New Roman"/>
+          <w:color w:val="000000"/>
+          <w:sz w:val="21"/>
+          <w:szCs w:val="21"/>
+        </w:rPr>
+        <w:t>.</w:t>
+      </w:r>
+      <w:r>
+        <w:rPr>
+          <w:rFonts w:ascii="Consolas" w:eastAsia="Times New Roman" w:hAnsi="Consolas" w:cs="Times New Roman"/>
+          <w:color w:val="795E26"/>
+          <w:sz w:val="21"/>
+          <w:szCs w:val="21"/>
+        </w:rPr>
+        <w:t>println</w:t>
+      </w:r>
+      <w:proofErr w:type="spellEnd"/>
+      <w:r>
+        <w:rPr>
+          <w:rFonts w:ascii="Consolas" w:eastAsia="Times New Roman" w:hAnsi="Consolas" w:cs="Times New Roman"/>
+          <w:color w:val="000000"/>
+          <w:sz w:val="21"/>
+          <w:szCs w:val="21"/>
+        </w:rPr>
+        <w:t>(</w:t>
+      </w:r>
+      <w:r>
+        <w:rPr>
+          <w:rFonts w:ascii="Consolas" w:eastAsia="Times New Roman" w:hAnsi="Consolas" w:cs="Times New Roman"/>
+          <w:color w:val="A31515"/>
+          <w:sz w:val="21"/>
+          <w:szCs w:val="21"/>
+        </w:rPr>
+        <w:t>"Enter Volume in cubic feet:"</w:t>
+      </w:r>
+      <w:proofErr w:type="gramStart"/>
+      <w:r>
+        <w:rPr>
+          <w:rFonts w:ascii="Consolas" w:eastAsia="Times New Roman" w:hAnsi="Consolas" w:cs="Times New Roman"/>
+          <w:color w:val="000000"/>
+          <w:sz w:val="21"/>
+          <w:szCs w:val="21"/>
+        </w:rPr>
+        <w:t>);</w:t>
+      </w:r>
+      <w:proofErr w:type="gramEnd"/>
+    </w:p>
+    <w:p>
+      <w:pPr>
+        <w:shd w:val="clear" w:color="auto" w:fill="FFFFFF"/>
+        <w:spacing w:after="0" w:line="240" w:lineRule="auto"/>
+        <w:rPr>
+          <w:rFonts w:ascii="Consolas" w:eastAsia="Times New Roman" w:hAnsi="Consolas" w:cs="Times New Roman"/>
+          <w:color w:val="000000"/>
+          <w:sz w:val="21"/>
+          <w:szCs w:val="21"/>
+        </w:rPr>
+      </w:pPr>
+      <w:r>
+        <w:rPr>
+          <w:rFonts w:ascii="Consolas" w:eastAsia="Times New Roman" w:hAnsi="Consolas" w:cs="Times New Roman"/>
+          <w:color w:val="000000"/>
+          <w:sz w:val="21"/>
+          <w:szCs w:val="21"/>
+        </w:rPr>
+        <w:t xml:space="preserve">        </w:t>
+      </w:r>
+      <w:r>
+        <w:rPr>
+          <w:rFonts w:ascii="Consolas" w:eastAsia="Times New Roman" w:hAnsi="Consolas" w:cs="Times New Roman"/>
+          <w:color w:val="001080"/>
+          <w:sz w:val="21"/>
+          <w:szCs w:val="21"/>
+        </w:rPr>
+        <w:t>v</w:t>
+      </w:r>
+      <w:r>
+        <w:rPr>
+          <w:rFonts w:ascii="Consolas" w:eastAsia="Times New Roman" w:hAnsi="Consolas" w:cs="Times New Roman"/>
+          <w:color w:val="000000"/>
+          <w:sz w:val="21"/>
+          <w:szCs w:val="21"/>
+        </w:rPr>
+        <w:t xml:space="preserve"> = </w:t>
+      </w:r>
+      <w:proofErr w:type="spellStart"/>
+      <w:proofErr w:type="gramStart"/>
+      <w:r>
+        <w:rPr>
+          <w:rFonts w:ascii="Consolas" w:eastAsia="Times New Roman" w:hAnsi="Consolas" w:cs="Times New Roman"/>
+          <w:color w:val="001080"/>
+          <w:sz w:val="21"/>
+          <w:szCs w:val="21"/>
+        </w:rPr>
+        <w:t>input</w:t>
+      </w:r>
+      <w:r>
+        <w:rPr>
+          <w:rFonts w:ascii="Consolas" w:eastAsia="Times New Roman" w:hAnsi="Consolas" w:cs="Times New Roman"/>
+          <w:color w:val="000000"/>
+          <w:sz w:val="21"/>
+          <w:szCs w:val="21"/>
+        </w:rPr>
+        <w:t>.</w:t>
+      </w:r>
+      <w:r>
+        <w:rPr>
+          <w:rFonts w:ascii="Consolas" w:eastAsia="Times New Roman" w:hAnsi="Consolas" w:cs="Times New Roman"/>
+          <w:color w:val="795E26"/>
+          <w:sz w:val="21"/>
+          <w:szCs w:val="21"/>
+        </w:rPr>
+        <w:t>nextInt</w:t>
+      </w:r>
+      <w:proofErr w:type="spellEnd"/>
+      <w:proofErr w:type="gramEnd"/>
+      <w:r>
+        <w:rPr>
+          <w:rFonts w:ascii="Consolas" w:eastAsia="Times New Roman" w:hAnsi="Consolas" w:cs="Times New Roman"/>
+          <w:color w:val="000000"/>
+          <w:sz w:val="21"/>
+          <w:szCs w:val="21"/>
+        </w:rPr>
+        <w:t>();</w:t>
+      </w:r>
+    </w:p>
+    <w:p>
+      <w:pPr>
+        <w:shd w:val="clear" w:color="auto" w:fill="FFFFFF"/>
+        <w:spacing w:after="0" w:line="240" w:lineRule="auto"/>
+        <w:rPr>
+          <w:rFonts w:ascii="Consolas" w:eastAsia="Times New Roman" w:hAnsi="Consolas" w:cs="Times New Roman"/>
+          <w:color w:val="000000"/>
+          <w:sz w:val="21"/>
+          <w:szCs w:val="21"/>
+        </w:rPr>
+      </w:pPr>
+    </w:p>
+    <w:p>
+      <w:pPr>
+        <w:shd w:val="clear" w:color="auto" w:fill="FFFFFF"/>
+        <w:spacing w:after="0" w:line="240" w:lineRule="auto"/>
+        <w:rPr>
+          <w:rFonts w:ascii="Consolas" w:eastAsia="Times New Roman" w:hAnsi="Consolas" w:cs="Times New Roman"/>
+          <w:color w:val="000000"/>
+          <w:sz w:val="21"/>
+          <w:szCs w:val="21"/>
+        </w:rPr>
+      </w:pPr>
+      <w:r>
+        <w:rPr>
+          <w:rFonts w:ascii="Consolas" w:eastAsia="Times New Roman" w:hAnsi="Consolas" w:cs="Times New Roman"/>
+          <w:color w:val="000000"/>
+          <w:sz w:val="21"/>
+          <w:szCs w:val="21"/>
+        </w:rPr>
+        <w:t xml:space="preserve">        </w:t>
+      </w:r>
+      <w:r>
+        <w:rPr>
+          <w:rFonts w:ascii="Consolas" w:eastAsia="Times New Roman" w:hAnsi="Consolas" w:cs="Times New Roman"/>
+          <w:color w:val="001080"/>
+          <w:sz w:val="21"/>
+          <w:szCs w:val="21"/>
+        </w:rPr>
+        <w:t>p</w:t>
+      </w:r>
+      <w:r>
+        <w:rPr>
+          <w:rFonts w:ascii="Consolas" w:eastAsia="Times New Roman" w:hAnsi="Consolas" w:cs="Times New Roman"/>
+          <w:color w:val="000000"/>
+          <w:sz w:val="21"/>
+          <w:szCs w:val="21"/>
+        </w:rPr>
+        <w:t xml:space="preserve"> = </w:t>
+      </w:r>
+      <w:proofErr w:type="spellStart"/>
+      <w:proofErr w:type="gramStart"/>
+      <w:r>
+        <w:rPr>
+          <w:rFonts w:ascii="Consolas" w:eastAsia="Times New Roman" w:hAnsi="Consolas" w:cs="Times New Roman"/>
+          <w:color w:val="795E26"/>
+          <w:sz w:val="21"/>
+          <w:szCs w:val="21"/>
+        </w:rPr>
+        <w:t>calculatePressure</w:t>
+      </w:r>
+      <w:proofErr w:type="spellEnd"/>
+      <w:r>
+        <w:rPr>
+          <w:rFonts w:ascii="Consolas" w:eastAsia="Times New Roman" w:hAnsi="Consolas" w:cs="Times New Roman"/>
+          <w:color w:val="000000"/>
+          <w:sz w:val="21"/>
+          <w:szCs w:val="21"/>
+        </w:rPr>
+        <w:t>(</w:t>
+      </w:r>
+      <w:proofErr w:type="gramEnd"/>
+      <w:r>
+        <w:rPr>
+          <w:rFonts w:ascii="Consolas" w:eastAsia="Times New Roman" w:hAnsi="Consolas" w:cs="Times New Roman"/>
+          <w:color w:val="001080"/>
+          <w:sz w:val="21"/>
+          <w:szCs w:val="21"/>
+        </w:rPr>
+        <w:t>m</w:t>
+      </w:r>
+      <w:r>
+        <w:rPr>
+          <w:rFonts w:ascii="Consolas" w:eastAsia="Times New Roman" w:hAnsi="Consolas" w:cs="Times New Roman"/>
+          <w:color w:val="000000"/>
+          <w:sz w:val="21"/>
+          <w:szCs w:val="21"/>
+        </w:rPr>
+        <w:t xml:space="preserve">, </w:t>
+      </w:r>
+      <w:r>
+        <w:rPr>
+          <w:rFonts w:ascii="Consolas" w:eastAsia="Times New Roman" w:hAnsi="Consolas" w:cs="Times New Roman"/>
+          <w:color w:val="001080"/>
+          <w:sz w:val="21"/>
+          <w:szCs w:val="21"/>
+        </w:rPr>
+        <w:t>t</w:t>
+      </w:r>
+      <w:r>
+        <w:rPr>
+          <w:rFonts w:ascii="Consolas" w:eastAsia="Times New Roman" w:hAnsi="Consolas" w:cs="Times New Roman"/>
+          <w:color w:val="000000"/>
+          <w:sz w:val="21"/>
+          <w:szCs w:val="21"/>
+        </w:rPr>
+        <w:t xml:space="preserve">, </w:t>
+      </w:r>
+      <w:r>
+        <w:rPr>
+          <w:rFonts w:ascii="Consolas" w:eastAsia="Times New Roman" w:hAnsi="Consolas" w:cs="Times New Roman"/>
+          <w:color w:val="001080"/>
+          <w:sz w:val="21"/>
+          <w:szCs w:val="21"/>
+        </w:rPr>
+        <w:t>v</w:t>
+      </w:r>
+      <w:r>
+        <w:rPr>
+          <w:rFonts w:ascii="Consolas" w:eastAsia="Times New Roman" w:hAnsi="Consolas" w:cs="Times New Roman"/>
+          <w:color w:val="000000"/>
+          <w:sz w:val="21"/>
+          <w:szCs w:val="21"/>
+        </w:rPr>
+        <w:t>);</w:t>
+      </w:r>
+    </w:p>
+    <w:p>
+      <w:pPr>
+        <w:shd w:val="clear" w:color="auto" w:fill="FFFFFF"/>
+        <w:spacing w:after="0" w:line="240" w:lineRule="auto"/>
+        <w:rPr>
+          <w:rFonts w:ascii="Consolas" w:eastAsia="Times New Roman" w:hAnsi="Consolas" w:cs="Times New Roman"/>
+          <w:color w:val="000000"/>
+          <w:sz w:val="21"/>
+          <w:szCs w:val="21"/>
+        </w:rPr>
+      </w:pPr>
+    </w:p>
+    <w:p>
+      <w:pPr>
+        <w:shd w:val="clear" w:color="auto" w:fill="FFFFFF"/>
+        <w:spacing w:after="0" w:line="240" w:lineRule="auto"/>
+        <w:rPr>
+          <w:rFonts w:ascii="Consolas" w:eastAsia="Times New Roman" w:hAnsi="Consolas" w:cs="Times New Roman"/>
+          <w:color w:val="000000"/>
+          <w:sz w:val="21"/>
+          <w:szCs w:val="21"/>
+        </w:rPr>
+      </w:pPr>
+      <w:r>
+        <w:rPr>
+          <w:rFonts w:ascii="Consolas" w:eastAsia="Times New Roman" w:hAnsi="Consolas" w:cs="Times New Roman"/>
+          <w:color w:val="000000"/>
+          <w:sz w:val="21"/>
+          <w:szCs w:val="21"/>
+        </w:rPr>
+        <w:t xml:space="preserve">        </w:t>
+      </w:r>
+      <w:proofErr w:type="spellStart"/>
+      <w:r>
+        <w:rPr>
+          <w:rFonts w:ascii="Consolas" w:eastAsia="Times New Roman" w:hAnsi="Consolas" w:cs="Times New Roman"/>
+          <w:color w:val="267F99"/>
+          <w:sz w:val="21"/>
+          <w:szCs w:val="21"/>
+        </w:rPr>
+        <w:t>System</w:t>
+      </w:r>
+      <w:r>
+        <w:rPr>
+          <w:rFonts w:ascii="Consolas" w:eastAsia="Times New Roman" w:hAnsi="Consolas" w:cs="Times New Roman"/>
+          <w:color w:val="000000"/>
+          <w:sz w:val="21"/>
+          <w:szCs w:val="21"/>
+        </w:rPr>
+        <w:t>.</w:t>
+      </w:r>
+      <w:r>
+        <w:rPr>
+          <w:rFonts w:ascii="Consolas" w:eastAsia="Times New Roman" w:hAnsi="Consolas" w:cs="Times New Roman"/>
+          <w:color w:val="0070C1"/>
+          <w:sz w:val="21"/>
+          <w:szCs w:val="21"/>
+        </w:rPr>
+        <w:t>out</w:t>
+      </w:r>
+      <w:r>
+        <w:rPr>
+          <w:rFonts w:ascii="Consolas" w:eastAsia="Times New Roman" w:hAnsi="Consolas" w:cs="Times New Roman"/>
+          <w:color w:val="000000"/>
+          <w:sz w:val="21"/>
+          <w:szCs w:val="21"/>
+        </w:rPr>
+        <w:t>.</w:t>
+      </w:r>
+      <w:r>
+        <w:rPr>
+          <w:rFonts w:ascii="Consolas" w:eastAsia="Times New Roman" w:hAnsi="Consolas" w:cs="Times New Roman"/>
+          <w:color w:val="795E26"/>
+          <w:sz w:val="21"/>
+          <w:szCs w:val="21"/>
+        </w:rPr>
+        <w:t>println</w:t>
+      </w:r>
+      <w:proofErr w:type="spellEnd"/>
+      <w:r>
+        <w:rPr>
+          <w:rFonts w:ascii="Consolas" w:eastAsia="Times New Roman" w:hAnsi="Consolas" w:cs="Times New Roman"/>
+          <w:color w:val="000000"/>
+          <w:sz w:val="21"/>
+          <w:szCs w:val="21"/>
+        </w:rPr>
+        <w:t>(</w:t>
+      </w:r>
+      <w:proofErr w:type="spellStart"/>
+      <w:r>
+        <w:rPr>
+          <w:rFonts w:ascii="Consolas" w:eastAsia="Times New Roman" w:hAnsi="Consolas" w:cs="Times New Roman"/>
+          <w:color w:val="267F99"/>
+          <w:sz w:val="21"/>
+          <w:szCs w:val="21"/>
+        </w:rPr>
+        <w:t>String</w:t>
+      </w:r>
+      <w:r>
+        <w:rPr>
+          <w:rFonts w:ascii="Consolas" w:eastAsia="Times New Roman" w:hAnsi="Consolas" w:cs="Times New Roman"/>
+          <w:color w:val="000000"/>
+          <w:sz w:val="21"/>
+          <w:szCs w:val="21"/>
+        </w:rPr>
+        <w:t>.</w:t>
+      </w:r>
+      <w:r>
+        <w:rPr>
+          <w:rFonts w:ascii="Consolas" w:eastAsia="Times New Roman" w:hAnsi="Consolas" w:cs="Times New Roman"/>
+          <w:color w:val="795E26"/>
+          <w:sz w:val="21"/>
+          <w:szCs w:val="21"/>
+        </w:rPr>
+        <w:t>format</w:t>
+      </w:r>
+      <w:proofErr w:type="spellEnd"/>
+      <w:r>
+        <w:rPr>
+          <w:rFonts w:ascii="Consolas" w:eastAsia="Times New Roman" w:hAnsi="Consolas" w:cs="Times New Roman"/>
+          <w:color w:val="000000"/>
+          <w:sz w:val="21"/>
+          <w:szCs w:val="21"/>
+        </w:rPr>
+        <w:t>(</w:t>
+      </w:r>
+      <w:r>
+        <w:rPr>
+          <w:rFonts w:ascii="Consolas" w:eastAsia="Times New Roman" w:hAnsi="Consolas" w:cs="Times New Roman"/>
+          <w:color w:val="A31515"/>
+          <w:sz w:val="21"/>
+          <w:szCs w:val="21"/>
+        </w:rPr>
+        <w:t>"Pressure is %,.2f psi"</w:t>
+      </w:r>
+      <w:r>
+        <w:rPr>
+          <w:rFonts w:ascii="Consolas" w:eastAsia="Times New Roman" w:hAnsi="Consolas" w:cs="Times New Roman"/>
+          <w:color w:val="000000"/>
+          <w:sz w:val="21"/>
+          <w:szCs w:val="21"/>
+        </w:rPr>
+        <w:t xml:space="preserve">, </w:t>
+      </w:r>
+      <w:r>
+        <w:rPr>
+          <w:rFonts w:ascii="Consolas" w:eastAsia="Times New Roman" w:hAnsi="Consolas" w:cs="Times New Roman"/>
+          <w:color w:val="001080"/>
+          <w:sz w:val="21"/>
+          <w:szCs w:val="21"/>
+        </w:rPr>
+        <w:t>p</w:t>
+      </w:r>
+      <w:r>
+        <w:rPr>
+          <w:rFonts w:ascii="Consolas" w:eastAsia="Times New Roman" w:hAnsi="Consolas" w:cs="Times New Roman"/>
+          <w:color w:val="000000"/>
+          <w:sz w:val="21"/>
+          <w:szCs w:val="21"/>
+        </w:rPr>
+        <w:t>)</w:t>
+      </w:r>
+      <w:proofErr w:type="gramStart"/>
+      <w:r>
+        <w:rPr>
+          <w:rFonts w:ascii="Consolas" w:eastAsia="Times New Roman" w:hAnsi="Consolas" w:cs="Times New Roman"/>
+          <w:color w:val="000000"/>
+          <w:sz w:val="21"/>
+          <w:szCs w:val="21"/>
+        </w:rPr>
+        <w:t>);</w:t>
+      </w:r>
+      <w:proofErr w:type="gramEnd"/>
+    </w:p>
+    <w:p>
+      <w:pPr>
+        <w:shd w:val="clear" w:color="auto" w:fill="FFFFFF"/>
+        <w:spacing w:after="0" w:line="240" w:lineRule="auto"/>
+        <w:rPr>
+          <w:rFonts w:ascii="Consolas" w:eastAsia="Times New Roman" w:hAnsi="Consolas" w:cs="Times New Roman"/>
+          <w:color w:val="000000"/>
+          <w:sz w:val="21"/>
+          <w:szCs w:val="21"/>
+        </w:rPr>
+      </w:pPr>
+      <w:r>
+        <w:rPr>
+          <w:rFonts w:ascii="Consolas" w:eastAsia="Times New Roman" w:hAnsi="Consolas" w:cs="Times New Roman"/>
+          <w:color w:val="000000"/>
+          <w:sz w:val="21"/>
+          <w:szCs w:val="21"/>
+        </w:rPr>
+        <w:t>    }</w:t>
+      </w:r>
+    </w:p>
+    <w:p>
+      <w:pPr>
+        <w:shd w:val="clear" w:color="auto" w:fill="FFFFFF"/>
+        <w:spacing w:line="240" w:lineRule="auto"/>
+        <w:rPr>
+          <w:rFonts w:ascii="Consolas" w:eastAsia="Times New Roman" w:hAnsi="Consolas" w:cs="Times New Roman"/>
+          <w:color w:val="000000"/>
+          <w:sz w:val="21"/>
+          <w:szCs w:val="21"/>
+        </w:rPr>
+      </w:pPr>
+      <w:r>
+        <w:rPr>
+          <w:rFonts w:ascii="Consolas" w:eastAsia="Times New Roman" w:hAnsi="Consolas" w:cs="Times New Roman"/>
+          <w:color w:val="000000"/>
+          <w:sz w:val="21"/>
+          <w:szCs w:val="21"/>
+        </w:rPr>
+        <w:t>}</w:t>
+      </w:r>
+    </w:p>
+    <w:p>
+      <w:pPr>
         <w:rPr>
           <w:rFonts w:ascii="Britannic Bold" w:hAnsi="Britannic Bold"/>
           <w:sz w:val="28"/>
           <w:szCs w:val="28"/>
         </w:rPr>
       </w:pPr>
-    </w:p>
-    <w:p>
-      <w:pPr>
+      <w:r>
         <w:rPr>
           <w:rFonts w:ascii="Britannic Bold" w:hAnsi="Britannic Bold"/>
           <w:sz w:val="28"/>
           <w:szCs w:val="28"/>
         </w:rPr>
-      </w:pPr>
-      <w:r>
+        <w:t>Output:</w:t>
+      </w:r>
+    </w:p>
+    <w:p>
+      <w:pPr>
+        <w:spacing w:line="240" w:lineRule="auto"/>
+        <w:jc w:val="center"/>
         <w:rPr>
           <w:rFonts w:ascii="Britannic Bold" w:hAnsi="Britannic Bold"/>
           <w:sz w:val="28"/>
           <w:szCs w:val="28"/>
         </w:rPr>
-        <w:t>Output:</w:t>
-      </w:r>
-    </w:p>
-    <w:p>
-      <w:pPr>
-        <w:spacing w:line="240" w:lineRule="auto"/>
-        <w:rPr>
-          <w:rFonts w:ascii="Britannic Bold" w:hAnsi="Britannic Bold"/>
-          <w:sz w:val="28"/>
-          <w:szCs w:val="28"/>
-        </w:rPr>
-      </w:pPr>
+      </w:pPr>
+      <w:r>
+        <w:rPr>
+          <w:noProof/>
+        </w:rPr>
+        <w:drawing>
+          <wp:inline distT="0" distB="0" distL="0" distR="0" wp14:anchorId="73A9E7A3" wp14:editId="10C7EC10">
+            <wp:extent cx="5067300" cy="2542853"/>
+            <wp:effectExtent l="0" t="0" r="0" b="0"/>
+            <wp:docPr id="1" name="Picture 1"/>
+            <wp:cNvGraphicFramePr>
+              <a:graphicFrameLocks xmlns:a="http://schemas.openxmlformats.org/drawingml/2006/main" noChangeAspect="1"/>
+            </wp:cNvGraphicFramePr>
+            <a:graphic xmlns:a="http://schemas.openxmlformats.org/drawingml/2006/main">
+              <a:graphicData uri="http://schemas.openxmlformats.org/drawingml/2006/picture">
+                <pic:pic xmlns:pic="http://schemas.openxmlformats.org/drawingml/2006/picture">
+                  <pic:nvPicPr>
+                    <pic:cNvPr id="1" name=""/>
+                    <pic:cNvPicPr/>
+                  </pic:nvPicPr>
+                  <pic:blipFill>
+                    <a:blip r:embed="rId7"/>
+                    <a:stretch>
+                      <a:fillRect/>
+                    </a:stretch>
+                  </pic:blipFill>
+                  <pic:spPr>
+                    <a:xfrm>
+                      <a:off x="0" y="0"/>
+                      <a:ext cx="5099342" cy="2558932"/>
+                    </a:xfrm>
+                    <a:prstGeom prst="rect">
+                      <a:avLst/>
+                    </a:prstGeom>
+                  </pic:spPr>
+                </pic:pic>
+              </a:graphicData>
+            </a:graphic>
+          </wp:inline>
+        </w:drawing>
+      </w:r>
     </w:p>
     <w:p>
       <w:pPr>
@@ -443,17 +3250,7 @@
           <w:sz w:val="28"/>
           <w:szCs w:val="28"/>
         </w:rPr>
-        <w:t>formulas</w:t>
-      </w:r>
-      <w:r>
-        <w:rPr>
-          <w:rFonts w:ascii="Times New Roman" w:hAnsi="Times New Roman" w:cs="Times New Roman"/>
-          <w:b/>
-          <w:bCs/>
-          <w:sz w:val="28"/>
-          <w:szCs w:val="28"/>
-        </w:rPr>
-        <w:t>:</w:t>
+        <w:t>formulas:</w:t>
       </w:r>
     </w:p>
     <w:p>
@@ -927,7 +3724,7 @@
                     </pic:cNvPicPr>
                   </pic:nvPicPr>
                   <pic:blipFill>
-                    <a:blip r:embed="rId7">
+                    <a:blip r:embed="rId8">
                       <a:extLst>
                         <a:ext uri="{28A0092B-C50C-407E-A947-70E740481C1C}">
                           <a14:useLocalDpi xmlns:a14="http://schemas.microsoft.com/office/drawing/2010/main" val="0"/>
@@ -975,7 +3772,6 @@
           <w:sz w:val="28"/>
           <w:szCs w:val="28"/>
         </w:rPr>
-        <w:lastRenderedPageBreak/>
         <w:t>Where</w:t>
       </w:r>
       <w:r>
@@ -1352,22 +4148,13 @@
         <w:t>Output:</w:t>
       </w:r>
     </w:p>
-    <w:p>
-      <w:pPr>
-        <w:rPr>
-          <w:rFonts w:ascii="Britannic Bold" w:hAnsi="Britannic Bold"/>
-          <w:sz w:val="28"/>
-          <w:szCs w:val="28"/>
-        </w:rPr>
-      </w:pPr>
-    </w:p>
     <w:sectPr>
-      <w:headerReference w:type="even" r:id="rId8"/>
-      <w:headerReference w:type="default" r:id="rId9"/>
-      <w:footerReference w:type="even" r:id="rId10"/>
-      <w:footerReference w:type="default" r:id="rId11"/>
-      <w:headerReference w:type="first" r:id="rId12"/>
-      <w:footerReference w:type="first" r:id="rId13"/>
+      <w:headerReference w:type="even" r:id="rId9"/>
+      <w:headerReference w:type="default" r:id="rId10"/>
+      <w:footerReference w:type="even" r:id="rId11"/>
+      <w:footerReference w:type="default" r:id="rId12"/>
+      <w:headerReference w:type="first" r:id="rId13"/>
+      <w:footerReference w:type="first" r:id="rId14"/>
       <w:pgSz w:w="12240" w:h="15840"/>
       <w:pgMar w:top="1440" w:right="1440" w:bottom="1440" w:left="1440" w:header="720" w:footer="720" w:gutter="0"/>
       <w:pgBorders w:offsetFrom="page">
@@ -1854,6 +4641,92 @@
     </w:lvl>
   </w:abstractNum>
   <w:abstractNum w:abstractNumId="3" w15:restartNumberingAfterBreak="0">
+    <w:nsid w:val="0EDA048F"/>
+    <w:multiLevelType w:val="hybridMultilevel"/>
+    <w:tmpl w:val="35042E5E"/>
+    <w:lvl w:ilvl="0" w:tplc="04090017">
+      <w:start w:val="1"/>
+      <w:numFmt w:val="lowerLetter"/>
+      <w:lvlText w:val="%1)"/>
+      <w:lvlJc w:val="left"/>
+      <w:pPr>
+        <w:ind w:left="720" w:hanging="360"/>
+      </w:pPr>
+    </w:lvl>
+    <w:lvl w:ilvl="1" w:tplc="04090019">
+      <w:start w:val="1"/>
+      <w:numFmt w:val="lowerLetter"/>
+      <w:lvlText w:val="%2."/>
+      <w:lvlJc w:val="left"/>
+      <w:pPr>
+        <w:ind w:left="1440" w:hanging="360"/>
+      </w:pPr>
+    </w:lvl>
+    <w:lvl w:ilvl="2" w:tplc="0409001B">
+      <w:start w:val="1"/>
+      <w:numFmt w:val="lowerRoman"/>
+      <w:lvlText w:val="%3."/>
+      <w:lvlJc w:val="right"/>
+      <w:pPr>
+        <w:ind w:left="2160" w:hanging="180"/>
+      </w:pPr>
+    </w:lvl>
+    <w:lvl w:ilvl="3" w:tplc="0409000F">
+      <w:start w:val="1"/>
+      <w:numFmt w:val="decimal"/>
+      <w:lvlText w:val="%4."/>
+      <w:lvlJc w:val="left"/>
+      <w:pPr>
+        <w:ind w:left="2880" w:hanging="360"/>
+      </w:pPr>
+    </w:lvl>
+    <w:lvl w:ilvl="4" w:tplc="04090019">
+      <w:start w:val="1"/>
+      <w:numFmt w:val="lowerLetter"/>
+      <w:lvlText w:val="%5."/>
+      <w:lvlJc w:val="left"/>
+      <w:pPr>
+        <w:ind w:left="3600" w:hanging="360"/>
+      </w:pPr>
+    </w:lvl>
+    <w:lvl w:ilvl="5" w:tplc="0409001B">
+      <w:start w:val="1"/>
+      <w:numFmt w:val="lowerRoman"/>
+      <w:lvlText w:val="%6."/>
+      <w:lvlJc w:val="right"/>
+      <w:pPr>
+        <w:ind w:left="4320" w:hanging="180"/>
+      </w:pPr>
+    </w:lvl>
+    <w:lvl w:ilvl="6" w:tplc="0409000F">
+      <w:start w:val="1"/>
+      <w:numFmt w:val="decimal"/>
+      <w:lvlText w:val="%7."/>
+      <w:lvlJc w:val="left"/>
+      <w:pPr>
+        <w:ind w:left="5040" w:hanging="360"/>
+      </w:pPr>
+    </w:lvl>
+    <w:lvl w:ilvl="7" w:tplc="04090019">
+      <w:start w:val="1"/>
+      <w:numFmt w:val="lowerLetter"/>
+      <w:lvlText w:val="%8."/>
+      <w:lvlJc w:val="left"/>
+      <w:pPr>
+        <w:ind w:left="5760" w:hanging="360"/>
+      </w:pPr>
+    </w:lvl>
+    <w:lvl w:ilvl="8" w:tplc="0409001B">
+      <w:start w:val="1"/>
+      <w:numFmt w:val="lowerRoman"/>
+      <w:lvlText w:val="%9."/>
+      <w:lvlJc w:val="right"/>
+      <w:pPr>
+        <w:ind w:left="6480" w:hanging="180"/>
+      </w:pPr>
+    </w:lvl>
+  </w:abstractNum>
+  <w:abstractNum w:abstractNumId="4" w15:restartNumberingAfterBreak="0">
     <w:nsid w:val="7A1E3235"/>
     <w:multiLevelType w:val="hybridMultilevel"/>
     <w:tmpl w:val="7DD02628"/>
@@ -1965,7 +4838,37 @@
     <w:abstractNumId w:val="0"/>
   </w:num>
   <w:num w:numId="4" w16cid:durableId="2116633498">
+    <w:abstractNumId w:val="4"/>
+  </w:num>
+  <w:num w:numId="5" w16cid:durableId="212548128">
     <w:abstractNumId w:val="3"/>
+    <w:lvlOverride w:ilvl="0">
+      <w:startOverride w:val="1"/>
+    </w:lvlOverride>
+    <w:lvlOverride w:ilvl="1">
+      <w:startOverride w:val="1"/>
+    </w:lvlOverride>
+    <w:lvlOverride w:ilvl="2">
+      <w:startOverride w:val="1"/>
+    </w:lvlOverride>
+    <w:lvlOverride w:ilvl="3">
+      <w:startOverride w:val="1"/>
+    </w:lvlOverride>
+    <w:lvlOverride w:ilvl="4">
+      <w:startOverride w:val="1"/>
+    </w:lvlOverride>
+    <w:lvlOverride w:ilvl="5">
+      <w:startOverride w:val="1"/>
+    </w:lvlOverride>
+    <w:lvlOverride w:ilvl="6">
+      <w:startOverride w:val="1"/>
+    </w:lvlOverride>
+    <w:lvlOverride w:ilvl="7">
+      <w:startOverride w:val="1"/>
+    </w:lvlOverride>
+    <w:lvlOverride w:ilvl="8">
+      <w:startOverride w:val="1"/>
+    </w:lvlOverride>
   </w:num>
 </w:numbering>
 </file>

</xml_diff>